<commit_message>
Implement professional dashboard with statistics, recent activity, stock alerts and sales chart
</commit_message>
<xml_diff>
--- a/SPRINTS.docx
+++ b/SPRINTS.docx
@@ -1,6 +1,6 @@
 
 <file path=word/document.xml><?xml version="1.0" encoding="utf-8"?>
-<w:document xmlns:wpc="http://schemas.microsoft.com/office/word/2010/wordprocessingCanvas" xmlns:cx="http://schemas.microsoft.com/office/drawing/2014/chartex" xmlns:cx1="http://schemas.microsoft.com/office/drawing/2015/9/8/chartex" xmlns:mc="http://schemas.openxmlformats.org/markup-compatibility/2006" xmlns:o="urn:schemas-microsoft-com:office:office" xmlns:r="http://schemas.openxmlformats.org/officeDocument/2006/relationships" xmlns:m="http://schemas.openxmlformats.org/officeDocument/2006/math" xmlns:v="urn:schemas-microsoft-com:vml" xmlns:wp14="http://schemas.microsoft.com/office/word/2010/wordprocessingDrawing" xmlns:wp="http://schemas.openxmlformats.org/drawingml/2006/wordprocessingDrawing" xmlns:w10="urn:schemas-microsoft-com:office:word" xmlns:w="http://schemas.openxmlformats.org/wordprocessingml/2006/main" xmlns:w14="http://schemas.microsoft.com/office/word/2010/wordml" xmlns:w15="http://schemas.microsoft.com/office/word/2012/wordml" xmlns:w16se="http://schemas.microsoft.com/office/word/2015/wordml/symex" xmlns:wpg="http://schemas.microsoft.com/office/word/2010/wordprocessingGroup" xmlns:wpi="http://schemas.microsoft.com/office/word/2010/wordprocessingInk" xmlns:wne="http://schemas.microsoft.com/office/word/2006/wordml" xmlns:wps="http://schemas.microsoft.com/office/word/2010/wordprocessingShape" mc:Ignorable="w14 w15 w16se wp14">
+<w:document xmlns:wpc="http://schemas.microsoft.com/office/word/2010/wordprocessingCanvas" xmlns:cx="http://schemas.microsoft.com/office/drawing/2014/chartex" xmlns:mc="http://schemas.openxmlformats.org/markup-compatibility/2006" xmlns:o="urn:schemas-microsoft-com:office:office" xmlns:r="http://schemas.openxmlformats.org/officeDocument/2006/relationships" xmlns:m="http://schemas.openxmlformats.org/officeDocument/2006/math" xmlns:v="urn:schemas-microsoft-com:vml" xmlns:wp14="http://schemas.microsoft.com/office/word/2010/wordprocessingDrawing" xmlns:wp="http://schemas.openxmlformats.org/drawingml/2006/wordprocessingDrawing" xmlns:w10="urn:schemas-microsoft-com:office:word" xmlns:w="http://schemas.openxmlformats.org/wordprocessingml/2006/main" xmlns:w14="http://schemas.microsoft.com/office/word/2010/wordml" xmlns:w15="http://schemas.microsoft.com/office/word/2012/wordml" xmlns:w16se="http://schemas.microsoft.com/office/word/2015/wordml/symex" xmlns:wpg="http://schemas.microsoft.com/office/word/2010/wordprocessingGroup" xmlns:wpi="http://schemas.microsoft.com/office/word/2010/wordprocessingInk" xmlns:wne="http://schemas.microsoft.com/office/word/2006/wordml" xmlns:wps="http://schemas.microsoft.com/office/word/2010/wordprocessingShape" mc:Ignorable="w14 w15 w16se wp14">
   <w:body>
     <w:p>
       <w:pPr>
@@ -8,16 +8,17 @@
         <w:jc w:val="left"/>
         <w:outlineLvl w:val="0"/>
         <w:rPr>
-          <w:rFonts w:ascii="Times New Roman" w:eastAsia="Times New Roman" w:hAnsi="Times New Roman" w:cs="Times New Roman"/>
+          <w:rFonts w:eastAsia="Times New Roman" w:cstheme="minorHAnsi"/>
           <w:b/>
           <w:bCs/>
           <w:kern w:val="36"/>
           <w:szCs w:val="28"/>
-        </w:rPr>
-      </w:pPr>
-      <w:r>
-        <w:rPr>
-          <w:rFonts w:ascii="Calibri Light" w:eastAsia="Times New Roman" w:hAnsi="Calibri Light" w:cs="Calibri Light"/>
+          <w:lang w:val="es-MX"/>
+        </w:rPr>
+      </w:pPr>
+      <w:r>
+        <w:rPr>
+          <w:rFonts w:ascii="Calibri" w:eastAsia="Times New Roman" w:hAnsi="Calibri" w:cs="Calibri"/>
           <w:b/>
           <w:bCs/>
           <w:kern w:val="36"/>
@@ -27,95 +28,56 @@
       </w:r>
       <w:r>
         <w:rPr>
-          <w:rFonts w:ascii="Times New Roman" w:eastAsia="Times New Roman" w:hAnsi="Times New Roman" w:cs="Times New Roman"/>
+          <w:rFonts w:eastAsia="Times New Roman" w:cstheme="minorHAnsi"/>
           <w:b/>
           <w:bCs/>
           <w:kern w:val="36"/>
           <w:szCs w:val="28"/>
-        </w:rPr>
-        <w:t xml:space="preserve"> ROADMAP </w:t>
-      </w:r>
-      <w:proofErr w:type="spellStart"/>
-      <w:r>
-        <w:rPr>
-          <w:rFonts w:ascii="Times New Roman" w:eastAsia="Times New Roman" w:hAnsi="Times New Roman" w:cs="Times New Roman"/>
+          <w:lang w:val="es-MX"/>
+        </w:rPr>
+        <w:t xml:space="preserve"> </w:t>
+      </w:r>
+      <w:bookmarkStart w:id="0" w:name="_GoBack"/>
+      <w:bookmarkEnd w:id="0"/>
+      <w:r>
+        <w:rPr>
+          <w:rFonts w:eastAsia="Times New Roman" w:cstheme="minorHAnsi"/>
           <w:b/>
           <w:bCs/>
           <w:kern w:val="36"/>
           <w:szCs w:val="28"/>
-        </w:rPr>
-        <w:t>PROFESIONAL</w:t>
-      </w:r>
-      <w:proofErr w:type="spellEnd"/>
-      <w:r>
-        <w:rPr>
-          <w:rFonts w:ascii="Times New Roman" w:eastAsia="Times New Roman" w:hAnsi="Times New Roman" w:cs="Times New Roman"/>
+          <w:lang w:val="es-MX"/>
+        </w:rPr>
+        <w:t>ROADMAP PROFESIONAL VETAPP</w:t>
+      </w:r>
+    </w:p>
+    <w:p>
+      <w:pPr>
+        <w:spacing w:before="100" w:beforeAutospacing="1" w:after="100" w:afterAutospacing="1" w:line="240" w:lineRule="auto"/>
+        <w:jc w:val="left"/>
+        <w:outlineLvl w:val="0"/>
+        <w:rPr>
+          <w:rFonts w:eastAsia="Times New Roman" w:cstheme="minorHAnsi"/>
           <w:b/>
           <w:bCs/>
           <w:kern w:val="36"/>
           <w:szCs w:val="28"/>
-        </w:rPr>
-        <w:t xml:space="preserve"> </w:t>
-      </w:r>
-      <w:proofErr w:type="spellStart"/>
-      <w:r>
-        <w:rPr>
-          <w:rFonts w:ascii="Times New Roman" w:eastAsia="Times New Roman" w:hAnsi="Times New Roman" w:cs="Times New Roman"/>
+          <w:lang w:val="es-EC"/>
+        </w:rPr>
+      </w:pPr>
+      <w:r>
+        <w:rPr>
+          <w:rFonts w:ascii="Segoe UI Symbol" w:eastAsia="Times New Roman" w:hAnsi="Segoe UI Symbol" w:cs="Segoe UI Symbol"/>
           <w:b/>
           <w:bCs/>
           <w:kern w:val="36"/>
           <w:szCs w:val="28"/>
         </w:rPr>
-        <w:t>VETAPP</w:t>
-      </w:r>
-      <w:proofErr w:type="spellEnd"/>
-    </w:p>
-    <w:p>
-      <w:pPr>
-        <w:spacing w:after="0" w:line="240" w:lineRule="auto"/>
-        <w:jc w:val="left"/>
-        <w:rPr>
-          <w:rFonts w:ascii="Times New Roman" w:eastAsia="Times New Roman" w:hAnsi="Times New Roman" w:cs="Times New Roman"/>
-          <w:szCs w:val="28"/>
-        </w:rPr>
-      </w:pPr>
-      <w:r>
-        <w:rPr>
-          <w:rFonts w:ascii="Times New Roman" w:eastAsia="Times New Roman" w:hAnsi="Times New Roman" w:cs="Times New Roman"/>
-          <w:szCs w:val="28"/>
-        </w:rPr>
-        <w:pict>
-          <v:rect id="_x0000_i1025" style="width:0;height:1.5pt" o:hralign="center" o:hrstd="t" o:hr="t" fillcolor="#a0a0a0" stroked="f"/>
-        </w:pict>
-      </w:r>
-    </w:p>
-    <w:p>
-      <w:pPr>
-        <w:spacing w:before="100" w:beforeAutospacing="1" w:after="100" w:afterAutospacing="1" w:line="240" w:lineRule="auto"/>
-        <w:jc w:val="left"/>
-        <w:outlineLvl w:val="0"/>
-        <w:rPr>
-          <w:rFonts w:ascii="Times New Roman" w:eastAsia="Times New Roman" w:hAnsi="Times New Roman" w:cs="Times New Roman"/>
-          <w:b/>
-          <w:bCs/>
-          <w:kern w:val="36"/>
-          <w:szCs w:val="28"/>
-          <w:lang w:val="es-EC"/>
-        </w:rPr>
-      </w:pPr>
-      <w:r>
-        <w:rPr>
-          <w:rFonts w:ascii="Segoe UI Symbol" w:eastAsia="Times New Roman" w:hAnsi="Segoe UI Symbol" w:cs="Segoe UI Symbol"/>
-          <w:b/>
-          <w:bCs/>
-          <w:kern w:val="36"/>
-          <w:szCs w:val="28"/>
-        </w:rPr>
         <w:t>🔵</w:t>
       </w:r>
       <w:r>
         <w:rPr>
-          <w:rFonts w:ascii="Times New Roman" w:eastAsia="Times New Roman" w:hAnsi="Times New Roman" w:cs="Times New Roman"/>
+          <w:rFonts w:eastAsia="Times New Roman" w:cstheme="minorHAnsi"/>
           <w:b/>
           <w:bCs/>
           <w:kern w:val="36"/>
@@ -139,7 +101,7 @@
         <w:jc w:val="left"/>
         <w:outlineLvl w:val="2"/>
         <w:rPr>
-          <w:rFonts w:ascii="Times New Roman" w:eastAsia="Times New Roman" w:hAnsi="Times New Roman" w:cs="Times New Roman"/>
+          <w:rFonts w:eastAsia="Times New Roman" w:cstheme="minorHAnsi"/>
           <w:b/>
           <w:bCs/>
           <w:szCs w:val="28"/>
@@ -156,24 +118,31 @@
       </w:r>
       <w:r>
         <w:rPr>
-          <w:rFonts w:ascii="Times New Roman" w:eastAsia="Times New Roman" w:hAnsi="Times New Roman" w:cs="Times New Roman"/>
+          <w:rFonts w:eastAsia="Times New Roman" w:cstheme="minorHAnsi"/>
           <w:b/>
           <w:bCs/>
           <w:szCs w:val="28"/>
         </w:rPr>
         <w:t xml:space="preserve"> Login </w:t>
       </w:r>
-      <w:proofErr w:type="spellStart"/>
-      <w:r>
-        <w:rPr>
-          <w:rFonts w:ascii="Times New Roman" w:eastAsia="Times New Roman" w:hAnsi="Times New Roman" w:cs="Times New Roman"/>
-          <w:b/>
-          <w:bCs/>
-          <w:szCs w:val="28"/>
-        </w:rPr>
-        <w:t>funcional</w:t>
-      </w:r>
-      <w:proofErr w:type="spellEnd"/>
+      <w:r>
+        <w:rPr>
+          <w:rFonts w:eastAsia="Times New Roman" w:cstheme="minorHAnsi"/>
+          <w:b/>
+          <w:bCs/>
+          <w:szCs w:val="28"/>
+        </w:rPr>
+        <w:t xml:space="preserve">functional </w:t>
+      </w:r>
+      <w:r>
+        <w:rPr>
+          <w:rFonts w:eastAsia="Times New Roman" w:cstheme="minorHAnsi"/>
+          <w:b/>
+          <w:bCs/>
+          <w:szCs w:val="28"/>
+        </w:rPr>
+        <w:t>- TERMINADO</w:t>
+      </w:r>
     </w:p>
     <w:p>
       <w:pPr>
@@ -189,7 +158,7 @@
         <w:jc w:val="left"/>
         <w:outlineLvl w:val="2"/>
         <w:rPr>
-          <w:rFonts w:ascii="Times New Roman" w:eastAsia="Times New Roman" w:hAnsi="Times New Roman" w:cs="Times New Roman"/>
+          <w:rFonts w:eastAsia="Times New Roman" w:cstheme="minorHAnsi"/>
           <w:b/>
           <w:bCs/>
           <w:szCs w:val="28"/>
@@ -206,24 +175,31 @@
       </w:r>
       <w:r>
         <w:rPr>
-          <w:rFonts w:ascii="Times New Roman" w:eastAsia="Times New Roman" w:hAnsi="Times New Roman" w:cs="Times New Roman"/>
+          <w:rFonts w:eastAsia="Times New Roman" w:cstheme="minorHAnsi"/>
           <w:b/>
           <w:bCs/>
           <w:szCs w:val="28"/>
         </w:rPr>
         <w:t xml:space="preserve"> Logout </w:t>
       </w:r>
-      <w:proofErr w:type="spellStart"/>
-      <w:r>
-        <w:rPr>
-          <w:rFonts w:ascii="Times New Roman" w:eastAsia="Times New Roman" w:hAnsi="Times New Roman" w:cs="Times New Roman"/>
-          <w:b/>
-          <w:bCs/>
-          <w:szCs w:val="28"/>
-        </w:rPr>
-        <w:t>funcional</w:t>
-      </w:r>
-      <w:proofErr w:type="spellEnd"/>
+      <w:r>
+        <w:rPr>
+          <w:rFonts w:eastAsia="Times New Roman" w:cstheme="minorHAnsi"/>
+          <w:b/>
+          <w:bCs/>
+          <w:szCs w:val="28"/>
+        </w:rPr>
+        <w:t xml:space="preserve">functional </w:t>
+      </w:r>
+      <w:r>
+        <w:rPr>
+          <w:rFonts w:eastAsia="Times New Roman" w:cstheme="minorHAnsi"/>
+          <w:b/>
+          <w:bCs/>
+          <w:szCs w:val="28"/>
+        </w:rPr>
+        <w:t>- TERMINADO</w:t>
+      </w:r>
     </w:p>
     <w:p>
       <w:pPr>
@@ -239,7 +215,7 @@
         <w:jc w:val="left"/>
         <w:outlineLvl w:val="2"/>
         <w:rPr>
-          <w:rFonts w:ascii="Times New Roman" w:eastAsia="Times New Roman" w:hAnsi="Times New Roman" w:cs="Times New Roman"/>
+          <w:rFonts w:eastAsia="Times New Roman" w:cstheme="minorHAnsi"/>
           <w:b/>
           <w:bCs/>
           <w:szCs w:val="28"/>
@@ -256,7 +232,7 @@
       </w:r>
       <w:r>
         <w:rPr>
-          <w:rFonts w:ascii="Times New Roman" w:eastAsia="Times New Roman" w:hAnsi="Times New Roman" w:cs="Times New Roman"/>
+          <w:rFonts w:eastAsia="Times New Roman" w:cstheme="minorHAnsi"/>
           <w:b/>
           <w:bCs/>
           <w:szCs w:val="28"/>
@@ -266,16 +242,32 @@
       <w:proofErr w:type="spellStart"/>
       <w:r>
         <w:rPr>
-          <w:rFonts w:ascii="Times New Roman" w:eastAsia="Times New Roman" w:hAnsi="Times New Roman" w:cs="Times New Roman"/>
+          <w:rFonts w:eastAsia="Times New Roman" w:cstheme="minorHAnsi"/>
           <w:b/>
           <w:bCs/>
           <w:szCs w:val="28"/>
         </w:rPr>
         <w:t>funcionando</w:t>
       </w:r>
-      <w:bookmarkStart w:id="0" w:name="_GoBack"/>
-      <w:bookmarkEnd w:id="0"/>
       <w:proofErr w:type="spellEnd"/>
+      <w:r>
+        <w:rPr>
+          <w:rFonts w:eastAsia="Times New Roman" w:cstheme="minorHAnsi"/>
+          <w:b/>
+          <w:bCs/>
+          <w:szCs w:val="28"/>
+        </w:rPr>
+        <w:t xml:space="preserve"> </w:t>
+      </w:r>
+      <w:r>
+        <w:rPr>
+          <w:rFonts w:eastAsia="Times New Roman" w:cstheme="minorHAnsi"/>
+          <w:b/>
+          <w:bCs/>
+          <w:szCs w:val="28"/>
+        </w:rPr>
+        <w:t>- TERMINADO</w:t>
+      </w:r>
     </w:p>
     <w:p>
       <w:pPr>
@@ -291,10 +283,11 @@
         <w:jc w:val="left"/>
         <w:outlineLvl w:val="2"/>
         <w:rPr>
-          <w:rFonts w:ascii="Times New Roman" w:eastAsia="Times New Roman" w:hAnsi="Times New Roman" w:cs="Times New Roman"/>
-          <w:b/>
-          <w:bCs/>
-          <w:szCs w:val="28"/>
+          <w:rFonts w:eastAsia="Times New Roman" w:cstheme="minorHAnsi"/>
+          <w:b/>
+          <w:bCs/>
+          <w:szCs w:val="28"/>
+          <w:lang w:val="es-MX"/>
         </w:rPr>
       </w:pPr>
       <w:r>
@@ -303,69 +296,62 @@
           <w:b/>
           <w:bCs/>
           <w:szCs w:val="28"/>
+          <w:lang w:val="es-MX"/>
         </w:rPr>
         <w:t>✔</w:t>
       </w:r>
       <w:r>
         <w:rPr>
-          <w:rFonts w:ascii="Times New Roman" w:eastAsia="Times New Roman" w:hAnsi="Times New Roman" w:cs="Times New Roman"/>
-          <w:b/>
-          <w:bCs/>
-          <w:szCs w:val="28"/>
-        </w:rPr>
-        <w:t xml:space="preserve"> Dashboard </w:t>
+          <w:rFonts w:eastAsia="Times New Roman" w:cstheme="minorHAnsi"/>
+          <w:b/>
+          <w:bCs/>
+          <w:szCs w:val="28"/>
+          <w:lang w:val="es-MX"/>
+        </w:rPr>
+        <w:t xml:space="preserve"> </w:t>
       </w:r>
       <w:proofErr w:type="spellStart"/>
       <w:r>
         <w:rPr>
-          <w:rFonts w:ascii="Times New Roman" w:eastAsia="Times New Roman" w:hAnsi="Times New Roman" w:cs="Times New Roman"/>
-          <w:b/>
-          <w:bCs/>
-          <w:szCs w:val="28"/>
-        </w:rPr>
-        <w:t>dinámico</w:t>
+          <w:rFonts w:eastAsia="Times New Roman" w:cstheme="minorHAnsi"/>
+          <w:b/>
+          <w:bCs/>
+          <w:szCs w:val="28"/>
+          <w:lang w:val="es-MX"/>
+        </w:rPr>
+        <w:t>Dashboard</w:t>
       </w:r>
       <w:proofErr w:type="spellEnd"/>
       <w:r>
         <w:rPr>
-          <w:rFonts w:ascii="Times New Roman" w:eastAsia="Times New Roman" w:hAnsi="Times New Roman" w:cs="Times New Roman"/>
-          <w:b/>
-          <w:bCs/>
-          <w:szCs w:val="28"/>
+          <w:rFonts w:eastAsia="Times New Roman" w:cstheme="minorHAnsi"/>
+          <w:b/>
+          <w:bCs/>
+          <w:szCs w:val="28"/>
+          <w:lang w:val="es-MX"/>
+        </w:rPr>
+        <w:t xml:space="preserve"> dinámico por rol</w:t>
+      </w:r>
+      <w:r>
+        <w:rPr>
+          <w:rFonts w:eastAsia="Times New Roman" w:cstheme="minorHAnsi"/>
+          <w:b/>
+          <w:bCs/>
+          <w:szCs w:val="28"/>
+          <w:lang w:val="es-MX"/>
         </w:rPr>
         <w:t xml:space="preserve"> </w:t>
       </w:r>
-      <w:proofErr w:type="spellStart"/>
-      <w:r>
-        <w:rPr>
-          <w:rFonts w:ascii="Times New Roman" w:eastAsia="Times New Roman" w:hAnsi="Times New Roman" w:cs="Times New Roman"/>
-          <w:b/>
-          <w:bCs/>
-          <w:szCs w:val="28"/>
-        </w:rPr>
-        <w:t>por</w:t>
-      </w:r>
-      <w:proofErr w:type="spellEnd"/>
-      <w:r>
-        <w:rPr>
-          <w:rFonts w:ascii="Times New Roman" w:eastAsia="Times New Roman" w:hAnsi="Times New Roman" w:cs="Times New Roman"/>
-          <w:b/>
-          <w:bCs/>
-          <w:szCs w:val="28"/>
-        </w:rPr>
-        <w:t xml:space="preserve"> </w:t>
-      </w:r>
-      <w:proofErr w:type="spellStart"/>
-      <w:r>
-        <w:rPr>
-          <w:rFonts w:ascii="Times New Roman" w:eastAsia="Times New Roman" w:hAnsi="Times New Roman" w:cs="Times New Roman"/>
-          <w:b/>
-          <w:bCs/>
-          <w:szCs w:val="28"/>
-        </w:rPr>
-        <w:t>rol</w:t>
-      </w:r>
-      <w:proofErr w:type="spellEnd"/>
+      <w:r>
+        <w:rPr>
+          <w:rFonts w:eastAsia="Times New Roman" w:cstheme="minorHAnsi"/>
+          <w:b/>
+          <w:bCs/>
+          <w:szCs w:val="28"/>
+          <w:lang w:val="es-MX"/>
+        </w:rPr>
+        <w:t>- TERMINADO</w:t>
+      </w:r>
     </w:p>
     <w:p>
       <w:pPr>
@@ -381,7 +367,7 @@
         <w:jc w:val="left"/>
         <w:outlineLvl w:val="2"/>
         <w:rPr>
-          <w:rFonts w:ascii="Times New Roman" w:eastAsia="Times New Roman" w:hAnsi="Times New Roman" w:cs="Times New Roman"/>
+          <w:rFonts w:eastAsia="Times New Roman" w:cstheme="minorHAnsi"/>
           <w:b/>
           <w:bCs/>
           <w:szCs w:val="28"/>
@@ -398,7 +384,7 @@
       </w:r>
       <w:r>
         <w:rPr>
-          <w:rFonts w:ascii="Times New Roman" w:eastAsia="Times New Roman" w:hAnsi="Times New Roman" w:cs="Times New Roman"/>
+          <w:rFonts w:eastAsia="Times New Roman" w:cstheme="minorHAnsi"/>
           <w:b/>
           <w:bCs/>
           <w:szCs w:val="28"/>
@@ -408,7 +394,7 @@
       <w:proofErr w:type="spellStart"/>
       <w:r>
         <w:rPr>
-          <w:rFonts w:ascii="Times New Roman" w:eastAsia="Times New Roman" w:hAnsi="Times New Roman" w:cs="Times New Roman"/>
+          <w:rFonts w:eastAsia="Times New Roman" w:cstheme="minorHAnsi"/>
           <w:b/>
           <w:bCs/>
           <w:szCs w:val="28"/>
@@ -418,7 +404,7 @@
       <w:proofErr w:type="spellEnd"/>
       <w:r>
         <w:rPr>
-          <w:rFonts w:ascii="Times New Roman" w:eastAsia="Times New Roman" w:hAnsi="Times New Roman" w:cs="Times New Roman"/>
+          <w:rFonts w:eastAsia="Times New Roman" w:cstheme="minorHAnsi"/>
           <w:b/>
           <w:bCs/>
           <w:szCs w:val="28"/>
@@ -428,7 +414,7 @@
       <w:proofErr w:type="spellStart"/>
       <w:r>
         <w:rPr>
-          <w:rFonts w:ascii="Times New Roman" w:eastAsia="Times New Roman" w:hAnsi="Times New Roman" w:cs="Times New Roman"/>
+          <w:rFonts w:eastAsia="Times New Roman" w:cstheme="minorHAnsi"/>
           <w:b/>
           <w:bCs/>
           <w:szCs w:val="28"/>
@@ -436,6 +422,24 @@
         <w:t>dinámico</w:t>
       </w:r>
       <w:proofErr w:type="spellEnd"/>
+      <w:r>
+        <w:rPr>
+          <w:rFonts w:eastAsia="Times New Roman" w:cstheme="minorHAnsi"/>
+          <w:b/>
+          <w:bCs/>
+          <w:szCs w:val="28"/>
+        </w:rPr>
+        <w:t xml:space="preserve"> </w:t>
+      </w:r>
+      <w:r>
+        <w:rPr>
+          <w:rFonts w:eastAsia="Times New Roman" w:cstheme="minorHAnsi"/>
+          <w:b/>
+          <w:bCs/>
+          <w:szCs w:val="28"/>
+        </w:rPr>
+        <w:t>- TERMINADO</w:t>
+      </w:r>
     </w:p>
     <w:p>
       <w:pPr>
@@ -451,10 +455,11 @@
         <w:jc w:val="left"/>
         <w:outlineLvl w:val="2"/>
         <w:rPr>
-          <w:rFonts w:ascii="Times New Roman" w:eastAsia="Times New Roman" w:hAnsi="Times New Roman" w:cs="Times New Roman"/>
-          <w:b/>
-          <w:bCs/>
-          <w:szCs w:val="28"/>
+          <w:rFonts w:eastAsia="Times New Roman" w:cstheme="minorHAnsi"/>
+          <w:b/>
+          <w:bCs/>
+          <w:szCs w:val="28"/>
+          <w:lang w:val="es-MX"/>
         </w:rPr>
       </w:pPr>
       <w:r>
@@ -463,57 +468,51 @@
           <w:b/>
           <w:bCs/>
           <w:szCs w:val="28"/>
+          <w:lang w:val="es-MX"/>
         </w:rPr>
         <w:t>✔</w:t>
       </w:r>
       <w:r>
         <w:rPr>
-          <w:rFonts w:ascii="Times New Roman" w:eastAsia="Times New Roman" w:hAnsi="Times New Roman" w:cs="Times New Roman"/>
-          <w:b/>
-          <w:bCs/>
-          <w:szCs w:val="28"/>
-        </w:rPr>
-        <w:t xml:space="preserve"> Primer </w:t>
+          <w:rFonts w:eastAsia="Times New Roman" w:cstheme="minorHAnsi"/>
+          <w:b/>
+          <w:bCs/>
+          <w:szCs w:val="28"/>
+          <w:lang w:val="es-MX"/>
+        </w:rPr>
+        <w:t xml:space="preserve"> Primer módulo MVC (</w:t>
       </w:r>
       <w:proofErr w:type="spellStart"/>
       <w:r>
         <w:rPr>
-          <w:rFonts w:ascii="Times New Roman" w:eastAsia="Times New Roman" w:hAnsi="Times New Roman" w:cs="Times New Roman"/>
-          <w:b/>
-          <w:bCs/>
-          <w:szCs w:val="28"/>
-        </w:rPr>
-        <w:t>módulo</w:t>
+          <w:rFonts w:eastAsia="Times New Roman" w:cstheme="minorHAnsi"/>
+          <w:b/>
+          <w:bCs/>
+          <w:szCs w:val="28"/>
+          <w:lang w:val="es-MX"/>
+        </w:rPr>
+        <w:t>Users</w:t>
       </w:r>
       <w:proofErr w:type="spellEnd"/>
       <w:r>
         <w:rPr>
-          <w:rFonts w:ascii="Times New Roman" w:eastAsia="Times New Roman" w:hAnsi="Times New Roman" w:cs="Times New Roman"/>
-          <w:b/>
-          <w:bCs/>
-          <w:szCs w:val="28"/>
-        </w:rPr>
-        <w:t xml:space="preserve"> </w:t>
-      </w:r>
-      <w:proofErr w:type="spellStart"/>
-      <w:r>
-        <w:rPr>
-          <w:rFonts w:ascii="Times New Roman" w:eastAsia="Times New Roman" w:hAnsi="Times New Roman" w:cs="Times New Roman"/>
-          <w:b/>
-          <w:bCs/>
-          <w:szCs w:val="28"/>
-        </w:rPr>
-        <w:t>MVC</w:t>
-      </w:r>
-      <w:proofErr w:type="spellEnd"/>
-      <w:r>
-        <w:rPr>
-          <w:rFonts w:ascii="Times New Roman" w:eastAsia="Times New Roman" w:hAnsi="Times New Roman" w:cs="Times New Roman"/>
-          <w:b/>
-          <w:bCs/>
-          <w:szCs w:val="28"/>
-        </w:rPr>
-        <w:t xml:space="preserve"> (Users)</w:t>
+          <w:rFonts w:eastAsia="Times New Roman" w:cstheme="minorHAnsi"/>
+          <w:b/>
+          <w:bCs/>
+          <w:szCs w:val="28"/>
+          <w:lang w:val="es-MX"/>
+        </w:rPr>
+        <w:t>)</w:t>
+      </w:r>
+      <w:r>
+        <w:rPr>
+          <w:rFonts w:eastAsia="Times New Roman" w:cstheme="minorHAnsi"/>
+          <w:b/>
+          <w:bCs/>
+          <w:szCs w:val="28"/>
+          <w:lang w:val="es-MX"/>
+        </w:rPr>
+        <w:t xml:space="preserve"> – SIN CRUD - TERMINADO</w:t>
       </w:r>
     </w:p>
     <w:p>
@@ -521,7 +520,7 @@
         <w:spacing w:before="100" w:beforeAutospacing="1" w:after="100" w:afterAutospacing="1" w:line="240" w:lineRule="auto"/>
         <w:jc w:val="left"/>
         <w:rPr>
-          <w:rFonts w:ascii="Times New Roman" w:eastAsia="Times New Roman" w:hAnsi="Times New Roman" w:cs="Times New Roman"/>
+          <w:rFonts w:eastAsia="Times New Roman" w:cstheme="minorHAnsi"/>
           <w:szCs w:val="28"/>
           <w:lang w:val="es-EC"/>
         </w:rPr>
@@ -535,25 +534,15 @@
       </w:r>
       <w:r>
         <w:rPr>
-          <w:rFonts w:ascii="Times New Roman" w:eastAsia="Times New Roman" w:hAnsi="Times New Roman" w:cs="Times New Roman"/>
-          <w:szCs w:val="28"/>
-          <w:lang w:val="es-EC"/>
-        </w:rPr>
-        <w:t xml:space="preserve"> Objetivo del Sprint</w:t>
-      </w:r>
-      <w:proofErr w:type="gramStart"/>
-      <w:r>
-        <w:rPr>
-          <w:rFonts w:ascii="Times New Roman" w:eastAsia="Times New Roman" w:hAnsi="Times New Roman" w:cs="Times New Roman"/>
-          <w:szCs w:val="28"/>
-          <w:lang w:val="es-EC"/>
-        </w:rPr>
-        <w:t>:</w:t>
-      </w:r>
-      <w:proofErr w:type="gramEnd"/>
-      <w:r>
-        <w:rPr>
-          <w:rFonts w:ascii="Times New Roman" w:eastAsia="Times New Roman" w:hAnsi="Times New Roman" w:cs="Times New Roman"/>
+          <w:rFonts w:eastAsia="Times New Roman" w:cstheme="minorHAnsi"/>
+          <w:szCs w:val="28"/>
+          <w:lang w:val="es-EC"/>
+        </w:rPr>
+        <w:t xml:space="preserve"> Objetivo del Sprint:</w:t>
+      </w:r>
+      <w:r>
+        <w:rPr>
+          <w:rFonts w:eastAsia="Times New Roman" w:cstheme="minorHAnsi"/>
           <w:szCs w:val="28"/>
           <w:lang w:val="es-EC"/>
         </w:rPr>
@@ -563,30 +552,11 @@
     </w:p>
     <w:p>
       <w:pPr>
-        <w:spacing w:after="0" w:line="240" w:lineRule="auto"/>
-        <w:jc w:val="left"/>
-        <w:rPr>
-          <w:rFonts w:ascii="Times New Roman" w:eastAsia="Times New Roman" w:hAnsi="Times New Roman" w:cs="Times New Roman"/>
-          <w:szCs w:val="28"/>
-        </w:rPr>
-      </w:pPr>
-      <w:r>
-        <w:rPr>
-          <w:rFonts w:ascii="Times New Roman" w:eastAsia="Times New Roman" w:hAnsi="Times New Roman" w:cs="Times New Roman"/>
-          <w:szCs w:val="28"/>
-        </w:rPr>
-        <w:pict>
-          <v:rect id="_x0000_i1026" style="width:0;height:1.5pt" o:hralign="center" o:hrstd="t" o:hr="t" fillcolor="#a0a0a0" stroked="f"/>
-        </w:pict>
-      </w:r>
-    </w:p>
-    <w:p>
-      <w:pPr>
         <w:spacing w:before="100" w:beforeAutospacing="1" w:after="100" w:afterAutospacing="1" w:line="240" w:lineRule="auto"/>
         <w:jc w:val="left"/>
         <w:outlineLvl w:val="0"/>
         <w:rPr>
-          <w:rFonts w:ascii="Times New Roman" w:eastAsia="Times New Roman" w:hAnsi="Times New Roman" w:cs="Times New Roman"/>
+          <w:rFonts w:eastAsia="Times New Roman" w:cstheme="minorHAnsi"/>
           <w:b/>
           <w:bCs/>
           <w:kern w:val="36"/>
@@ -606,7 +576,7 @@
       </w:r>
       <w:r>
         <w:rPr>
-          <w:rFonts w:ascii="Times New Roman" w:eastAsia="Times New Roman" w:hAnsi="Times New Roman" w:cs="Times New Roman"/>
+          <w:rFonts w:eastAsia="Times New Roman" w:cstheme="minorHAnsi"/>
           <w:b/>
           <w:bCs/>
           <w:kern w:val="36"/>
@@ -622,7 +592,7 @@
         <w:jc w:val="left"/>
         <w:outlineLvl w:val="1"/>
         <w:rPr>
-          <w:rFonts w:ascii="Times New Roman" w:eastAsia="Times New Roman" w:hAnsi="Times New Roman" w:cs="Times New Roman"/>
+          <w:rFonts w:eastAsia="Times New Roman" w:cstheme="minorHAnsi"/>
           <w:b/>
           <w:bCs/>
           <w:szCs w:val="28"/>
@@ -639,7 +609,7 @@
       </w:r>
       <w:r>
         <w:rPr>
-          <w:rFonts w:ascii="Times New Roman" w:eastAsia="Times New Roman" w:hAnsi="Times New Roman" w:cs="Times New Roman"/>
+          <w:rFonts w:eastAsia="Times New Roman" w:cstheme="minorHAnsi"/>
           <w:b/>
           <w:bCs/>
           <w:szCs w:val="28"/>
@@ -649,7 +619,7 @@
       <w:proofErr w:type="spellStart"/>
       <w:r>
         <w:rPr>
-          <w:rFonts w:ascii="Times New Roman" w:eastAsia="Times New Roman" w:hAnsi="Times New Roman" w:cs="Times New Roman"/>
+          <w:rFonts w:eastAsia="Times New Roman" w:cstheme="minorHAnsi"/>
           <w:b/>
           <w:bCs/>
           <w:szCs w:val="28"/>
@@ -659,7 +629,7 @@
       <w:proofErr w:type="spellEnd"/>
       <w:r>
         <w:rPr>
-          <w:rFonts w:ascii="Times New Roman" w:eastAsia="Times New Roman" w:hAnsi="Times New Roman" w:cs="Times New Roman"/>
+          <w:rFonts w:eastAsia="Times New Roman" w:cstheme="minorHAnsi"/>
           <w:b/>
           <w:bCs/>
           <w:szCs w:val="28"/>
@@ -676,14 +646,14 @@
         <w:spacing w:before="100" w:beforeAutospacing="1" w:after="100" w:afterAutospacing="1" w:line="240" w:lineRule="auto"/>
         <w:jc w:val="left"/>
         <w:rPr>
-          <w:rFonts w:ascii="Times New Roman" w:eastAsia="Times New Roman" w:hAnsi="Times New Roman" w:cs="Times New Roman"/>
+          <w:rFonts w:eastAsia="Times New Roman" w:cstheme="minorHAnsi"/>
           <w:szCs w:val="28"/>
         </w:rPr>
       </w:pPr>
       <w:proofErr w:type="spellStart"/>
       <w:r>
         <w:rPr>
-          <w:rFonts w:ascii="Times New Roman" w:eastAsia="Times New Roman" w:hAnsi="Times New Roman" w:cs="Times New Roman"/>
+          <w:rFonts w:eastAsia="Times New Roman" w:cstheme="minorHAnsi"/>
           <w:szCs w:val="28"/>
         </w:rPr>
         <w:t>Crear</w:t>
@@ -691,7 +661,7 @@
       <w:proofErr w:type="spellEnd"/>
       <w:r>
         <w:rPr>
-          <w:rFonts w:ascii="Times New Roman" w:eastAsia="Times New Roman" w:hAnsi="Times New Roman" w:cs="Times New Roman"/>
+          <w:rFonts w:eastAsia="Times New Roman" w:cstheme="minorHAnsi"/>
           <w:szCs w:val="28"/>
         </w:rPr>
         <w:t xml:space="preserve"> </w:t>
@@ -699,7 +669,7 @@
       <w:proofErr w:type="spellStart"/>
       <w:r>
         <w:rPr>
-          <w:rFonts w:ascii="Courier New" w:eastAsia="Times New Roman" w:hAnsi="Courier New" w:cs="Courier New"/>
+          <w:rFonts w:eastAsia="Times New Roman" w:cstheme="minorHAnsi"/>
           <w:szCs w:val="28"/>
         </w:rPr>
         <w:t>RoleMiddleware.php</w:t>
@@ -715,14 +685,14 @@
         <w:spacing w:before="100" w:beforeAutospacing="1" w:after="100" w:afterAutospacing="1" w:line="240" w:lineRule="auto"/>
         <w:jc w:val="left"/>
         <w:rPr>
-          <w:rFonts w:ascii="Times New Roman" w:eastAsia="Times New Roman" w:hAnsi="Times New Roman" w:cs="Times New Roman"/>
+          <w:rFonts w:eastAsia="Times New Roman" w:cstheme="minorHAnsi"/>
           <w:szCs w:val="28"/>
         </w:rPr>
       </w:pPr>
       <w:proofErr w:type="spellStart"/>
       <w:r>
         <w:rPr>
-          <w:rFonts w:ascii="Times New Roman" w:eastAsia="Times New Roman" w:hAnsi="Times New Roman" w:cs="Times New Roman"/>
+          <w:rFonts w:eastAsia="Times New Roman" w:cstheme="minorHAnsi"/>
           <w:szCs w:val="28"/>
         </w:rPr>
         <w:t>Quitar</w:t>
@@ -730,7 +700,7 @@
       <w:proofErr w:type="spellEnd"/>
       <w:r>
         <w:rPr>
-          <w:rFonts w:ascii="Times New Roman" w:eastAsia="Times New Roman" w:hAnsi="Times New Roman" w:cs="Times New Roman"/>
+          <w:rFonts w:eastAsia="Times New Roman" w:cstheme="minorHAnsi"/>
           <w:szCs w:val="28"/>
         </w:rPr>
         <w:t xml:space="preserve"> </w:t>
@@ -738,7 +708,7 @@
       <w:proofErr w:type="spellStart"/>
       <w:r>
         <w:rPr>
-          <w:rFonts w:ascii="Times New Roman" w:eastAsia="Times New Roman" w:hAnsi="Times New Roman" w:cs="Times New Roman"/>
+          <w:rFonts w:eastAsia="Times New Roman" w:cstheme="minorHAnsi"/>
           <w:szCs w:val="28"/>
         </w:rPr>
         <w:t>validaciones</w:t>
@@ -746,7 +716,7 @@
       <w:proofErr w:type="spellEnd"/>
       <w:r>
         <w:rPr>
-          <w:rFonts w:ascii="Times New Roman" w:eastAsia="Times New Roman" w:hAnsi="Times New Roman" w:cs="Times New Roman"/>
+          <w:rFonts w:eastAsia="Times New Roman" w:cstheme="minorHAnsi"/>
           <w:szCs w:val="28"/>
         </w:rPr>
         <w:t xml:space="preserve"> </w:t>
@@ -754,7 +724,7 @@
       <w:proofErr w:type="spellStart"/>
       <w:r>
         <w:rPr>
-          <w:rFonts w:ascii="Times New Roman" w:eastAsia="Times New Roman" w:hAnsi="Times New Roman" w:cs="Times New Roman"/>
+          <w:rFonts w:eastAsia="Times New Roman" w:cstheme="minorHAnsi"/>
           <w:szCs w:val="28"/>
         </w:rPr>
         <w:t>manuales</w:t>
@@ -762,7 +732,7 @@
       <w:proofErr w:type="spellEnd"/>
       <w:r>
         <w:rPr>
-          <w:rFonts w:ascii="Times New Roman" w:eastAsia="Times New Roman" w:hAnsi="Times New Roman" w:cs="Times New Roman"/>
+          <w:rFonts w:eastAsia="Times New Roman" w:cstheme="minorHAnsi"/>
           <w:szCs w:val="28"/>
         </w:rPr>
         <w:t xml:space="preserve"> del controller</w:t>
@@ -777,14 +747,14 @@
         <w:spacing w:before="100" w:beforeAutospacing="1" w:after="100" w:afterAutospacing="1" w:line="240" w:lineRule="auto"/>
         <w:jc w:val="left"/>
         <w:rPr>
-          <w:rFonts w:ascii="Times New Roman" w:eastAsia="Times New Roman" w:hAnsi="Times New Roman" w:cs="Times New Roman"/>
+          <w:rFonts w:eastAsia="Times New Roman" w:cstheme="minorHAnsi"/>
           <w:szCs w:val="28"/>
         </w:rPr>
       </w:pPr>
       <w:proofErr w:type="spellStart"/>
       <w:r>
         <w:rPr>
-          <w:rFonts w:ascii="Times New Roman" w:eastAsia="Times New Roman" w:hAnsi="Times New Roman" w:cs="Times New Roman"/>
+          <w:rFonts w:eastAsia="Times New Roman" w:cstheme="minorHAnsi"/>
           <w:szCs w:val="28"/>
         </w:rPr>
         <w:t>Centralizar</w:t>
@@ -792,7 +762,7 @@
       <w:proofErr w:type="spellEnd"/>
       <w:r>
         <w:rPr>
-          <w:rFonts w:ascii="Times New Roman" w:eastAsia="Times New Roman" w:hAnsi="Times New Roman" w:cs="Times New Roman"/>
+          <w:rFonts w:eastAsia="Times New Roman" w:cstheme="minorHAnsi"/>
           <w:szCs w:val="28"/>
         </w:rPr>
         <w:t xml:space="preserve"> </w:t>
@@ -800,7 +770,7 @@
       <w:proofErr w:type="spellStart"/>
       <w:r>
         <w:rPr>
-          <w:rFonts w:ascii="Times New Roman" w:eastAsia="Times New Roman" w:hAnsi="Times New Roman" w:cs="Times New Roman"/>
+          <w:rFonts w:eastAsia="Times New Roman" w:cstheme="minorHAnsi"/>
           <w:szCs w:val="28"/>
         </w:rPr>
         <w:t>permisos</w:t>
@@ -813,25 +783,34 @@
         <w:jc w:val="left"/>
         <w:outlineLvl w:val="1"/>
         <w:rPr>
-          <w:rFonts w:ascii="Times New Roman" w:eastAsia="Times New Roman" w:hAnsi="Times New Roman" w:cs="Times New Roman"/>
-          <w:b/>
-          <w:bCs/>
-          <w:szCs w:val="28"/>
-        </w:rPr>
-      </w:pPr>
-      <w:r>
-        <w:rPr>
-          <w:rFonts w:ascii="Times New Roman" w:eastAsia="Times New Roman" w:hAnsi="Times New Roman" w:cs="Times New Roman"/>
-          <w:b/>
-          <w:bCs/>
-          <w:szCs w:val="28"/>
-        </w:rPr>
-        <w:t xml:space="preserve">🧭 2.2 </w:t>
+          <w:rFonts w:eastAsia="Times New Roman" w:cstheme="minorHAnsi"/>
+          <w:b/>
+          <w:bCs/>
+          <w:szCs w:val="28"/>
+        </w:rPr>
+      </w:pPr>
+      <w:r>
+        <w:rPr>
+          <w:rFonts w:ascii="Calibri" w:eastAsia="Times New Roman" w:hAnsi="Calibri" w:cs="Calibri"/>
+          <w:b/>
+          <w:bCs/>
+          <w:szCs w:val="28"/>
+        </w:rPr>
+        <w:t>🧭</w:t>
+      </w:r>
+      <w:r>
+        <w:rPr>
+          <w:rFonts w:eastAsia="Times New Roman" w:cstheme="minorHAnsi"/>
+          <w:b/>
+          <w:bCs/>
+          <w:szCs w:val="28"/>
+        </w:rPr>
+        <w:t xml:space="preserve"> 2.2 </w:t>
       </w:r>
       <w:proofErr w:type="spellStart"/>
       <w:r>
         <w:rPr>
-          <w:rFonts w:ascii="Times New Roman" w:eastAsia="Times New Roman" w:hAnsi="Times New Roman" w:cs="Times New Roman"/>
+          <w:rFonts w:eastAsia="Times New Roman" w:cstheme="minorHAnsi"/>
           <w:b/>
           <w:bCs/>
           <w:szCs w:val="28"/>
@@ -841,7 +820,7 @@
       <w:proofErr w:type="spellEnd"/>
       <w:r>
         <w:rPr>
-          <w:rFonts w:ascii="Times New Roman" w:eastAsia="Times New Roman" w:hAnsi="Times New Roman" w:cs="Times New Roman"/>
+          <w:rFonts w:eastAsia="Times New Roman" w:cstheme="minorHAnsi"/>
           <w:b/>
           <w:bCs/>
           <w:szCs w:val="28"/>
@@ -858,14 +837,14 @@
         <w:spacing w:before="100" w:beforeAutospacing="1" w:after="100" w:afterAutospacing="1" w:line="240" w:lineRule="auto"/>
         <w:jc w:val="left"/>
         <w:rPr>
-          <w:rFonts w:ascii="Times New Roman" w:eastAsia="Times New Roman" w:hAnsi="Times New Roman" w:cs="Times New Roman"/>
+          <w:rFonts w:eastAsia="Times New Roman" w:cstheme="minorHAnsi"/>
           <w:szCs w:val="28"/>
         </w:rPr>
       </w:pPr>
       <w:proofErr w:type="spellStart"/>
       <w:r>
         <w:rPr>
-          <w:rFonts w:ascii="Times New Roman" w:eastAsia="Times New Roman" w:hAnsi="Times New Roman" w:cs="Times New Roman"/>
+          <w:rFonts w:eastAsia="Times New Roman" w:cstheme="minorHAnsi"/>
           <w:szCs w:val="28"/>
         </w:rPr>
         <w:t>Eliminar</w:t>
@@ -873,7 +852,7 @@
       <w:proofErr w:type="spellEnd"/>
       <w:r>
         <w:rPr>
-          <w:rFonts w:ascii="Times New Roman" w:eastAsia="Times New Roman" w:hAnsi="Times New Roman" w:cs="Times New Roman"/>
+          <w:rFonts w:eastAsia="Times New Roman" w:cstheme="minorHAnsi"/>
           <w:szCs w:val="28"/>
         </w:rPr>
         <w:t xml:space="preserve"> </w:t>
@@ -881,7 +860,7 @@
       <w:proofErr w:type="spellStart"/>
       <w:r>
         <w:rPr>
-          <w:rFonts w:ascii="Times New Roman" w:eastAsia="Times New Roman" w:hAnsi="Times New Roman" w:cs="Times New Roman"/>
+          <w:rFonts w:eastAsia="Times New Roman" w:cstheme="minorHAnsi"/>
           <w:szCs w:val="28"/>
         </w:rPr>
         <w:t>archivos</w:t>
@@ -889,7 +868,7 @@
       <w:proofErr w:type="spellEnd"/>
       <w:r>
         <w:rPr>
-          <w:rFonts w:ascii="Times New Roman" w:eastAsia="Times New Roman" w:hAnsi="Times New Roman" w:cs="Times New Roman"/>
+          <w:rFonts w:eastAsia="Times New Roman" w:cstheme="minorHAnsi"/>
           <w:szCs w:val="28"/>
         </w:rPr>
         <w:t xml:space="preserve"> </w:t>
@@ -897,7 +876,7 @@
       <w:proofErr w:type="spellStart"/>
       <w:r>
         <w:rPr>
-          <w:rFonts w:ascii="Times New Roman" w:eastAsia="Times New Roman" w:hAnsi="Times New Roman" w:cs="Times New Roman"/>
+          <w:rFonts w:eastAsia="Times New Roman" w:cstheme="minorHAnsi"/>
           <w:szCs w:val="28"/>
         </w:rPr>
         <w:t>tipo</w:t>
@@ -905,7 +884,7 @@
       <w:proofErr w:type="spellEnd"/>
       <w:r>
         <w:rPr>
-          <w:rFonts w:ascii="Times New Roman" w:eastAsia="Times New Roman" w:hAnsi="Times New Roman" w:cs="Times New Roman"/>
+          <w:rFonts w:eastAsia="Times New Roman" w:cstheme="minorHAnsi"/>
           <w:szCs w:val="28"/>
         </w:rPr>
         <w:t xml:space="preserve"> </w:t>
@@ -913,7 +892,7 @@
       <w:proofErr w:type="spellStart"/>
       <w:r>
         <w:rPr>
-          <w:rFonts w:ascii="Courier New" w:eastAsia="Times New Roman" w:hAnsi="Courier New" w:cs="Courier New"/>
+          <w:rFonts w:eastAsia="Times New Roman" w:cstheme="minorHAnsi"/>
           <w:szCs w:val="28"/>
         </w:rPr>
         <w:t>users.php</w:t>
@@ -929,14 +908,14 @@
         <w:spacing w:before="100" w:beforeAutospacing="1" w:after="100" w:afterAutospacing="1" w:line="240" w:lineRule="auto"/>
         <w:jc w:val="left"/>
         <w:rPr>
-          <w:rFonts w:ascii="Times New Roman" w:eastAsia="Times New Roman" w:hAnsi="Times New Roman" w:cs="Times New Roman"/>
+          <w:rFonts w:eastAsia="Times New Roman" w:cstheme="minorHAnsi"/>
           <w:szCs w:val="28"/>
         </w:rPr>
       </w:pPr>
       <w:proofErr w:type="spellStart"/>
       <w:r>
         <w:rPr>
-          <w:rFonts w:ascii="Times New Roman" w:eastAsia="Times New Roman" w:hAnsi="Times New Roman" w:cs="Times New Roman"/>
+          <w:rFonts w:eastAsia="Times New Roman" w:cstheme="minorHAnsi"/>
           <w:szCs w:val="28"/>
         </w:rPr>
         <w:t>Usar</w:t>
@@ -944,7 +923,7 @@
       <w:proofErr w:type="spellEnd"/>
       <w:r>
         <w:rPr>
-          <w:rFonts w:ascii="Times New Roman" w:eastAsia="Times New Roman" w:hAnsi="Times New Roman" w:cs="Times New Roman"/>
+          <w:rFonts w:eastAsia="Times New Roman" w:cstheme="minorHAnsi"/>
           <w:szCs w:val="28"/>
         </w:rPr>
         <w:t xml:space="preserve"> </w:t>
@@ -952,7 +931,7 @@
       <w:proofErr w:type="spellStart"/>
       <w:r>
         <w:rPr>
-          <w:rFonts w:ascii="Times New Roman" w:eastAsia="Times New Roman" w:hAnsi="Times New Roman" w:cs="Times New Roman"/>
+          <w:rFonts w:eastAsia="Times New Roman" w:cstheme="minorHAnsi"/>
           <w:szCs w:val="28"/>
         </w:rPr>
         <w:t>index.php</w:t>
@@ -960,7 +939,7 @@
       <w:proofErr w:type="spellEnd"/>
       <w:r>
         <w:rPr>
-          <w:rFonts w:ascii="Times New Roman" w:eastAsia="Times New Roman" w:hAnsi="Times New Roman" w:cs="Times New Roman"/>
+          <w:rFonts w:eastAsia="Times New Roman" w:cstheme="minorHAnsi"/>
           <w:szCs w:val="28"/>
         </w:rPr>
         <w:t xml:space="preserve"> </w:t>
@@ -968,7 +947,7 @@
       <w:proofErr w:type="spellStart"/>
       <w:r>
         <w:rPr>
-          <w:rFonts w:ascii="Times New Roman" w:eastAsia="Times New Roman" w:hAnsi="Times New Roman" w:cs="Times New Roman"/>
+          <w:rFonts w:eastAsia="Times New Roman" w:cstheme="minorHAnsi"/>
           <w:szCs w:val="28"/>
         </w:rPr>
         <w:t>como</w:t>
@@ -976,7 +955,7 @@
       <w:proofErr w:type="spellEnd"/>
       <w:r>
         <w:rPr>
-          <w:rFonts w:ascii="Times New Roman" w:eastAsia="Times New Roman" w:hAnsi="Times New Roman" w:cs="Times New Roman"/>
+          <w:rFonts w:eastAsia="Times New Roman" w:cstheme="minorHAnsi"/>
           <w:szCs w:val="28"/>
         </w:rPr>
         <w:t xml:space="preserve"> front controller</w:t>
@@ -991,14 +970,14 @@
         <w:spacing w:before="100" w:beforeAutospacing="1" w:after="100" w:afterAutospacing="1" w:line="240" w:lineRule="auto"/>
         <w:jc w:val="left"/>
         <w:rPr>
-          <w:rFonts w:ascii="Times New Roman" w:eastAsia="Times New Roman" w:hAnsi="Times New Roman" w:cs="Times New Roman"/>
+          <w:rFonts w:eastAsia="Times New Roman" w:cstheme="minorHAnsi"/>
           <w:szCs w:val="28"/>
         </w:rPr>
       </w:pPr>
       <w:proofErr w:type="spellStart"/>
       <w:r>
         <w:rPr>
-          <w:rFonts w:ascii="Times New Roman" w:eastAsia="Times New Roman" w:hAnsi="Times New Roman" w:cs="Times New Roman"/>
+          <w:rFonts w:eastAsia="Times New Roman" w:cstheme="minorHAnsi"/>
           <w:szCs w:val="28"/>
         </w:rPr>
         <w:t>Rutas</w:t>
@@ -1006,7 +985,7 @@
       <w:proofErr w:type="spellEnd"/>
       <w:r>
         <w:rPr>
-          <w:rFonts w:ascii="Times New Roman" w:eastAsia="Times New Roman" w:hAnsi="Times New Roman" w:cs="Times New Roman"/>
+          <w:rFonts w:eastAsia="Times New Roman" w:cstheme="minorHAnsi"/>
           <w:szCs w:val="28"/>
         </w:rPr>
         <w:t xml:space="preserve"> </w:t>
@@ -1014,7 +993,7 @@
       <w:proofErr w:type="spellStart"/>
       <w:r>
         <w:rPr>
-          <w:rFonts w:ascii="Times New Roman" w:eastAsia="Times New Roman" w:hAnsi="Times New Roman" w:cs="Times New Roman"/>
+          <w:rFonts w:eastAsia="Times New Roman" w:cstheme="minorHAnsi"/>
           <w:szCs w:val="28"/>
         </w:rPr>
         <w:t>limpias</w:t>
@@ -1027,7 +1006,7 @@
         <w:jc w:val="left"/>
         <w:outlineLvl w:val="1"/>
         <w:rPr>
-          <w:rFonts w:ascii="Times New Roman" w:eastAsia="Times New Roman" w:hAnsi="Times New Roman" w:cs="Times New Roman"/>
+          <w:rFonts w:eastAsia="Times New Roman" w:cstheme="minorHAnsi"/>
           <w:b/>
           <w:bCs/>
           <w:szCs w:val="28"/>
@@ -1044,7 +1023,7 @@
       </w:r>
       <w:r>
         <w:rPr>
-          <w:rFonts w:ascii="Times New Roman" w:eastAsia="Times New Roman" w:hAnsi="Times New Roman" w:cs="Times New Roman"/>
+          <w:rFonts w:eastAsia="Times New Roman" w:cstheme="minorHAnsi"/>
           <w:b/>
           <w:bCs/>
           <w:szCs w:val="28"/>
@@ -1054,7 +1033,7 @@
       <w:proofErr w:type="spellStart"/>
       <w:r>
         <w:rPr>
-          <w:rFonts w:ascii="Times New Roman" w:eastAsia="Times New Roman" w:hAnsi="Times New Roman" w:cs="Times New Roman"/>
+          <w:rFonts w:eastAsia="Times New Roman" w:cstheme="minorHAnsi"/>
           <w:b/>
           <w:bCs/>
           <w:szCs w:val="28"/>
@@ -1064,7 +1043,7 @@
       <w:proofErr w:type="spellEnd"/>
       <w:r>
         <w:rPr>
-          <w:rFonts w:ascii="Times New Roman" w:eastAsia="Times New Roman" w:hAnsi="Times New Roman" w:cs="Times New Roman"/>
+          <w:rFonts w:eastAsia="Times New Roman" w:cstheme="minorHAnsi"/>
           <w:b/>
           <w:bCs/>
           <w:szCs w:val="28"/>
@@ -1074,7 +1053,7 @@
       <w:proofErr w:type="spellStart"/>
       <w:r>
         <w:rPr>
-          <w:rFonts w:ascii="Times New Roman" w:eastAsia="Times New Roman" w:hAnsi="Times New Roman" w:cs="Times New Roman"/>
+          <w:rFonts w:eastAsia="Times New Roman" w:cstheme="minorHAnsi"/>
           <w:b/>
           <w:bCs/>
           <w:szCs w:val="28"/>
@@ -1084,32 +1063,12 @@
       <w:proofErr w:type="spellEnd"/>
       <w:r>
         <w:rPr>
-          <w:rFonts w:ascii="Times New Roman" w:eastAsia="Times New Roman" w:hAnsi="Times New Roman" w:cs="Times New Roman"/>
-          <w:b/>
-          <w:bCs/>
-          <w:szCs w:val="28"/>
-        </w:rPr>
-        <w:t xml:space="preserve"> </w:t>
-      </w:r>
-      <w:proofErr w:type="gramStart"/>
-      <w:r>
-        <w:rPr>
-          <w:rFonts w:ascii="Times New Roman" w:eastAsia="Times New Roman" w:hAnsi="Times New Roman" w:cs="Times New Roman"/>
-          <w:b/>
-          <w:bCs/>
-          <w:szCs w:val="28"/>
-        </w:rPr>
-        <w:t>del</w:t>
-      </w:r>
-      <w:proofErr w:type="gramEnd"/>
-      <w:r>
-        <w:rPr>
-          <w:rFonts w:ascii="Times New Roman" w:eastAsia="Times New Roman" w:hAnsi="Times New Roman" w:cs="Times New Roman"/>
-          <w:b/>
-          <w:bCs/>
-          <w:szCs w:val="28"/>
-        </w:rPr>
-        <w:t xml:space="preserve"> controller</w:t>
+          <w:rFonts w:eastAsia="Times New Roman" w:cstheme="minorHAnsi"/>
+          <w:b/>
+          <w:bCs/>
+          <w:szCs w:val="28"/>
+        </w:rPr>
+        <w:t xml:space="preserve"> del controller</w:t>
       </w:r>
     </w:p>
     <w:p>
@@ -1121,14 +1080,14 @@
         <w:spacing w:before="100" w:beforeAutospacing="1" w:after="100" w:afterAutospacing="1" w:line="240" w:lineRule="auto"/>
         <w:jc w:val="left"/>
         <w:rPr>
-          <w:rFonts w:ascii="Times New Roman" w:eastAsia="Times New Roman" w:hAnsi="Times New Roman" w:cs="Times New Roman"/>
+          <w:rFonts w:eastAsia="Times New Roman" w:cstheme="minorHAnsi"/>
           <w:szCs w:val="28"/>
         </w:rPr>
       </w:pPr>
       <w:proofErr w:type="spellStart"/>
       <w:r>
         <w:rPr>
-          <w:rFonts w:ascii="Times New Roman" w:eastAsia="Times New Roman" w:hAnsi="Times New Roman" w:cs="Times New Roman"/>
+          <w:rFonts w:eastAsia="Times New Roman" w:cstheme="minorHAnsi"/>
           <w:szCs w:val="28"/>
         </w:rPr>
         <w:t>Validar</w:t>
@@ -1136,7 +1095,7 @@
       <w:proofErr w:type="spellEnd"/>
       <w:r>
         <w:rPr>
-          <w:rFonts w:ascii="Times New Roman" w:eastAsia="Times New Roman" w:hAnsi="Times New Roman" w:cs="Times New Roman"/>
+          <w:rFonts w:eastAsia="Times New Roman" w:cstheme="minorHAnsi"/>
           <w:szCs w:val="28"/>
         </w:rPr>
         <w:t xml:space="preserve"> </w:t>
@@ -1144,7 +1103,7 @@
       <w:proofErr w:type="spellStart"/>
       <w:r>
         <w:rPr>
-          <w:rFonts w:ascii="Times New Roman" w:eastAsia="Times New Roman" w:hAnsi="Times New Roman" w:cs="Times New Roman"/>
+          <w:rFonts w:eastAsia="Times New Roman" w:cstheme="minorHAnsi"/>
           <w:szCs w:val="28"/>
         </w:rPr>
         <w:t>sesión</w:t>
@@ -1152,7 +1111,7 @@
       <w:proofErr w:type="spellEnd"/>
       <w:r>
         <w:rPr>
-          <w:rFonts w:ascii="Times New Roman" w:eastAsia="Times New Roman" w:hAnsi="Times New Roman" w:cs="Times New Roman"/>
+          <w:rFonts w:eastAsia="Times New Roman" w:cstheme="minorHAnsi"/>
           <w:szCs w:val="28"/>
         </w:rPr>
         <w:t xml:space="preserve"> </w:t>
@@ -1160,7 +1119,7 @@
       <w:proofErr w:type="spellStart"/>
       <w:r>
         <w:rPr>
-          <w:rFonts w:ascii="Times New Roman" w:eastAsia="Times New Roman" w:hAnsi="Times New Roman" w:cs="Times New Roman"/>
+          <w:rFonts w:eastAsia="Times New Roman" w:cstheme="minorHAnsi"/>
           <w:szCs w:val="28"/>
         </w:rPr>
         <w:t>en</w:t>
@@ -1168,7 +1127,7 @@
       <w:proofErr w:type="spellEnd"/>
       <w:r>
         <w:rPr>
-          <w:rFonts w:ascii="Times New Roman" w:eastAsia="Times New Roman" w:hAnsi="Times New Roman" w:cs="Times New Roman"/>
+          <w:rFonts w:eastAsia="Times New Roman" w:cstheme="minorHAnsi"/>
           <w:szCs w:val="28"/>
         </w:rPr>
         <w:t xml:space="preserve"> constructor base</w:t>
@@ -1183,14 +1142,14 @@
         <w:spacing w:before="100" w:beforeAutospacing="1" w:after="100" w:afterAutospacing="1" w:line="240" w:lineRule="auto"/>
         <w:jc w:val="left"/>
         <w:rPr>
-          <w:rFonts w:ascii="Times New Roman" w:eastAsia="Times New Roman" w:hAnsi="Times New Roman" w:cs="Times New Roman"/>
+          <w:rFonts w:eastAsia="Times New Roman" w:cstheme="minorHAnsi"/>
           <w:szCs w:val="28"/>
         </w:rPr>
       </w:pPr>
       <w:proofErr w:type="spellStart"/>
       <w:r>
         <w:rPr>
-          <w:rFonts w:ascii="Times New Roman" w:eastAsia="Times New Roman" w:hAnsi="Times New Roman" w:cs="Times New Roman"/>
+          <w:rFonts w:eastAsia="Times New Roman" w:cstheme="minorHAnsi"/>
           <w:szCs w:val="28"/>
         </w:rPr>
         <w:t>Evitar</w:t>
@@ -1198,7 +1157,7 @@
       <w:proofErr w:type="spellEnd"/>
       <w:r>
         <w:rPr>
-          <w:rFonts w:ascii="Times New Roman" w:eastAsia="Times New Roman" w:hAnsi="Times New Roman" w:cs="Times New Roman"/>
+          <w:rFonts w:eastAsia="Times New Roman" w:cstheme="minorHAnsi"/>
           <w:szCs w:val="28"/>
         </w:rPr>
         <w:t xml:space="preserve"> </w:t>
@@ -1206,7 +1165,7 @@
       <w:proofErr w:type="spellStart"/>
       <w:r>
         <w:rPr>
-          <w:rFonts w:ascii="Times New Roman" w:eastAsia="Times New Roman" w:hAnsi="Times New Roman" w:cs="Times New Roman"/>
+          <w:rFonts w:eastAsia="Times New Roman" w:cstheme="minorHAnsi"/>
           <w:szCs w:val="28"/>
         </w:rPr>
         <w:t>acceso</w:t>
@@ -1214,7 +1173,7 @@
       <w:proofErr w:type="spellEnd"/>
       <w:r>
         <w:rPr>
-          <w:rFonts w:ascii="Times New Roman" w:eastAsia="Times New Roman" w:hAnsi="Times New Roman" w:cs="Times New Roman"/>
+          <w:rFonts w:eastAsia="Times New Roman" w:cstheme="minorHAnsi"/>
           <w:szCs w:val="28"/>
         </w:rPr>
         <w:t xml:space="preserve"> </w:t>
@@ -1222,7 +1181,7 @@
       <w:proofErr w:type="spellStart"/>
       <w:r>
         <w:rPr>
-          <w:rFonts w:ascii="Times New Roman" w:eastAsia="Times New Roman" w:hAnsi="Times New Roman" w:cs="Times New Roman"/>
+          <w:rFonts w:eastAsia="Times New Roman" w:cstheme="minorHAnsi"/>
           <w:szCs w:val="28"/>
         </w:rPr>
         <w:t>directo</w:t>
@@ -1230,7 +1189,7 @@
       <w:proofErr w:type="spellEnd"/>
       <w:r>
         <w:rPr>
-          <w:rFonts w:ascii="Times New Roman" w:eastAsia="Times New Roman" w:hAnsi="Times New Roman" w:cs="Times New Roman"/>
+          <w:rFonts w:eastAsia="Times New Roman" w:cstheme="minorHAnsi"/>
           <w:szCs w:val="28"/>
         </w:rPr>
         <w:t xml:space="preserve"> a vistas</w:t>
@@ -1245,14 +1204,14 @@
         <w:spacing w:before="100" w:beforeAutospacing="1" w:after="100" w:afterAutospacing="1" w:line="240" w:lineRule="auto"/>
         <w:jc w:val="left"/>
         <w:rPr>
-          <w:rFonts w:ascii="Times New Roman" w:eastAsia="Times New Roman" w:hAnsi="Times New Roman" w:cs="Times New Roman"/>
+          <w:rFonts w:eastAsia="Times New Roman" w:cstheme="minorHAnsi"/>
           <w:szCs w:val="28"/>
         </w:rPr>
       </w:pPr>
       <w:proofErr w:type="spellStart"/>
       <w:r>
         <w:rPr>
-          <w:rFonts w:ascii="Times New Roman" w:eastAsia="Times New Roman" w:hAnsi="Times New Roman" w:cs="Times New Roman"/>
+          <w:rFonts w:eastAsia="Times New Roman" w:cstheme="minorHAnsi"/>
           <w:szCs w:val="28"/>
         </w:rPr>
         <w:t>Sanitización</w:t>
@@ -1260,7 +1219,7 @@
       <w:proofErr w:type="spellEnd"/>
       <w:r>
         <w:rPr>
-          <w:rFonts w:ascii="Times New Roman" w:eastAsia="Times New Roman" w:hAnsi="Times New Roman" w:cs="Times New Roman"/>
+          <w:rFonts w:eastAsia="Times New Roman" w:cstheme="minorHAnsi"/>
           <w:szCs w:val="28"/>
         </w:rPr>
         <w:t xml:space="preserve"> </w:t>
@@ -1268,7 +1227,7 @@
       <w:proofErr w:type="spellStart"/>
       <w:r>
         <w:rPr>
-          <w:rFonts w:ascii="Times New Roman" w:eastAsia="Times New Roman" w:hAnsi="Times New Roman" w:cs="Times New Roman"/>
+          <w:rFonts w:eastAsia="Times New Roman" w:cstheme="minorHAnsi"/>
           <w:szCs w:val="28"/>
         </w:rPr>
         <w:t>obligatoria</w:t>
@@ -1280,7 +1239,7 @@
         <w:spacing w:before="100" w:beforeAutospacing="1" w:after="100" w:afterAutospacing="1" w:line="240" w:lineRule="auto"/>
         <w:jc w:val="left"/>
         <w:rPr>
-          <w:rFonts w:ascii="Times New Roman" w:eastAsia="Times New Roman" w:hAnsi="Times New Roman" w:cs="Times New Roman"/>
+          <w:rFonts w:eastAsia="Times New Roman" w:cstheme="minorHAnsi"/>
           <w:szCs w:val="28"/>
           <w:lang w:val="es-EC"/>
         </w:rPr>
@@ -1294,7 +1253,7 @@
       </w:r>
       <w:r>
         <w:rPr>
-          <w:rFonts w:ascii="Times New Roman" w:eastAsia="Times New Roman" w:hAnsi="Times New Roman" w:cs="Times New Roman"/>
+          <w:rFonts w:eastAsia="Times New Roman" w:cstheme="minorHAnsi"/>
           <w:szCs w:val="28"/>
           <w:lang w:val="es-EC"/>
         </w:rPr>
@@ -1303,7 +1262,7 @@
       <w:proofErr w:type="spellStart"/>
       <w:r>
         <w:rPr>
-          <w:rFonts w:ascii="Times New Roman" w:eastAsia="Times New Roman" w:hAnsi="Times New Roman" w:cs="Times New Roman"/>
+          <w:rFonts w:eastAsia="Times New Roman" w:cstheme="minorHAnsi"/>
           <w:szCs w:val="28"/>
           <w:lang w:val="es-EC"/>
         </w:rPr>
@@ -1312,7 +1271,7 @@
       <w:proofErr w:type="spellEnd"/>
       <w:r>
         <w:rPr>
-          <w:rFonts w:ascii="Times New Roman" w:eastAsia="Times New Roman" w:hAnsi="Times New Roman" w:cs="Times New Roman"/>
+          <w:rFonts w:eastAsia="Times New Roman" w:cstheme="minorHAnsi"/>
           <w:szCs w:val="28"/>
           <w:lang w:val="es-EC"/>
         </w:rPr>
@@ -1321,21 +1280,255 @@
     </w:p>
     <w:p>
       <w:pPr>
+        <w:spacing w:before="100" w:beforeAutospacing="1" w:after="100" w:afterAutospacing="1" w:line="240" w:lineRule="auto"/>
+        <w:jc w:val="left"/>
+        <w:outlineLvl w:val="0"/>
+        <w:rPr>
+          <w:rFonts w:eastAsia="Times New Roman" w:cstheme="minorHAnsi"/>
+          <w:b/>
+          <w:bCs/>
+          <w:kern w:val="36"/>
+          <w:szCs w:val="28"/>
+          <w:lang w:val="es-EC"/>
+        </w:rPr>
+      </w:pPr>
+      <w:r>
+        <w:rPr>
+          <w:rFonts w:ascii="Segoe UI Symbol" w:eastAsia="Times New Roman" w:hAnsi="Segoe UI Symbol" w:cs="Segoe UI Symbol"/>
+          <w:b/>
+          <w:bCs/>
+          <w:kern w:val="36"/>
+          <w:szCs w:val="28"/>
+        </w:rPr>
+        <w:t>🔵</w:t>
+      </w:r>
+      <w:r>
+        <w:rPr>
+          <w:rFonts w:eastAsia="Times New Roman" w:cstheme="minorHAnsi"/>
+          <w:b/>
+          <w:bCs/>
+          <w:kern w:val="36"/>
+          <w:szCs w:val="28"/>
+          <w:lang w:val="es-EC"/>
+        </w:rPr>
+        <w:t xml:space="preserve"> SPRINT 3 — CRUD Real de Usuarios</w:t>
+      </w:r>
+    </w:p>
+    <w:p>
+      <w:pPr>
         <w:spacing w:after="0" w:line="240" w:lineRule="auto"/>
         <w:jc w:val="left"/>
-        <w:rPr>
-          <w:rFonts w:ascii="Times New Roman" w:eastAsia="Times New Roman" w:hAnsi="Times New Roman" w:cs="Times New Roman"/>
-          <w:szCs w:val="28"/>
-        </w:rPr>
-      </w:pPr>
-      <w:r>
-        <w:rPr>
-          <w:rFonts w:ascii="Times New Roman" w:eastAsia="Times New Roman" w:hAnsi="Times New Roman" w:cs="Times New Roman"/>
-          <w:szCs w:val="28"/>
-        </w:rPr>
-        <w:pict>
-          <v:rect id="_x0000_i1027" style="width:0;height:1.5pt" o:hralign="center" o:hrstd="t" o:hr="t" fillcolor="#a0a0a0" stroked="f"/>
-        </w:pict>
+        <w:outlineLvl w:val="1"/>
+        <w:rPr>
+          <w:rFonts w:eastAsia="Times New Roman" w:cstheme="minorHAnsi"/>
+          <w:bCs/>
+          <w:szCs w:val="28"/>
+          <w:lang w:val="es-EC"/>
+        </w:rPr>
+      </w:pPr>
+      <w:r>
+        <w:rPr>
+          <w:rFonts w:ascii="Segoe UI Symbol" w:eastAsia="Times New Roman" w:hAnsi="Segoe UI Symbol" w:cs="Segoe UI Symbol"/>
+          <w:bCs/>
+          <w:szCs w:val="28"/>
+        </w:rPr>
+        <w:t>👤</w:t>
+      </w:r>
+      <w:r>
+        <w:rPr>
+          <w:rFonts w:eastAsia="Times New Roman" w:cstheme="minorHAnsi"/>
+          <w:bCs/>
+          <w:szCs w:val="28"/>
+          <w:lang w:val="es-EC"/>
+        </w:rPr>
+        <w:t xml:space="preserve"> 3.1 Crear usuario</w:t>
+      </w:r>
+    </w:p>
+    <w:p>
+      <w:pPr>
+        <w:spacing w:after="0" w:line="240" w:lineRule="auto"/>
+        <w:jc w:val="left"/>
+        <w:outlineLvl w:val="1"/>
+        <w:rPr>
+          <w:rFonts w:eastAsia="Times New Roman" w:cstheme="minorHAnsi"/>
+          <w:bCs/>
+          <w:szCs w:val="28"/>
+          <w:lang w:val="es-EC"/>
+        </w:rPr>
+      </w:pPr>
+      <w:r>
+        <w:rPr>
+          <w:rFonts w:ascii="Segoe UI Symbol" w:eastAsia="Times New Roman" w:hAnsi="Segoe UI Symbol" w:cs="Segoe UI Symbol"/>
+          <w:bCs/>
+          <w:szCs w:val="28"/>
+          <w:lang w:val="es-EC"/>
+        </w:rPr>
+        <w:t>✏</w:t>
+      </w:r>
+      <w:r>
+        <w:rPr>
+          <w:rFonts w:eastAsia="Times New Roman" w:cstheme="minorHAnsi"/>
+          <w:bCs/>
+          <w:szCs w:val="28"/>
+          <w:lang w:val="es-EC"/>
+        </w:rPr>
+        <w:t xml:space="preserve"> 3.2 Editar usuario</w:t>
+      </w:r>
+    </w:p>
+    <w:p>
+      <w:pPr>
+        <w:spacing w:after="0" w:line="240" w:lineRule="auto"/>
+        <w:jc w:val="left"/>
+        <w:outlineLvl w:val="1"/>
+        <w:rPr>
+          <w:rFonts w:eastAsia="Times New Roman" w:cstheme="minorHAnsi"/>
+          <w:bCs/>
+          <w:szCs w:val="28"/>
+          <w:lang w:val="es-EC"/>
+        </w:rPr>
+      </w:pPr>
+      <w:r>
+        <w:rPr>
+          <w:rFonts w:ascii="Segoe UI Symbol" w:eastAsia="Times New Roman" w:hAnsi="Segoe UI Symbol" w:cs="Segoe UI Symbol"/>
+          <w:bCs/>
+          <w:szCs w:val="28"/>
+          <w:lang w:val="es-EC"/>
+        </w:rPr>
+        <w:t>❌</w:t>
+      </w:r>
+      <w:r>
+        <w:rPr>
+          <w:rFonts w:eastAsia="Times New Roman" w:cstheme="minorHAnsi"/>
+          <w:bCs/>
+          <w:szCs w:val="28"/>
+          <w:lang w:val="es-EC"/>
+        </w:rPr>
+        <w:t xml:space="preserve"> 3.3 Activar / Desactivar</w:t>
+      </w:r>
+    </w:p>
+    <w:p>
+      <w:pPr>
+        <w:spacing w:after="0" w:line="240" w:lineRule="auto"/>
+        <w:jc w:val="left"/>
+        <w:outlineLvl w:val="1"/>
+        <w:rPr>
+          <w:rFonts w:eastAsia="Times New Roman" w:cstheme="minorHAnsi"/>
+          <w:bCs/>
+          <w:szCs w:val="28"/>
+          <w:lang w:val="es-EC"/>
+        </w:rPr>
+      </w:pPr>
+      <w:r>
+        <w:rPr>
+          <w:rFonts w:ascii="Segoe UI Symbol" w:eastAsia="Times New Roman" w:hAnsi="Segoe UI Symbol" w:cs="Segoe UI Symbol"/>
+          <w:bCs/>
+          <w:szCs w:val="28"/>
+        </w:rPr>
+        <w:t>🔑</w:t>
+      </w:r>
+      <w:r>
+        <w:rPr>
+          <w:rFonts w:eastAsia="Times New Roman" w:cstheme="minorHAnsi"/>
+          <w:bCs/>
+          <w:szCs w:val="28"/>
+          <w:lang w:val="es-EC"/>
+        </w:rPr>
+        <w:t xml:space="preserve"> 3.4 Resetear contraseña</w:t>
+      </w:r>
+    </w:p>
+    <w:p>
+      <w:pPr>
+        <w:spacing w:after="0" w:line="240" w:lineRule="auto"/>
+        <w:jc w:val="left"/>
+        <w:outlineLvl w:val="1"/>
+        <w:rPr>
+          <w:rFonts w:eastAsia="Times New Roman" w:cstheme="minorHAnsi"/>
+          <w:bCs/>
+          <w:szCs w:val="28"/>
+          <w:lang w:val="es-EC"/>
+        </w:rPr>
+      </w:pPr>
+      <w:r>
+        <w:rPr>
+          <w:rFonts w:ascii="Calibri" w:eastAsia="Times New Roman" w:hAnsi="Calibri" w:cs="Calibri"/>
+          <w:bCs/>
+          <w:szCs w:val="28"/>
+        </w:rPr>
+        <w:t>🧪</w:t>
+      </w:r>
+      <w:r>
+        <w:rPr>
+          <w:rFonts w:eastAsia="Times New Roman" w:cstheme="minorHAnsi"/>
+          <w:bCs/>
+          <w:szCs w:val="28"/>
+          <w:lang w:val="es-EC"/>
+        </w:rPr>
+        <w:t xml:space="preserve"> 3.5 Validaciones </w:t>
+      </w:r>
+      <w:proofErr w:type="spellStart"/>
+      <w:r>
+        <w:rPr>
+          <w:rFonts w:eastAsia="Times New Roman" w:cstheme="minorHAnsi"/>
+          <w:bCs/>
+          <w:szCs w:val="28"/>
+          <w:lang w:val="es-EC"/>
+        </w:rPr>
+        <w:t>backend</w:t>
+      </w:r>
+      <w:proofErr w:type="spellEnd"/>
+      <w:r>
+        <w:rPr>
+          <w:rFonts w:eastAsia="Times New Roman" w:cstheme="minorHAnsi"/>
+          <w:bCs/>
+          <w:szCs w:val="28"/>
+          <w:lang w:val="es-EC"/>
+        </w:rPr>
+        <w:t xml:space="preserve"> robustas</w:t>
+      </w:r>
+    </w:p>
+    <w:p>
+      <w:pPr>
+        <w:spacing w:after="0" w:line="240" w:lineRule="auto"/>
+        <w:jc w:val="left"/>
+        <w:rPr>
+          <w:rFonts w:eastAsia="Times New Roman" w:cstheme="minorHAnsi"/>
+          <w:szCs w:val="28"/>
+          <w:lang w:val="es-EC"/>
+        </w:rPr>
+      </w:pPr>
+      <w:r>
+        <w:rPr>
+          <w:rFonts w:ascii="Segoe UI Symbol" w:eastAsia="Times New Roman" w:hAnsi="Segoe UI Symbol" w:cs="Segoe UI Symbol"/>
+          <w:szCs w:val="28"/>
+        </w:rPr>
+        <w:lastRenderedPageBreak/>
+        <w:t>🎯</w:t>
+      </w:r>
+      <w:r>
+        <w:rPr>
+          <w:rFonts w:eastAsia="Times New Roman" w:cstheme="minorHAnsi"/>
+          <w:szCs w:val="28"/>
+          <w:lang w:val="es-EC"/>
+        </w:rPr>
+        <w:t xml:space="preserve"> Resultado: módulo </w:t>
+      </w:r>
+      <w:proofErr w:type="spellStart"/>
+      <w:r>
+        <w:rPr>
+          <w:rFonts w:eastAsia="Times New Roman" w:cstheme="minorHAnsi"/>
+          <w:szCs w:val="28"/>
+          <w:lang w:val="es-EC"/>
+        </w:rPr>
+        <w:t>admin</w:t>
+      </w:r>
+      <w:proofErr w:type="spellEnd"/>
+      <w:r>
+        <w:rPr>
+          <w:rFonts w:eastAsia="Times New Roman" w:cstheme="minorHAnsi"/>
+          <w:szCs w:val="28"/>
+          <w:lang w:val="es-EC"/>
+        </w:rPr>
+        <w:t xml:space="preserve"> completo.</w:t>
       </w:r>
     </w:p>
     <w:p>
@@ -1344,7 +1537,7 @@
         <w:jc w:val="left"/>
         <w:outlineLvl w:val="0"/>
         <w:rPr>
-          <w:rFonts w:ascii="Times New Roman" w:eastAsia="Times New Roman" w:hAnsi="Times New Roman" w:cs="Times New Roman"/>
+          <w:rFonts w:eastAsia="Times New Roman" w:cstheme="minorHAnsi"/>
           <w:b/>
           <w:bCs/>
           <w:kern w:val="36"/>
@@ -1364,48 +1557,664 @@
       </w:r>
       <w:r>
         <w:rPr>
-          <w:rFonts w:ascii="Times New Roman" w:eastAsia="Times New Roman" w:hAnsi="Times New Roman" w:cs="Times New Roman"/>
+          <w:rFonts w:eastAsia="Times New Roman" w:cstheme="minorHAnsi"/>
           <w:b/>
           <w:bCs/>
           <w:kern w:val="36"/>
           <w:szCs w:val="28"/>
           <w:lang w:val="es-EC"/>
         </w:rPr>
-        <w:t xml:space="preserve"> SPRINT 3 — </w:t>
+        <w:t xml:space="preserve"> SPRINT 4 — Módulo Clínica</w:t>
+      </w:r>
+    </w:p>
+    <w:p>
+      <w:pPr>
+        <w:spacing w:after="0" w:line="240" w:lineRule="auto"/>
+        <w:jc w:val="left"/>
+        <w:outlineLvl w:val="1"/>
+        <w:rPr>
+          <w:rFonts w:eastAsia="Times New Roman" w:cstheme="minorHAnsi"/>
+          <w:bCs/>
+          <w:szCs w:val="28"/>
+          <w:lang w:val="es-EC"/>
+        </w:rPr>
+      </w:pPr>
+      <w:r>
+        <w:rPr>
+          <w:rFonts w:ascii="Segoe UI Symbol" w:eastAsia="Times New Roman" w:hAnsi="Segoe UI Symbol" w:cs="Segoe UI Symbol"/>
+          <w:bCs/>
+          <w:szCs w:val="28"/>
+        </w:rPr>
+        <w:t>🐶</w:t>
+      </w:r>
+      <w:r>
+        <w:rPr>
+          <w:rFonts w:eastAsia="Times New Roman" w:cstheme="minorHAnsi"/>
+          <w:bCs/>
+          <w:szCs w:val="28"/>
+          <w:lang w:val="es-EC"/>
+        </w:rPr>
+        <w:t xml:space="preserve"> Mascotas</w:t>
+      </w:r>
+    </w:p>
+    <w:p>
+      <w:pPr>
+        <w:spacing w:after="0" w:line="240" w:lineRule="auto"/>
+        <w:jc w:val="left"/>
+        <w:outlineLvl w:val="1"/>
+        <w:rPr>
+          <w:rFonts w:eastAsia="Times New Roman" w:cstheme="minorHAnsi"/>
+          <w:bCs/>
+          <w:szCs w:val="28"/>
+          <w:lang w:val="es-EC"/>
+        </w:rPr>
+      </w:pPr>
+      <w:r>
+        <w:rPr>
+          <w:rFonts w:ascii="Segoe UI Symbol" w:eastAsia="Times New Roman" w:hAnsi="Segoe UI Symbol" w:cs="Segoe UI Symbol"/>
+          <w:bCs/>
+          <w:szCs w:val="28"/>
+        </w:rPr>
+        <w:t>👩</w:t>
+      </w:r>
+      <w:r>
+        <w:rPr>
+          <w:rFonts w:eastAsia="Times New Roman" w:cstheme="minorHAnsi"/>
+          <w:bCs/>
+          <w:szCs w:val="28"/>
+          <w:lang w:val="es-EC"/>
+        </w:rPr>
+        <w:t>‍</w:t>
+      </w:r>
+      <w:r>
+        <w:rPr>
+          <w:rFonts w:ascii="Segoe UI Symbol" w:eastAsia="Times New Roman" w:hAnsi="Segoe UI Symbol" w:cs="Segoe UI Symbol"/>
+          <w:bCs/>
+          <w:szCs w:val="28"/>
+          <w:lang w:val="es-EC"/>
+        </w:rPr>
+        <w:t>⚕</w:t>
+      </w:r>
+      <w:r>
+        <w:rPr>
+          <w:rFonts w:eastAsia="Times New Roman" w:cstheme="minorHAnsi"/>
+          <w:bCs/>
+          <w:szCs w:val="28"/>
+        </w:rPr>
+        <w:t>️</w:t>
+      </w:r>
+      <w:r>
+        <w:rPr>
+          <w:rFonts w:eastAsia="Times New Roman" w:cstheme="minorHAnsi"/>
+          <w:bCs/>
+          <w:szCs w:val="28"/>
+          <w:lang w:val="es-EC"/>
+        </w:rPr>
+        <w:t xml:space="preserve"> Consultas</w:t>
+      </w:r>
+    </w:p>
+    <w:p>
+      <w:pPr>
+        <w:spacing w:after="0" w:line="240" w:lineRule="auto"/>
+        <w:jc w:val="left"/>
+        <w:outlineLvl w:val="1"/>
+        <w:rPr>
+          <w:rFonts w:eastAsia="Times New Roman" w:cstheme="minorHAnsi"/>
+          <w:bCs/>
+          <w:szCs w:val="28"/>
+          <w:lang w:val="es-EC"/>
+        </w:rPr>
+      </w:pPr>
+      <w:r>
+        <w:rPr>
+          <w:rFonts w:ascii="Segoe UI Symbol" w:eastAsia="Times New Roman" w:hAnsi="Segoe UI Symbol" w:cs="Segoe UI Symbol"/>
+          <w:bCs/>
+          <w:szCs w:val="28"/>
+        </w:rPr>
+        <w:t>💉</w:t>
+      </w:r>
+      <w:r>
+        <w:rPr>
+          <w:rFonts w:eastAsia="Times New Roman" w:cstheme="minorHAnsi"/>
+          <w:bCs/>
+          <w:szCs w:val="28"/>
+          <w:lang w:val="es-EC"/>
+        </w:rPr>
+        <w:t xml:space="preserve"> Vacunas</w:t>
+      </w:r>
+    </w:p>
+    <w:p>
+      <w:pPr>
+        <w:spacing w:after="0" w:line="240" w:lineRule="auto"/>
+        <w:jc w:val="left"/>
+        <w:outlineLvl w:val="1"/>
+        <w:rPr>
+          <w:rFonts w:eastAsia="Times New Roman" w:cstheme="minorHAnsi"/>
+          <w:bCs/>
+          <w:szCs w:val="28"/>
+          <w:lang w:val="es-EC"/>
+        </w:rPr>
+      </w:pPr>
+      <w:r>
+        <w:rPr>
+          <w:rFonts w:ascii="Segoe UI Symbol" w:eastAsia="Times New Roman" w:hAnsi="Segoe UI Symbol" w:cs="Segoe UI Symbol"/>
+          <w:bCs/>
+          <w:szCs w:val="28"/>
+        </w:rPr>
+        <w:t>📅</w:t>
+      </w:r>
+      <w:r>
+        <w:rPr>
+          <w:rFonts w:eastAsia="Times New Roman" w:cstheme="minorHAnsi"/>
+          <w:bCs/>
+          <w:szCs w:val="28"/>
+          <w:lang w:val="es-EC"/>
+        </w:rPr>
+        <w:t xml:space="preserve"> Recordatorios automáticos</w:t>
+      </w:r>
+    </w:p>
+    <w:p>
+      <w:pPr>
+        <w:spacing w:after="0" w:line="240" w:lineRule="auto"/>
+        <w:jc w:val="left"/>
+        <w:outlineLvl w:val="1"/>
+        <w:rPr>
+          <w:rFonts w:eastAsia="Times New Roman" w:cstheme="minorHAnsi"/>
+          <w:bCs/>
+          <w:szCs w:val="28"/>
+          <w:lang w:val="es-EC"/>
+        </w:rPr>
+      </w:pPr>
+    </w:p>
+    <w:p>
+      <w:pPr>
+        <w:spacing w:before="100" w:beforeAutospacing="1" w:after="100" w:afterAutospacing="1" w:line="240" w:lineRule="auto"/>
+        <w:jc w:val="left"/>
+        <w:outlineLvl w:val="0"/>
+        <w:rPr>
+          <w:rFonts w:eastAsia="Times New Roman" w:cstheme="minorHAnsi"/>
+          <w:b/>
+          <w:bCs/>
+          <w:kern w:val="36"/>
+          <w:szCs w:val="28"/>
+          <w:lang w:val="es-MX"/>
+        </w:rPr>
+      </w:pPr>
+      <w:r>
+        <w:rPr>
+          <w:rFonts w:ascii="Segoe UI Symbol" w:eastAsia="Times New Roman" w:hAnsi="Segoe UI Symbol" w:cs="Segoe UI Symbol"/>
+          <w:b/>
+          <w:bCs/>
+          <w:kern w:val="36"/>
+          <w:szCs w:val="28"/>
+        </w:rPr>
+        <w:t>🔵</w:t>
+      </w:r>
+      <w:r>
+        <w:rPr>
+          <w:rFonts w:eastAsia="Times New Roman" w:cstheme="minorHAnsi"/>
+          <w:b/>
+          <w:bCs/>
+          <w:kern w:val="36"/>
+          <w:szCs w:val="28"/>
+          <w:lang w:val="es-MX"/>
+        </w:rPr>
+        <w:t xml:space="preserve"> SPRINT 5 — Módulo Farmacia</w:t>
+      </w:r>
+    </w:p>
+    <w:p>
+      <w:pPr>
+        <w:spacing w:after="0" w:line="240" w:lineRule="auto"/>
+        <w:jc w:val="left"/>
+        <w:outlineLvl w:val="1"/>
+        <w:rPr>
+          <w:rFonts w:eastAsia="Times New Roman" w:cstheme="minorHAnsi"/>
+          <w:bCs/>
+          <w:szCs w:val="28"/>
+          <w:lang w:val="es-MX"/>
+        </w:rPr>
+      </w:pPr>
+      <w:r>
+        <w:rPr>
+          <w:rFonts w:ascii="Segoe UI Symbol" w:eastAsia="Times New Roman" w:hAnsi="Segoe UI Symbol" w:cs="Segoe UI Symbol"/>
+          <w:bCs/>
+          <w:szCs w:val="28"/>
+        </w:rPr>
+        <w:t>💊</w:t>
+      </w:r>
+      <w:r>
+        <w:rPr>
+          <w:rFonts w:eastAsia="Times New Roman" w:cstheme="minorHAnsi"/>
+          <w:bCs/>
+          <w:szCs w:val="28"/>
+          <w:lang w:val="es-MX"/>
+        </w:rPr>
+        <w:t xml:space="preserve"> Medicamentos</w:t>
+      </w:r>
+    </w:p>
+    <w:p>
+      <w:pPr>
+        <w:spacing w:after="0" w:line="240" w:lineRule="auto"/>
+        <w:jc w:val="left"/>
+        <w:outlineLvl w:val="1"/>
+        <w:rPr>
+          <w:rFonts w:eastAsia="Times New Roman" w:cstheme="minorHAnsi"/>
+          <w:bCs/>
+          <w:szCs w:val="28"/>
+          <w:lang w:val="es-MX"/>
+        </w:rPr>
+      </w:pPr>
+      <w:r>
+        <w:rPr>
+          <w:rFonts w:ascii="Segoe UI Symbol" w:eastAsia="Times New Roman" w:hAnsi="Segoe UI Symbol" w:cs="Segoe UI Symbol"/>
+          <w:bCs/>
+          <w:szCs w:val="28"/>
+        </w:rPr>
+        <w:t>🛒</w:t>
+      </w:r>
+      <w:r>
+        <w:rPr>
+          <w:rFonts w:eastAsia="Times New Roman" w:cstheme="minorHAnsi"/>
+          <w:bCs/>
+          <w:szCs w:val="28"/>
+          <w:lang w:val="es-MX"/>
+        </w:rPr>
+        <w:t xml:space="preserve"> Ventas</w:t>
+      </w:r>
+    </w:p>
+    <w:p>
+      <w:pPr>
+        <w:spacing w:after="0" w:line="240" w:lineRule="auto"/>
+        <w:jc w:val="left"/>
+        <w:outlineLvl w:val="1"/>
+        <w:rPr>
+          <w:rFonts w:eastAsia="Times New Roman" w:cstheme="minorHAnsi"/>
+          <w:bCs/>
+          <w:szCs w:val="28"/>
+          <w:lang w:val="es-EC"/>
+        </w:rPr>
+      </w:pPr>
+      <w:r>
+        <w:rPr>
+          <w:rFonts w:ascii="Segoe UI Symbol" w:eastAsia="Times New Roman" w:hAnsi="Segoe UI Symbol" w:cs="Segoe UI Symbol"/>
+          <w:bCs/>
+          <w:szCs w:val="28"/>
+        </w:rPr>
+        <w:t>📊</w:t>
+      </w:r>
+      <w:r>
+        <w:rPr>
+          <w:rFonts w:eastAsia="Times New Roman" w:cstheme="minorHAnsi"/>
+          <w:bCs/>
+          <w:szCs w:val="28"/>
+          <w:lang w:val="es-EC"/>
+        </w:rPr>
+        <w:t xml:space="preserve"> Stock dinámico</w:t>
+      </w:r>
+    </w:p>
+    <w:p>
+      <w:pPr>
+        <w:spacing w:after="0" w:line="240" w:lineRule="auto"/>
+        <w:jc w:val="left"/>
+        <w:outlineLvl w:val="1"/>
+        <w:rPr>
+          <w:rFonts w:eastAsia="Times New Roman" w:cstheme="minorHAnsi"/>
+          <w:bCs/>
+          <w:szCs w:val="28"/>
+          <w:lang w:val="es-EC"/>
+        </w:rPr>
+      </w:pPr>
+      <w:r>
+        <w:rPr>
+          <w:rFonts w:ascii="Segoe UI Symbol" w:eastAsia="Times New Roman" w:hAnsi="Segoe UI Symbol" w:cs="Segoe UI Symbol"/>
+          <w:bCs/>
+          <w:szCs w:val="28"/>
+        </w:rPr>
+        <w:t>📈</w:t>
+      </w:r>
+      <w:r>
+        <w:rPr>
+          <w:rFonts w:eastAsia="Times New Roman" w:cstheme="minorHAnsi"/>
+          <w:bCs/>
+          <w:szCs w:val="28"/>
+          <w:lang w:val="es-EC"/>
+        </w:rPr>
+        <w:t xml:space="preserve"> Reportes básicos</w:t>
+      </w:r>
+    </w:p>
+    <w:p>
+      <w:pPr>
+        <w:spacing w:after="0" w:line="240" w:lineRule="auto"/>
+        <w:jc w:val="left"/>
+        <w:outlineLvl w:val="1"/>
+        <w:rPr>
+          <w:rFonts w:eastAsia="Times New Roman" w:cstheme="minorHAnsi"/>
+          <w:bCs/>
+          <w:szCs w:val="28"/>
+          <w:lang w:val="es-EC"/>
+        </w:rPr>
+      </w:pPr>
+    </w:p>
+    <w:p>
+      <w:pPr>
+        <w:spacing w:before="100" w:beforeAutospacing="1" w:after="100" w:afterAutospacing="1" w:line="240" w:lineRule="auto"/>
+        <w:jc w:val="left"/>
+        <w:outlineLvl w:val="0"/>
+        <w:rPr>
+          <w:rFonts w:eastAsia="Times New Roman" w:cstheme="minorHAnsi"/>
+          <w:b/>
+          <w:bCs/>
+          <w:kern w:val="36"/>
+          <w:szCs w:val="28"/>
+        </w:rPr>
+      </w:pPr>
+      <w:r>
+        <w:rPr>
+          <w:rFonts w:ascii="Segoe UI Symbol" w:eastAsia="Times New Roman" w:hAnsi="Segoe UI Symbol" w:cs="Segoe UI Symbol"/>
+          <w:b/>
+          <w:bCs/>
+          <w:kern w:val="36"/>
+          <w:szCs w:val="28"/>
+        </w:rPr>
+        <w:t>🔵</w:t>
+      </w:r>
+      <w:r>
+        <w:rPr>
+          <w:rFonts w:eastAsia="Times New Roman" w:cstheme="minorHAnsi"/>
+          <w:b/>
+          <w:bCs/>
+          <w:kern w:val="36"/>
+          <w:szCs w:val="28"/>
+        </w:rPr>
+        <w:t xml:space="preserve"> SPRINT 6 — </w:t>
       </w:r>
       <w:proofErr w:type="spellStart"/>
       <w:r>
         <w:rPr>
-          <w:rFonts w:ascii="Times New Roman" w:eastAsia="Times New Roman" w:hAnsi="Times New Roman" w:cs="Times New Roman"/>
+          <w:rFonts w:eastAsia="Times New Roman" w:cstheme="minorHAnsi"/>
           <w:b/>
           <w:bCs/>
           <w:kern w:val="36"/>
           <w:szCs w:val="28"/>
-          <w:lang w:val="es-EC"/>
-        </w:rPr>
-        <w:t>CRUD</w:t>
+        </w:rPr>
+        <w:t>Optimización</w:t>
       </w:r>
       <w:proofErr w:type="spellEnd"/>
       <w:r>
         <w:rPr>
-          <w:rFonts w:ascii="Times New Roman" w:eastAsia="Times New Roman" w:hAnsi="Times New Roman" w:cs="Times New Roman"/>
+          <w:rFonts w:eastAsia="Times New Roman" w:cstheme="minorHAnsi"/>
           <w:b/>
           <w:bCs/>
           <w:kern w:val="36"/>
           <w:szCs w:val="28"/>
-          <w:lang w:val="es-EC"/>
-        </w:rPr>
-        <w:t xml:space="preserve"> Real de Usuarios</w:t>
-      </w:r>
+        </w:rPr>
+        <w:t xml:space="preserve"> </w:t>
+      </w:r>
+      <w:proofErr w:type="spellStart"/>
+      <w:r>
+        <w:rPr>
+          <w:rFonts w:eastAsia="Times New Roman" w:cstheme="minorHAnsi"/>
+          <w:b/>
+          <w:bCs/>
+          <w:kern w:val="36"/>
+          <w:szCs w:val="28"/>
+        </w:rPr>
+        <w:t>Profesional</w:t>
+      </w:r>
+      <w:proofErr w:type="spellEnd"/>
+    </w:p>
+    <w:p>
+      <w:pPr>
+        <w:spacing w:after="0" w:line="240" w:lineRule="auto"/>
+        <w:jc w:val="left"/>
+        <w:outlineLvl w:val="1"/>
+        <w:rPr>
+          <w:rFonts w:eastAsia="Times New Roman" w:cstheme="minorHAnsi"/>
+          <w:bCs/>
+          <w:szCs w:val="28"/>
+        </w:rPr>
+      </w:pPr>
+      <w:r>
+        <w:rPr>
+          <w:rFonts w:ascii="Segoe UI Symbol" w:eastAsia="Times New Roman" w:hAnsi="Segoe UI Symbol" w:cs="Segoe UI Symbol"/>
+          <w:bCs/>
+          <w:szCs w:val="28"/>
+        </w:rPr>
+        <w:t>🔐</w:t>
+      </w:r>
+      <w:r>
+        <w:rPr>
+          <w:rFonts w:eastAsia="Times New Roman" w:cstheme="minorHAnsi"/>
+          <w:bCs/>
+          <w:szCs w:val="28"/>
+        </w:rPr>
+        <w:t xml:space="preserve"> CSRF tokens</w:t>
+      </w:r>
+    </w:p>
+    <w:p>
+      <w:pPr>
+        <w:spacing w:after="0" w:line="240" w:lineRule="auto"/>
+        <w:jc w:val="left"/>
+        <w:outlineLvl w:val="1"/>
+        <w:rPr>
+          <w:rFonts w:eastAsia="Times New Roman" w:cstheme="minorHAnsi"/>
+          <w:bCs/>
+          <w:szCs w:val="28"/>
+        </w:rPr>
+      </w:pPr>
+      <w:r>
+        <w:rPr>
+          <w:rFonts w:ascii="Calibri" w:eastAsia="Times New Roman" w:hAnsi="Calibri" w:cs="Calibri"/>
+          <w:bCs/>
+          <w:szCs w:val="28"/>
+        </w:rPr>
+        <w:t>🧂</w:t>
+      </w:r>
+      <w:r>
+        <w:rPr>
+          <w:rFonts w:eastAsia="Times New Roman" w:cstheme="minorHAnsi"/>
+          <w:bCs/>
+          <w:szCs w:val="28"/>
+        </w:rPr>
+        <w:t xml:space="preserve"> Password hashing </w:t>
+      </w:r>
+      <w:proofErr w:type="spellStart"/>
+      <w:r>
+        <w:rPr>
+          <w:rFonts w:eastAsia="Times New Roman" w:cstheme="minorHAnsi"/>
+          <w:bCs/>
+          <w:szCs w:val="28"/>
+        </w:rPr>
+        <w:t>robusto</w:t>
+      </w:r>
+      <w:proofErr w:type="spellEnd"/>
+    </w:p>
+    <w:p>
+      <w:pPr>
+        <w:spacing w:after="0" w:line="240" w:lineRule="auto"/>
+        <w:jc w:val="left"/>
+        <w:outlineLvl w:val="1"/>
+        <w:rPr>
+          <w:rFonts w:eastAsia="Times New Roman" w:cstheme="minorHAnsi"/>
+          <w:bCs/>
+          <w:szCs w:val="28"/>
+          <w:lang w:val="es-EC"/>
+        </w:rPr>
+      </w:pPr>
+      <w:r>
+        <w:rPr>
+          <w:rFonts w:ascii="Segoe UI Symbol" w:eastAsia="Times New Roman" w:hAnsi="Segoe UI Symbol" w:cs="Segoe UI Symbol"/>
+          <w:bCs/>
+          <w:szCs w:val="28"/>
+        </w:rPr>
+        <w:t>📦</w:t>
+      </w:r>
+      <w:r>
+        <w:rPr>
+          <w:rFonts w:eastAsia="Times New Roman" w:cstheme="minorHAnsi"/>
+          <w:bCs/>
+          <w:szCs w:val="28"/>
+          <w:lang w:val="es-EC"/>
+        </w:rPr>
+        <w:t xml:space="preserve"> Servicios</w:t>
+      </w:r>
+    </w:p>
+    <w:p>
+      <w:pPr>
+        <w:spacing w:after="0" w:line="240" w:lineRule="auto"/>
+        <w:jc w:val="left"/>
+        <w:outlineLvl w:val="1"/>
+        <w:rPr>
+          <w:rFonts w:eastAsia="Times New Roman" w:cstheme="minorHAnsi"/>
+          <w:bCs/>
+          <w:szCs w:val="28"/>
+          <w:lang w:val="es-EC"/>
+        </w:rPr>
+      </w:pPr>
+      <w:r>
+        <w:rPr>
+          <w:rFonts w:ascii="Calibri" w:eastAsia="Times New Roman" w:hAnsi="Calibri" w:cs="Calibri"/>
+          <w:bCs/>
+          <w:szCs w:val="28"/>
+        </w:rPr>
+        <w:t>🧪</w:t>
+      </w:r>
+      <w:r>
+        <w:rPr>
+          <w:rFonts w:eastAsia="Times New Roman" w:cstheme="minorHAnsi"/>
+          <w:bCs/>
+          <w:szCs w:val="28"/>
+          <w:lang w:val="es-EC"/>
+        </w:rPr>
+        <w:t xml:space="preserve"> </w:t>
+      </w:r>
+      <w:proofErr w:type="spellStart"/>
+      <w:r>
+        <w:rPr>
+          <w:rFonts w:eastAsia="Times New Roman" w:cstheme="minorHAnsi"/>
+          <w:bCs/>
+          <w:szCs w:val="28"/>
+          <w:lang w:val="es-EC"/>
+        </w:rPr>
+        <w:t>Testing</w:t>
+      </w:r>
+      <w:proofErr w:type="spellEnd"/>
+      <w:r>
+        <w:rPr>
+          <w:rFonts w:eastAsia="Times New Roman" w:cstheme="minorHAnsi"/>
+          <w:bCs/>
+          <w:szCs w:val="28"/>
+          <w:lang w:val="es-EC"/>
+        </w:rPr>
+        <w:t xml:space="preserve"> manual estructurado</w:t>
+      </w:r>
+    </w:p>
+    <w:p>
+      <w:pPr>
+        <w:spacing w:after="0" w:line="240" w:lineRule="auto"/>
+        <w:jc w:val="left"/>
+        <w:outlineLvl w:val="1"/>
+        <w:rPr>
+          <w:rFonts w:eastAsia="Times New Roman" w:cstheme="minorHAnsi"/>
+          <w:bCs/>
+          <w:szCs w:val="28"/>
+          <w:lang w:val="es-MX"/>
+        </w:rPr>
+      </w:pPr>
+      <w:r>
+        <w:rPr>
+          <w:rFonts w:ascii="Calibri" w:eastAsia="Times New Roman" w:hAnsi="Calibri" w:cs="Calibri"/>
+          <w:bCs/>
+          <w:szCs w:val="28"/>
+        </w:rPr>
+        <w:t>🧹</w:t>
+      </w:r>
+      <w:r>
+        <w:rPr>
+          <w:rFonts w:eastAsia="Times New Roman" w:cstheme="minorHAnsi"/>
+          <w:bCs/>
+          <w:szCs w:val="28"/>
+          <w:lang w:val="es-MX"/>
+        </w:rPr>
+        <w:t xml:space="preserve"> </w:t>
+      </w:r>
+      <w:proofErr w:type="spellStart"/>
+      <w:r>
+        <w:rPr>
+          <w:rFonts w:eastAsia="Times New Roman" w:cstheme="minorHAnsi"/>
+          <w:bCs/>
+          <w:szCs w:val="28"/>
+          <w:lang w:val="es-MX"/>
+        </w:rPr>
+        <w:t>Refactor</w:t>
+      </w:r>
+      <w:proofErr w:type="spellEnd"/>
+      <w:r>
+        <w:rPr>
+          <w:rFonts w:eastAsia="Times New Roman" w:cstheme="minorHAnsi"/>
+          <w:bCs/>
+          <w:szCs w:val="28"/>
+          <w:lang w:val="es-MX"/>
+        </w:rPr>
+        <w:t xml:space="preserve"> general</w:t>
+      </w:r>
+    </w:p>
+    <w:p>
+      <w:pPr>
+        <w:spacing w:after="0" w:line="240" w:lineRule="auto"/>
+        <w:jc w:val="left"/>
+        <w:outlineLvl w:val="1"/>
+        <w:rPr>
+          <w:rFonts w:eastAsia="Times New Roman" w:cstheme="minorHAnsi"/>
+          <w:bCs/>
+          <w:szCs w:val="28"/>
+          <w:lang w:val="es-MX"/>
+        </w:rPr>
+      </w:pPr>
     </w:p>
     <w:p>
       <w:pPr>
         <w:spacing w:before="100" w:beforeAutospacing="1" w:after="100" w:afterAutospacing="1" w:line="240" w:lineRule="auto"/>
         <w:jc w:val="left"/>
+        <w:outlineLvl w:val="0"/>
+        <w:rPr>
+          <w:rFonts w:eastAsia="Times New Roman" w:cstheme="minorHAnsi"/>
+          <w:b/>
+          <w:bCs/>
+          <w:kern w:val="36"/>
+          <w:szCs w:val="28"/>
+          <w:lang w:val="es-EC"/>
+        </w:rPr>
+      </w:pPr>
+      <w:r>
+        <w:rPr>
+          <w:rFonts w:ascii="Segoe UI Symbol" w:eastAsia="Times New Roman" w:hAnsi="Segoe UI Symbol" w:cs="Segoe UI Symbol"/>
+          <w:b/>
+          <w:bCs/>
+          <w:kern w:val="36"/>
+          <w:szCs w:val="28"/>
+        </w:rPr>
+        <w:t>🔵</w:t>
+      </w:r>
+      <w:r>
+        <w:rPr>
+          <w:rFonts w:eastAsia="Times New Roman" w:cstheme="minorHAnsi"/>
+          <w:b/>
+          <w:bCs/>
+          <w:kern w:val="36"/>
+          <w:szCs w:val="28"/>
+          <w:lang w:val="es-EC"/>
+        </w:rPr>
+        <w:t xml:space="preserve"> SPRINT 7 — Producción</w:t>
+      </w:r>
+    </w:p>
+    <w:p>
+      <w:pPr>
+        <w:spacing w:after="0" w:line="240" w:lineRule="auto"/>
+        <w:jc w:val="left"/>
         <w:outlineLvl w:val="1"/>
         <w:rPr>
-          <w:rFonts w:ascii="Times New Roman" w:eastAsia="Times New Roman" w:hAnsi="Times New Roman" w:cs="Times New Roman"/>
-          <w:b/>
+          <w:rFonts w:eastAsia="Times New Roman" w:cstheme="minorHAnsi"/>
           <w:bCs/>
           <w:szCs w:val="28"/>
           <w:lang w:val="es-EC"/>
@@ -1414,32 +2223,28 @@
       <w:r>
         <w:rPr>
           <w:rFonts w:ascii="Segoe UI Symbol" w:eastAsia="Times New Roman" w:hAnsi="Segoe UI Symbol" w:cs="Segoe UI Symbol"/>
-          <w:b/>
-          <w:bCs/>
-          <w:szCs w:val="28"/>
-        </w:rPr>
-        <w:lastRenderedPageBreak/>
-        <w:t>👤</w:t>
-      </w:r>
-      <w:r>
-        <w:rPr>
-          <w:rFonts w:ascii="Times New Roman" w:eastAsia="Times New Roman" w:hAnsi="Times New Roman" w:cs="Times New Roman"/>
-          <w:b/>
-          <w:bCs/>
-          <w:szCs w:val="28"/>
-          <w:lang w:val="es-EC"/>
-        </w:rPr>
-        <w:t xml:space="preserve"> 3.1 Crear usuario</w:t>
-      </w:r>
-    </w:p>
-    <w:p>
-      <w:pPr>
-        <w:spacing w:before="100" w:beforeAutospacing="1" w:after="100" w:afterAutospacing="1" w:line="240" w:lineRule="auto"/>
+          <w:bCs/>
+          <w:szCs w:val="28"/>
+        </w:rPr>
+        <w:t>🐧</w:t>
+      </w:r>
+      <w:r>
+        <w:rPr>
+          <w:rFonts w:eastAsia="Times New Roman" w:cstheme="minorHAnsi"/>
+          <w:bCs/>
+          <w:szCs w:val="28"/>
+          <w:lang w:val="es-EC"/>
+        </w:rPr>
+        <w:t xml:space="preserve"> Adaptación Linux</w:t>
+      </w:r>
+    </w:p>
+    <w:p>
+      <w:pPr>
+        <w:spacing w:after="0" w:line="240" w:lineRule="auto"/>
         <w:jc w:val="left"/>
         <w:outlineLvl w:val="1"/>
         <w:rPr>
-          <w:rFonts w:ascii="Times New Roman" w:eastAsia="Times New Roman" w:hAnsi="Times New Roman" w:cs="Times New Roman"/>
-          <w:b/>
+          <w:rFonts w:eastAsia="Times New Roman" w:cstheme="minorHAnsi"/>
           <w:bCs/>
           <w:szCs w:val="28"/>
           <w:lang w:val="es-EC"/>
@@ -1448,32 +2253,28 @@
       <w:r>
         <w:rPr>
           <w:rFonts w:ascii="Segoe UI Symbol" w:eastAsia="Times New Roman" w:hAnsi="Segoe UI Symbol" w:cs="Segoe UI Symbol"/>
-          <w:b/>
-          <w:bCs/>
-          <w:szCs w:val="28"/>
-          <w:lang w:val="es-EC"/>
-        </w:rPr>
-        <w:t>✏</w:t>
-      </w:r>
-      <w:r>
-        <w:rPr>
-          <w:rFonts w:ascii="Times New Roman" w:eastAsia="Times New Roman" w:hAnsi="Times New Roman" w:cs="Times New Roman"/>
-          <w:b/>
-          <w:bCs/>
-          <w:szCs w:val="28"/>
-          <w:lang w:val="es-EC"/>
-        </w:rPr>
-        <w:t xml:space="preserve"> 3.2 Editar usuario</w:t>
-      </w:r>
-    </w:p>
-    <w:p>
-      <w:pPr>
-        <w:spacing w:before="100" w:beforeAutospacing="1" w:after="100" w:afterAutospacing="1" w:line="240" w:lineRule="auto"/>
+          <w:bCs/>
+          <w:szCs w:val="28"/>
+        </w:rPr>
+        <w:t>🗂</w:t>
+      </w:r>
+      <w:r>
+        <w:rPr>
+          <w:rFonts w:eastAsia="Times New Roman" w:cstheme="minorHAnsi"/>
+          <w:bCs/>
+          <w:szCs w:val="28"/>
+          <w:lang w:val="es-EC"/>
+        </w:rPr>
+        <w:t xml:space="preserve"> Permisos de carpetas</w:t>
+      </w:r>
+    </w:p>
+    <w:p>
+      <w:pPr>
+        <w:spacing w:after="0" w:line="240" w:lineRule="auto"/>
         <w:jc w:val="left"/>
         <w:outlineLvl w:val="1"/>
         <w:rPr>
-          <w:rFonts w:ascii="Times New Roman" w:eastAsia="Times New Roman" w:hAnsi="Times New Roman" w:cs="Times New Roman"/>
-          <w:b/>
+          <w:rFonts w:eastAsia="Times New Roman" w:cstheme="minorHAnsi"/>
           <w:bCs/>
           <w:szCs w:val="28"/>
           <w:lang w:val="es-EC"/>
@@ -1482,1122 +2283,99 @@
       <w:r>
         <w:rPr>
           <w:rFonts w:ascii="Segoe UI Symbol" w:eastAsia="Times New Roman" w:hAnsi="Segoe UI Symbol" w:cs="Segoe UI Symbol"/>
-          <w:b/>
-          <w:bCs/>
-          <w:szCs w:val="28"/>
-          <w:lang w:val="es-EC"/>
-        </w:rPr>
-        <w:t>❌</w:t>
-      </w:r>
-      <w:r>
-        <w:rPr>
-          <w:rFonts w:ascii="Times New Roman" w:eastAsia="Times New Roman" w:hAnsi="Times New Roman" w:cs="Times New Roman"/>
-          <w:b/>
-          <w:bCs/>
-          <w:szCs w:val="28"/>
-          <w:lang w:val="es-EC"/>
-        </w:rPr>
-        <w:t xml:space="preserve"> 3.3 Activar / Desactivar</w:t>
-      </w:r>
-    </w:p>
-    <w:p>
-      <w:pPr>
-        <w:spacing w:before="100" w:beforeAutospacing="1" w:after="100" w:afterAutospacing="1" w:line="240" w:lineRule="auto"/>
+          <w:bCs/>
+          <w:szCs w:val="28"/>
+        </w:rPr>
+        <w:t>🌐</w:t>
+      </w:r>
+      <w:r>
+        <w:rPr>
+          <w:rFonts w:eastAsia="Times New Roman" w:cstheme="minorHAnsi"/>
+          <w:bCs/>
+          <w:szCs w:val="28"/>
+          <w:lang w:val="es-EC"/>
+        </w:rPr>
+        <w:t xml:space="preserve"> </w:t>
+      </w:r>
+      <w:proofErr w:type="spellStart"/>
+      <w:r>
+        <w:rPr>
+          <w:rFonts w:eastAsia="Times New Roman" w:cstheme="minorHAnsi"/>
+          <w:bCs/>
+          <w:szCs w:val="28"/>
+          <w:lang w:val="es-EC"/>
+        </w:rPr>
+        <w:t>Deploy</w:t>
+      </w:r>
+      <w:proofErr w:type="spellEnd"/>
+    </w:p>
+    <w:p>
+      <w:pPr>
+        <w:spacing w:after="0" w:line="240" w:lineRule="auto"/>
         <w:jc w:val="left"/>
         <w:outlineLvl w:val="1"/>
         <w:rPr>
-          <w:rFonts w:ascii="Times New Roman" w:eastAsia="Times New Roman" w:hAnsi="Times New Roman" w:cs="Times New Roman"/>
-          <w:b/>
-          <w:bCs/>
-          <w:szCs w:val="28"/>
-          <w:lang w:val="es-EC"/>
+          <w:rFonts w:eastAsia="Times New Roman" w:cstheme="minorHAnsi"/>
+          <w:bCs/>
+          <w:szCs w:val="28"/>
         </w:rPr>
       </w:pPr>
       <w:r>
         <w:rPr>
           <w:rFonts w:ascii="Segoe UI Symbol" w:eastAsia="Times New Roman" w:hAnsi="Segoe UI Symbol" w:cs="Segoe UI Symbol"/>
-          <w:b/>
-          <w:bCs/>
-          <w:szCs w:val="28"/>
-        </w:rPr>
-        <w:t>🔑</w:t>
-      </w:r>
-      <w:r>
-        <w:rPr>
-          <w:rFonts w:ascii="Times New Roman" w:eastAsia="Times New Roman" w:hAnsi="Times New Roman" w:cs="Times New Roman"/>
-          <w:b/>
-          <w:bCs/>
-          <w:szCs w:val="28"/>
-          <w:lang w:val="es-EC"/>
-        </w:rPr>
-        <w:t xml:space="preserve"> 3.4 Resetear contraseña</w:t>
-      </w:r>
-    </w:p>
-    <w:p>
-      <w:pPr>
-        <w:spacing w:before="100" w:beforeAutospacing="1" w:after="100" w:afterAutospacing="1" w:line="240" w:lineRule="auto"/>
-        <w:jc w:val="left"/>
-        <w:outlineLvl w:val="1"/>
-        <w:rPr>
-          <w:rFonts w:ascii="Times New Roman" w:eastAsia="Times New Roman" w:hAnsi="Times New Roman" w:cs="Times New Roman"/>
-          <w:b/>
-          <w:bCs/>
-          <w:szCs w:val="28"/>
-          <w:lang w:val="es-EC"/>
-        </w:rPr>
-      </w:pPr>
-      <w:r>
-        <w:rPr>
-          <w:rFonts w:ascii="Times New Roman" w:eastAsia="Times New Roman" w:hAnsi="Times New Roman" w:cs="Times New Roman"/>
-          <w:b/>
-          <w:bCs/>
-          <w:szCs w:val="28"/>
-        </w:rPr>
-        <w:t>🧪</w:t>
-      </w:r>
-      <w:r>
-        <w:rPr>
-          <w:rFonts w:ascii="Times New Roman" w:eastAsia="Times New Roman" w:hAnsi="Times New Roman" w:cs="Times New Roman"/>
-          <w:b/>
-          <w:bCs/>
-          <w:szCs w:val="28"/>
-          <w:lang w:val="es-EC"/>
-        </w:rPr>
-        <w:t xml:space="preserve"> 3.5 Validaciones </w:t>
+          <w:bCs/>
+          <w:szCs w:val="28"/>
+        </w:rPr>
+        <w:t>🔒</w:t>
+      </w:r>
+      <w:r>
+        <w:rPr>
+          <w:rFonts w:eastAsia="Times New Roman" w:cstheme="minorHAnsi"/>
+          <w:bCs/>
+          <w:szCs w:val="28"/>
+        </w:rPr>
+        <w:t xml:space="preserve"> </w:t>
       </w:r>
       <w:proofErr w:type="spellStart"/>
       <w:r>
         <w:rPr>
-          <w:rFonts w:ascii="Times New Roman" w:eastAsia="Times New Roman" w:hAnsi="Times New Roman" w:cs="Times New Roman"/>
-          <w:b/>
-          <w:bCs/>
-          <w:szCs w:val="28"/>
-          <w:lang w:val="es-EC"/>
-        </w:rPr>
-        <w:t>backend</w:t>
+          <w:rFonts w:eastAsia="Times New Roman" w:cstheme="minorHAnsi"/>
+          <w:bCs/>
+          <w:szCs w:val="28"/>
+        </w:rPr>
+        <w:t>Configuración</w:t>
       </w:r>
       <w:proofErr w:type="spellEnd"/>
       <w:r>
         <w:rPr>
-          <w:rFonts w:ascii="Times New Roman" w:eastAsia="Times New Roman" w:hAnsi="Times New Roman" w:cs="Times New Roman"/>
-          <w:b/>
-          <w:bCs/>
-          <w:szCs w:val="28"/>
-          <w:lang w:val="es-EC"/>
-        </w:rPr>
-        <w:t xml:space="preserve"> robustas</w:t>
-      </w:r>
-    </w:p>
-    <w:p>
-      <w:pPr>
-        <w:spacing w:before="100" w:beforeAutospacing="1" w:after="100" w:afterAutospacing="1" w:line="240" w:lineRule="auto"/>
-        <w:jc w:val="left"/>
-        <w:rPr>
-          <w:rFonts w:ascii="Times New Roman" w:eastAsia="Times New Roman" w:hAnsi="Times New Roman" w:cs="Times New Roman"/>
-          <w:szCs w:val="28"/>
-          <w:lang w:val="es-EC"/>
-        </w:rPr>
-      </w:pPr>
-      <w:r>
-        <w:rPr>
-          <w:rFonts w:ascii="Segoe UI Symbol" w:eastAsia="Times New Roman" w:hAnsi="Segoe UI Symbol" w:cs="Segoe UI Symbol"/>
-          <w:szCs w:val="28"/>
-        </w:rPr>
-        <w:t>🎯</w:t>
-      </w:r>
-      <w:r>
-        <w:rPr>
-          <w:rFonts w:ascii="Times New Roman" w:eastAsia="Times New Roman" w:hAnsi="Times New Roman" w:cs="Times New Roman"/>
-          <w:szCs w:val="28"/>
-          <w:lang w:val="es-EC"/>
-        </w:rPr>
-        <w:t xml:space="preserve"> Resultado: módulo </w:t>
+          <w:rFonts w:eastAsia="Times New Roman" w:cstheme="minorHAnsi"/>
+          <w:bCs/>
+          <w:szCs w:val="28"/>
+        </w:rPr>
+        <w:t xml:space="preserve"> </w:t>
       </w:r>
       <w:proofErr w:type="spellStart"/>
       <w:r>
         <w:rPr>
-          <w:rFonts w:ascii="Times New Roman" w:eastAsia="Times New Roman" w:hAnsi="Times New Roman" w:cs="Times New Roman"/>
-          <w:szCs w:val="28"/>
-          <w:lang w:val="es-EC"/>
-        </w:rPr>
-        <w:t>admin</w:t>
+          <w:rFonts w:eastAsia="Times New Roman" w:cstheme="minorHAnsi"/>
+          <w:bCs/>
+          <w:szCs w:val="28"/>
+        </w:rPr>
+        <w:t>segura</w:t>
       </w:r>
       <w:proofErr w:type="spellEnd"/>
-      <w:r>
-        <w:rPr>
-          <w:rFonts w:ascii="Times New Roman" w:eastAsia="Times New Roman" w:hAnsi="Times New Roman" w:cs="Times New Roman"/>
-          <w:szCs w:val="28"/>
-          <w:lang w:val="es-EC"/>
-        </w:rPr>
-        <w:t xml:space="preserve"> completo.</w:t>
-      </w:r>
-    </w:p>
-    <w:p>
-      <w:pPr>
-        <w:spacing w:after="0" w:line="240" w:lineRule="auto"/>
-        <w:jc w:val="left"/>
-        <w:rPr>
-          <w:rFonts w:ascii="Times New Roman" w:eastAsia="Times New Roman" w:hAnsi="Times New Roman" w:cs="Times New Roman"/>
-          <w:szCs w:val="28"/>
-        </w:rPr>
-      </w:pPr>
-      <w:r>
-        <w:rPr>
-          <w:rFonts w:ascii="Times New Roman" w:eastAsia="Times New Roman" w:hAnsi="Times New Roman" w:cs="Times New Roman"/>
-          <w:szCs w:val="28"/>
-        </w:rPr>
-        <w:pict>
-          <v:rect id="_x0000_i1028" style="width:0;height:1.5pt" o:hralign="center" o:hrstd="t" o:hr="t" fillcolor="#a0a0a0" stroked="f"/>
-        </w:pict>
-      </w:r>
-    </w:p>
-    <w:p>
-      <w:pPr>
-        <w:spacing w:before="100" w:beforeAutospacing="1" w:after="100" w:afterAutospacing="1" w:line="240" w:lineRule="auto"/>
-        <w:jc w:val="left"/>
-        <w:outlineLvl w:val="0"/>
-        <w:rPr>
-          <w:rFonts w:ascii="Times New Roman" w:eastAsia="Times New Roman" w:hAnsi="Times New Roman" w:cs="Times New Roman"/>
-          <w:b/>
-          <w:bCs/>
-          <w:kern w:val="36"/>
-          <w:szCs w:val="28"/>
-          <w:lang w:val="es-EC"/>
-        </w:rPr>
-      </w:pPr>
-      <w:r>
-        <w:rPr>
-          <w:rFonts w:ascii="Segoe UI Symbol" w:eastAsia="Times New Roman" w:hAnsi="Segoe UI Symbol" w:cs="Segoe UI Symbol"/>
-          <w:b/>
-          <w:bCs/>
-          <w:kern w:val="36"/>
-          <w:szCs w:val="28"/>
-        </w:rPr>
-        <w:t>🔵</w:t>
-      </w:r>
-      <w:r>
-        <w:rPr>
-          <w:rFonts w:ascii="Times New Roman" w:eastAsia="Times New Roman" w:hAnsi="Times New Roman" w:cs="Times New Roman"/>
-          <w:b/>
-          <w:bCs/>
-          <w:kern w:val="36"/>
-          <w:szCs w:val="28"/>
-          <w:lang w:val="es-EC"/>
-        </w:rPr>
-        <w:t xml:space="preserve"> SPRINT 4 — Módulo Clínica</w:t>
-      </w:r>
-    </w:p>
-    <w:p>
-      <w:pPr>
-        <w:spacing w:before="100" w:beforeAutospacing="1" w:after="100" w:afterAutospacing="1" w:line="240" w:lineRule="auto"/>
-        <w:jc w:val="left"/>
-        <w:outlineLvl w:val="1"/>
-        <w:rPr>
-          <w:rFonts w:ascii="Times New Roman" w:eastAsia="Times New Roman" w:hAnsi="Times New Roman" w:cs="Times New Roman"/>
-          <w:b/>
-          <w:bCs/>
-          <w:szCs w:val="28"/>
-          <w:lang w:val="es-EC"/>
-        </w:rPr>
-      </w:pPr>
-      <w:r>
-        <w:rPr>
-          <w:rFonts w:ascii="Segoe UI Symbol" w:eastAsia="Times New Roman" w:hAnsi="Segoe UI Symbol" w:cs="Segoe UI Symbol"/>
-          <w:b/>
-          <w:bCs/>
-          <w:szCs w:val="28"/>
-        </w:rPr>
-        <w:t>🐶</w:t>
-      </w:r>
-      <w:r>
-        <w:rPr>
-          <w:rFonts w:ascii="Times New Roman" w:eastAsia="Times New Roman" w:hAnsi="Times New Roman" w:cs="Times New Roman"/>
-          <w:b/>
-          <w:bCs/>
-          <w:szCs w:val="28"/>
-          <w:lang w:val="es-EC"/>
-        </w:rPr>
-        <w:t xml:space="preserve"> Mascotas</w:t>
-      </w:r>
-    </w:p>
-    <w:p>
-      <w:pPr>
-        <w:spacing w:before="100" w:beforeAutospacing="1" w:after="100" w:afterAutospacing="1" w:line="240" w:lineRule="auto"/>
-        <w:jc w:val="left"/>
-        <w:outlineLvl w:val="1"/>
-        <w:rPr>
-          <w:rFonts w:ascii="Times New Roman" w:eastAsia="Times New Roman" w:hAnsi="Times New Roman" w:cs="Times New Roman"/>
-          <w:b/>
-          <w:bCs/>
-          <w:szCs w:val="28"/>
-          <w:lang w:val="es-EC"/>
-        </w:rPr>
-      </w:pPr>
-      <w:r>
-        <w:rPr>
-          <w:rFonts w:ascii="Segoe UI Symbol" w:eastAsia="Times New Roman" w:hAnsi="Segoe UI Symbol" w:cs="Segoe UI Symbol"/>
-          <w:b/>
-          <w:bCs/>
-          <w:szCs w:val="28"/>
-        </w:rPr>
-        <w:t>👩</w:t>
-      </w:r>
-      <w:r>
-        <w:rPr>
-          <w:rFonts w:ascii="Times New Roman" w:eastAsia="Times New Roman" w:hAnsi="Times New Roman" w:cs="Times New Roman"/>
-          <w:b/>
-          <w:bCs/>
-          <w:szCs w:val="28"/>
-          <w:lang w:val="es-EC"/>
-        </w:rPr>
-        <w:t>‍</w:t>
-      </w:r>
-      <w:r>
-        <w:rPr>
-          <w:rFonts w:ascii="Segoe UI Symbol" w:eastAsia="Times New Roman" w:hAnsi="Segoe UI Symbol" w:cs="Segoe UI Symbol"/>
-          <w:b/>
-          <w:bCs/>
-          <w:szCs w:val="28"/>
-          <w:lang w:val="es-EC"/>
-        </w:rPr>
-        <w:t>⚕</w:t>
-      </w:r>
-      <w:r>
-        <w:rPr>
-          <w:rFonts w:ascii="Segoe UI Symbol" w:eastAsia="Times New Roman" w:hAnsi="Segoe UI Symbol" w:cs="Segoe UI Symbol"/>
-          <w:b/>
-          <w:bCs/>
-          <w:szCs w:val="28"/>
-        </w:rPr>
-        <w:t>️</w:t>
-      </w:r>
-      <w:r>
-        <w:rPr>
-          <w:rFonts w:ascii="Times New Roman" w:eastAsia="Times New Roman" w:hAnsi="Times New Roman" w:cs="Times New Roman"/>
-          <w:b/>
-          <w:bCs/>
-          <w:szCs w:val="28"/>
-          <w:lang w:val="es-EC"/>
-        </w:rPr>
-        <w:t xml:space="preserve"> Consultas</w:t>
-      </w:r>
-    </w:p>
-    <w:p>
-      <w:pPr>
-        <w:spacing w:before="100" w:beforeAutospacing="1" w:after="100" w:afterAutospacing="1" w:line="240" w:lineRule="auto"/>
-        <w:jc w:val="left"/>
-        <w:outlineLvl w:val="1"/>
-        <w:rPr>
-          <w:rFonts w:ascii="Times New Roman" w:eastAsia="Times New Roman" w:hAnsi="Times New Roman" w:cs="Times New Roman"/>
-          <w:b/>
-          <w:bCs/>
-          <w:szCs w:val="28"/>
-          <w:lang w:val="es-EC"/>
-        </w:rPr>
-      </w:pPr>
-      <w:r>
-        <w:rPr>
-          <w:rFonts w:ascii="Segoe UI Symbol" w:eastAsia="Times New Roman" w:hAnsi="Segoe UI Symbol" w:cs="Segoe UI Symbol"/>
-          <w:b/>
-          <w:bCs/>
-          <w:szCs w:val="28"/>
-        </w:rPr>
-        <w:t>💉</w:t>
-      </w:r>
-      <w:r>
-        <w:rPr>
-          <w:rFonts w:ascii="Times New Roman" w:eastAsia="Times New Roman" w:hAnsi="Times New Roman" w:cs="Times New Roman"/>
-          <w:b/>
-          <w:bCs/>
-          <w:szCs w:val="28"/>
-          <w:lang w:val="es-EC"/>
-        </w:rPr>
-        <w:t xml:space="preserve"> Vacunas</w:t>
-      </w:r>
-    </w:p>
-    <w:p>
-      <w:pPr>
-        <w:spacing w:before="100" w:beforeAutospacing="1" w:after="100" w:afterAutospacing="1" w:line="240" w:lineRule="auto"/>
-        <w:jc w:val="left"/>
-        <w:outlineLvl w:val="1"/>
-        <w:rPr>
-          <w:rFonts w:ascii="Times New Roman" w:eastAsia="Times New Roman" w:hAnsi="Times New Roman" w:cs="Times New Roman"/>
-          <w:b/>
-          <w:bCs/>
-          <w:szCs w:val="28"/>
-          <w:lang w:val="es-EC"/>
-        </w:rPr>
-      </w:pPr>
-      <w:r>
-        <w:rPr>
-          <w:rFonts w:ascii="Segoe UI Symbol" w:eastAsia="Times New Roman" w:hAnsi="Segoe UI Symbol" w:cs="Segoe UI Symbol"/>
-          <w:b/>
-          <w:bCs/>
-          <w:szCs w:val="28"/>
-        </w:rPr>
-        <w:t>📅</w:t>
-      </w:r>
-      <w:r>
-        <w:rPr>
-          <w:rFonts w:ascii="Times New Roman" w:eastAsia="Times New Roman" w:hAnsi="Times New Roman" w:cs="Times New Roman"/>
-          <w:b/>
-          <w:bCs/>
-          <w:szCs w:val="28"/>
-          <w:lang w:val="es-EC"/>
-        </w:rPr>
-        <w:t xml:space="preserve"> Recordatorios automáticos</w:t>
-      </w:r>
-    </w:p>
-    <w:p>
-      <w:pPr>
-        <w:spacing w:after="0" w:line="240" w:lineRule="auto"/>
-        <w:jc w:val="left"/>
-        <w:rPr>
-          <w:rFonts w:ascii="Times New Roman" w:eastAsia="Times New Roman" w:hAnsi="Times New Roman" w:cs="Times New Roman"/>
-          <w:szCs w:val="28"/>
-        </w:rPr>
-      </w:pPr>
-      <w:r>
-        <w:rPr>
-          <w:rFonts w:ascii="Times New Roman" w:eastAsia="Times New Roman" w:hAnsi="Times New Roman" w:cs="Times New Roman"/>
-          <w:szCs w:val="28"/>
-        </w:rPr>
-        <w:pict>
-          <v:rect id="_x0000_i1029" style="width:0;height:1.5pt" o:hralign="center" o:hrstd="t" o:hr="t" fillcolor="#a0a0a0" stroked="f"/>
-        </w:pict>
-      </w:r>
-    </w:p>
-    <w:p>
-      <w:pPr>
-        <w:spacing w:before="100" w:beforeAutospacing="1" w:after="100" w:afterAutospacing="1" w:line="240" w:lineRule="auto"/>
-        <w:jc w:val="left"/>
-        <w:outlineLvl w:val="0"/>
-        <w:rPr>
-          <w:rFonts w:ascii="Times New Roman" w:eastAsia="Times New Roman" w:hAnsi="Times New Roman" w:cs="Times New Roman"/>
-          <w:b/>
-          <w:bCs/>
-          <w:kern w:val="36"/>
-          <w:szCs w:val="28"/>
-        </w:rPr>
-      </w:pPr>
-      <w:r>
-        <w:rPr>
-          <w:rFonts w:ascii="Segoe UI Symbol" w:eastAsia="Times New Roman" w:hAnsi="Segoe UI Symbol" w:cs="Segoe UI Symbol"/>
-          <w:b/>
-          <w:bCs/>
-          <w:kern w:val="36"/>
-          <w:szCs w:val="28"/>
-        </w:rPr>
-        <w:t>🔵</w:t>
-      </w:r>
-      <w:r>
-        <w:rPr>
-          <w:rFonts w:ascii="Times New Roman" w:eastAsia="Times New Roman" w:hAnsi="Times New Roman" w:cs="Times New Roman"/>
-          <w:b/>
-          <w:bCs/>
-          <w:kern w:val="36"/>
-          <w:szCs w:val="28"/>
-        </w:rPr>
-        <w:t xml:space="preserve"> SPRINT 5 — </w:t>
-      </w:r>
-      <w:proofErr w:type="spellStart"/>
-      <w:r>
-        <w:rPr>
-          <w:rFonts w:ascii="Times New Roman" w:eastAsia="Times New Roman" w:hAnsi="Times New Roman" w:cs="Times New Roman"/>
-          <w:b/>
-          <w:bCs/>
-          <w:kern w:val="36"/>
-          <w:szCs w:val="28"/>
-        </w:rPr>
-        <w:t>Módulo</w:t>
-      </w:r>
-      <w:proofErr w:type="spellEnd"/>
-      <w:r>
-        <w:rPr>
-          <w:rFonts w:ascii="Times New Roman" w:eastAsia="Times New Roman" w:hAnsi="Times New Roman" w:cs="Times New Roman"/>
-          <w:b/>
-          <w:bCs/>
-          <w:kern w:val="36"/>
-          <w:szCs w:val="28"/>
-        </w:rPr>
-        <w:t xml:space="preserve"> </w:t>
-      </w:r>
-      <w:proofErr w:type="spellStart"/>
-      <w:r>
-        <w:rPr>
-          <w:rFonts w:ascii="Times New Roman" w:eastAsia="Times New Roman" w:hAnsi="Times New Roman" w:cs="Times New Roman"/>
-          <w:b/>
-          <w:bCs/>
-          <w:kern w:val="36"/>
-          <w:szCs w:val="28"/>
-        </w:rPr>
-        <w:t>Farmacia</w:t>
-      </w:r>
-      <w:proofErr w:type="spellEnd"/>
-    </w:p>
-    <w:p>
-      <w:pPr>
-        <w:spacing w:before="100" w:beforeAutospacing="1" w:after="100" w:afterAutospacing="1" w:line="240" w:lineRule="auto"/>
-        <w:jc w:val="left"/>
-        <w:outlineLvl w:val="1"/>
-        <w:rPr>
-          <w:rFonts w:ascii="Times New Roman" w:eastAsia="Times New Roman" w:hAnsi="Times New Roman" w:cs="Times New Roman"/>
-          <w:b/>
-          <w:bCs/>
-          <w:szCs w:val="28"/>
-        </w:rPr>
-      </w:pPr>
-      <w:r>
-        <w:rPr>
-          <w:rFonts w:ascii="Segoe UI Symbol" w:eastAsia="Times New Roman" w:hAnsi="Segoe UI Symbol" w:cs="Segoe UI Symbol"/>
-          <w:b/>
-          <w:bCs/>
-          <w:szCs w:val="28"/>
-        </w:rPr>
-        <w:t>💊</w:t>
-      </w:r>
-      <w:r>
-        <w:rPr>
-          <w:rFonts w:ascii="Times New Roman" w:eastAsia="Times New Roman" w:hAnsi="Times New Roman" w:cs="Times New Roman"/>
-          <w:b/>
-          <w:bCs/>
-          <w:szCs w:val="28"/>
-        </w:rPr>
-        <w:t xml:space="preserve"> </w:t>
-      </w:r>
-      <w:proofErr w:type="spellStart"/>
-      <w:r>
-        <w:rPr>
-          <w:rFonts w:ascii="Times New Roman" w:eastAsia="Times New Roman" w:hAnsi="Times New Roman" w:cs="Times New Roman"/>
-          <w:b/>
-          <w:bCs/>
-          <w:szCs w:val="28"/>
-        </w:rPr>
-        <w:t>Medicamentos</w:t>
-      </w:r>
-      <w:proofErr w:type="spellEnd"/>
-    </w:p>
-    <w:p>
-      <w:pPr>
-        <w:spacing w:before="100" w:beforeAutospacing="1" w:after="100" w:afterAutospacing="1" w:line="240" w:lineRule="auto"/>
-        <w:jc w:val="left"/>
-        <w:outlineLvl w:val="1"/>
-        <w:rPr>
-          <w:rFonts w:ascii="Times New Roman" w:eastAsia="Times New Roman" w:hAnsi="Times New Roman" w:cs="Times New Roman"/>
-          <w:b/>
-          <w:bCs/>
-          <w:szCs w:val="28"/>
-        </w:rPr>
-      </w:pPr>
-      <w:r>
-        <w:rPr>
-          <w:rFonts w:ascii="Segoe UI Symbol" w:eastAsia="Times New Roman" w:hAnsi="Segoe UI Symbol" w:cs="Segoe UI Symbol"/>
-          <w:b/>
-          <w:bCs/>
-          <w:szCs w:val="28"/>
-        </w:rPr>
-        <w:t>🛒</w:t>
-      </w:r>
-      <w:r>
-        <w:rPr>
-          <w:rFonts w:ascii="Times New Roman" w:eastAsia="Times New Roman" w:hAnsi="Times New Roman" w:cs="Times New Roman"/>
-          <w:b/>
-          <w:bCs/>
-          <w:szCs w:val="28"/>
-        </w:rPr>
-        <w:t xml:space="preserve"> Ventas</w:t>
-      </w:r>
-    </w:p>
-    <w:p>
-      <w:pPr>
-        <w:spacing w:before="100" w:beforeAutospacing="1" w:after="100" w:afterAutospacing="1" w:line="240" w:lineRule="auto"/>
-        <w:jc w:val="left"/>
-        <w:outlineLvl w:val="1"/>
-        <w:rPr>
-          <w:rFonts w:ascii="Times New Roman" w:eastAsia="Times New Roman" w:hAnsi="Times New Roman" w:cs="Times New Roman"/>
-          <w:b/>
-          <w:bCs/>
-          <w:szCs w:val="28"/>
-          <w:lang w:val="es-EC"/>
-        </w:rPr>
-      </w:pPr>
-      <w:r>
-        <w:rPr>
-          <w:rFonts w:ascii="Segoe UI Symbol" w:eastAsia="Times New Roman" w:hAnsi="Segoe UI Symbol" w:cs="Segoe UI Symbol"/>
-          <w:b/>
-          <w:bCs/>
-          <w:szCs w:val="28"/>
-        </w:rPr>
-        <w:t>📊</w:t>
-      </w:r>
-      <w:r>
-        <w:rPr>
-          <w:rFonts w:ascii="Times New Roman" w:eastAsia="Times New Roman" w:hAnsi="Times New Roman" w:cs="Times New Roman"/>
-          <w:b/>
-          <w:bCs/>
-          <w:szCs w:val="28"/>
-          <w:lang w:val="es-EC"/>
-        </w:rPr>
-        <w:t xml:space="preserve"> Stock dinámico</w:t>
-      </w:r>
-    </w:p>
-    <w:p>
-      <w:pPr>
-        <w:spacing w:before="100" w:beforeAutospacing="1" w:after="100" w:afterAutospacing="1" w:line="240" w:lineRule="auto"/>
-        <w:jc w:val="left"/>
-        <w:outlineLvl w:val="1"/>
-        <w:rPr>
-          <w:rFonts w:ascii="Times New Roman" w:eastAsia="Times New Roman" w:hAnsi="Times New Roman" w:cs="Times New Roman"/>
-          <w:b/>
-          <w:bCs/>
-          <w:szCs w:val="28"/>
-          <w:lang w:val="es-EC"/>
-        </w:rPr>
-      </w:pPr>
-      <w:r>
-        <w:rPr>
-          <w:rFonts w:ascii="Segoe UI Symbol" w:eastAsia="Times New Roman" w:hAnsi="Segoe UI Symbol" w:cs="Segoe UI Symbol"/>
-          <w:b/>
-          <w:bCs/>
-          <w:szCs w:val="28"/>
-        </w:rPr>
-        <w:t>📈</w:t>
-      </w:r>
-      <w:r>
-        <w:rPr>
-          <w:rFonts w:ascii="Times New Roman" w:eastAsia="Times New Roman" w:hAnsi="Times New Roman" w:cs="Times New Roman"/>
-          <w:b/>
-          <w:bCs/>
-          <w:szCs w:val="28"/>
-          <w:lang w:val="es-EC"/>
-        </w:rPr>
-        <w:t xml:space="preserve"> Reportes básicos</w:t>
-      </w:r>
-    </w:p>
-    <w:p>
-      <w:pPr>
-        <w:spacing w:after="0" w:line="240" w:lineRule="auto"/>
-        <w:jc w:val="left"/>
-        <w:rPr>
-          <w:rFonts w:ascii="Times New Roman" w:eastAsia="Times New Roman" w:hAnsi="Times New Roman" w:cs="Times New Roman"/>
-          <w:szCs w:val="28"/>
-        </w:rPr>
-      </w:pPr>
-      <w:r>
-        <w:rPr>
-          <w:rFonts w:ascii="Times New Roman" w:eastAsia="Times New Roman" w:hAnsi="Times New Roman" w:cs="Times New Roman"/>
-          <w:szCs w:val="28"/>
-        </w:rPr>
-        <w:pict>
-          <v:rect id="_x0000_i1030" style="width:0;height:1.5pt" o:hralign="center" o:hrstd="t" o:hr="t" fillcolor="#a0a0a0" stroked="f"/>
-        </w:pict>
-      </w:r>
-    </w:p>
-    <w:p>
-      <w:pPr>
-        <w:spacing w:before="100" w:beforeAutospacing="1" w:after="100" w:afterAutospacing="1" w:line="240" w:lineRule="auto"/>
-        <w:jc w:val="left"/>
-        <w:outlineLvl w:val="0"/>
-        <w:rPr>
-          <w:rFonts w:ascii="Times New Roman" w:eastAsia="Times New Roman" w:hAnsi="Times New Roman" w:cs="Times New Roman"/>
-          <w:b/>
-          <w:bCs/>
-          <w:kern w:val="36"/>
-          <w:szCs w:val="28"/>
-        </w:rPr>
-      </w:pPr>
-      <w:r>
-        <w:rPr>
-          <w:rFonts w:ascii="Segoe UI Symbol" w:eastAsia="Times New Roman" w:hAnsi="Segoe UI Symbol" w:cs="Segoe UI Symbol"/>
-          <w:b/>
-          <w:bCs/>
-          <w:kern w:val="36"/>
-          <w:szCs w:val="28"/>
-        </w:rPr>
-        <w:t>🔵</w:t>
-      </w:r>
-      <w:r>
-        <w:rPr>
-          <w:rFonts w:ascii="Times New Roman" w:eastAsia="Times New Roman" w:hAnsi="Times New Roman" w:cs="Times New Roman"/>
-          <w:b/>
-          <w:bCs/>
-          <w:kern w:val="36"/>
-          <w:szCs w:val="28"/>
-        </w:rPr>
-        <w:t xml:space="preserve"> SPRINT 6 — </w:t>
-      </w:r>
-      <w:proofErr w:type="spellStart"/>
-      <w:r>
-        <w:rPr>
-          <w:rFonts w:ascii="Times New Roman" w:eastAsia="Times New Roman" w:hAnsi="Times New Roman" w:cs="Times New Roman"/>
-          <w:b/>
-          <w:bCs/>
-          <w:kern w:val="36"/>
-          <w:szCs w:val="28"/>
-        </w:rPr>
-        <w:t>Optimización</w:t>
-      </w:r>
-      <w:proofErr w:type="spellEnd"/>
-      <w:r>
-        <w:rPr>
-          <w:rFonts w:ascii="Times New Roman" w:eastAsia="Times New Roman" w:hAnsi="Times New Roman" w:cs="Times New Roman"/>
-          <w:b/>
-          <w:bCs/>
-          <w:kern w:val="36"/>
-          <w:szCs w:val="28"/>
-        </w:rPr>
-        <w:t xml:space="preserve"> </w:t>
-      </w:r>
-      <w:proofErr w:type="spellStart"/>
-      <w:r>
-        <w:rPr>
-          <w:rFonts w:ascii="Times New Roman" w:eastAsia="Times New Roman" w:hAnsi="Times New Roman" w:cs="Times New Roman"/>
-          <w:b/>
-          <w:bCs/>
-          <w:kern w:val="36"/>
-          <w:szCs w:val="28"/>
-        </w:rPr>
-        <w:t>Profesional</w:t>
-      </w:r>
-      <w:proofErr w:type="spellEnd"/>
-    </w:p>
-    <w:p>
-      <w:pPr>
-        <w:spacing w:before="100" w:beforeAutospacing="1" w:after="100" w:afterAutospacing="1" w:line="240" w:lineRule="auto"/>
-        <w:jc w:val="left"/>
-        <w:outlineLvl w:val="1"/>
-        <w:rPr>
-          <w:rFonts w:ascii="Times New Roman" w:eastAsia="Times New Roman" w:hAnsi="Times New Roman" w:cs="Times New Roman"/>
-          <w:b/>
-          <w:bCs/>
-          <w:szCs w:val="28"/>
-        </w:rPr>
-      </w:pPr>
-      <w:r>
-        <w:rPr>
-          <w:rFonts w:ascii="Segoe UI Symbol" w:eastAsia="Times New Roman" w:hAnsi="Segoe UI Symbol" w:cs="Segoe UI Symbol"/>
-          <w:b/>
-          <w:bCs/>
-          <w:szCs w:val="28"/>
-        </w:rPr>
-        <w:t>🔐</w:t>
-      </w:r>
-      <w:r>
-        <w:rPr>
-          <w:rFonts w:ascii="Times New Roman" w:eastAsia="Times New Roman" w:hAnsi="Times New Roman" w:cs="Times New Roman"/>
-          <w:b/>
-          <w:bCs/>
-          <w:szCs w:val="28"/>
-        </w:rPr>
-        <w:t xml:space="preserve"> </w:t>
-      </w:r>
-      <w:proofErr w:type="spellStart"/>
-      <w:r>
-        <w:rPr>
-          <w:rFonts w:ascii="Times New Roman" w:eastAsia="Times New Roman" w:hAnsi="Times New Roman" w:cs="Times New Roman"/>
-          <w:b/>
-          <w:bCs/>
-          <w:szCs w:val="28"/>
-        </w:rPr>
-        <w:t>CSRF</w:t>
-      </w:r>
-      <w:proofErr w:type="spellEnd"/>
-      <w:r>
-        <w:rPr>
-          <w:rFonts w:ascii="Times New Roman" w:eastAsia="Times New Roman" w:hAnsi="Times New Roman" w:cs="Times New Roman"/>
-          <w:b/>
-          <w:bCs/>
-          <w:szCs w:val="28"/>
-        </w:rPr>
-        <w:t xml:space="preserve"> tokens</w:t>
-      </w:r>
-    </w:p>
-    <w:p>
-      <w:pPr>
-        <w:spacing w:before="100" w:beforeAutospacing="1" w:after="100" w:afterAutospacing="1" w:line="240" w:lineRule="auto"/>
-        <w:jc w:val="left"/>
-        <w:outlineLvl w:val="1"/>
-        <w:rPr>
-          <w:rFonts w:ascii="Times New Roman" w:eastAsia="Times New Roman" w:hAnsi="Times New Roman" w:cs="Times New Roman"/>
-          <w:b/>
-          <w:bCs/>
-          <w:szCs w:val="28"/>
-        </w:rPr>
-      </w:pPr>
-      <w:r>
-        <w:rPr>
-          <w:rFonts w:ascii="Times New Roman" w:eastAsia="Times New Roman" w:hAnsi="Times New Roman" w:cs="Times New Roman"/>
-          <w:b/>
-          <w:bCs/>
-          <w:szCs w:val="28"/>
-        </w:rPr>
-        <w:t xml:space="preserve">🧂 Password hashing </w:t>
-      </w:r>
-      <w:proofErr w:type="spellStart"/>
-      <w:r>
-        <w:rPr>
-          <w:rFonts w:ascii="Times New Roman" w:eastAsia="Times New Roman" w:hAnsi="Times New Roman" w:cs="Times New Roman"/>
-          <w:b/>
-          <w:bCs/>
-          <w:szCs w:val="28"/>
-        </w:rPr>
-        <w:t>robusto</w:t>
-      </w:r>
-      <w:proofErr w:type="spellEnd"/>
-    </w:p>
-    <w:p>
-      <w:pPr>
-        <w:spacing w:before="100" w:beforeAutospacing="1" w:after="100" w:afterAutospacing="1" w:line="240" w:lineRule="auto"/>
-        <w:jc w:val="left"/>
-        <w:outlineLvl w:val="1"/>
-        <w:rPr>
-          <w:rFonts w:ascii="Times New Roman" w:eastAsia="Times New Roman" w:hAnsi="Times New Roman" w:cs="Times New Roman"/>
-          <w:b/>
-          <w:bCs/>
-          <w:szCs w:val="28"/>
-          <w:lang w:val="es-EC"/>
-        </w:rPr>
-      </w:pPr>
-      <w:r>
-        <w:rPr>
-          <w:rFonts w:ascii="Segoe UI Symbol" w:eastAsia="Times New Roman" w:hAnsi="Segoe UI Symbol" w:cs="Segoe UI Symbol"/>
-          <w:b/>
-          <w:bCs/>
-          <w:szCs w:val="28"/>
-        </w:rPr>
-        <w:lastRenderedPageBreak/>
-        <w:t>📦</w:t>
-      </w:r>
-      <w:r>
-        <w:rPr>
-          <w:rFonts w:ascii="Times New Roman" w:eastAsia="Times New Roman" w:hAnsi="Times New Roman" w:cs="Times New Roman"/>
-          <w:b/>
-          <w:bCs/>
-          <w:szCs w:val="28"/>
-          <w:lang w:val="es-EC"/>
-        </w:rPr>
-        <w:t xml:space="preserve"> Servicios</w:t>
-      </w:r>
-    </w:p>
-    <w:p>
-      <w:pPr>
-        <w:spacing w:before="100" w:beforeAutospacing="1" w:after="100" w:afterAutospacing="1" w:line="240" w:lineRule="auto"/>
-        <w:jc w:val="left"/>
-        <w:outlineLvl w:val="1"/>
-        <w:rPr>
-          <w:rFonts w:ascii="Times New Roman" w:eastAsia="Times New Roman" w:hAnsi="Times New Roman" w:cs="Times New Roman"/>
-          <w:b/>
-          <w:bCs/>
-          <w:szCs w:val="28"/>
-          <w:lang w:val="es-EC"/>
-        </w:rPr>
-      </w:pPr>
-      <w:r>
-        <w:rPr>
-          <w:rFonts w:ascii="Times New Roman" w:eastAsia="Times New Roman" w:hAnsi="Times New Roman" w:cs="Times New Roman"/>
-          <w:b/>
-          <w:bCs/>
-          <w:szCs w:val="28"/>
-        </w:rPr>
-        <w:t>🧪</w:t>
-      </w:r>
-      <w:r>
-        <w:rPr>
-          <w:rFonts w:ascii="Times New Roman" w:eastAsia="Times New Roman" w:hAnsi="Times New Roman" w:cs="Times New Roman"/>
-          <w:b/>
-          <w:bCs/>
-          <w:szCs w:val="28"/>
-          <w:lang w:val="es-EC"/>
-        </w:rPr>
-        <w:t xml:space="preserve"> </w:t>
-      </w:r>
-      <w:proofErr w:type="spellStart"/>
-      <w:proofErr w:type="gramStart"/>
-      <w:r>
-        <w:rPr>
-          <w:rFonts w:ascii="Times New Roman" w:eastAsia="Times New Roman" w:hAnsi="Times New Roman" w:cs="Times New Roman"/>
-          <w:b/>
-          <w:bCs/>
-          <w:szCs w:val="28"/>
-          <w:lang w:val="es-EC"/>
-        </w:rPr>
-        <w:t>Testing</w:t>
-      </w:r>
-      <w:proofErr w:type="spellEnd"/>
-      <w:proofErr w:type="gramEnd"/>
-      <w:r>
-        <w:rPr>
-          <w:rFonts w:ascii="Times New Roman" w:eastAsia="Times New Roman" w:hAnsi="Times New Roman" w:cs="Times New Roman"/>
-          <w:b/>
-          <w:bCs/>
-          <w:szCs w:val="28"/>
-          <w:lang w:val="es-EC"/>
-        </w:rPr>
-        <w:t xml:space="preserve"> manual estructurado</w:t>
-      </w:r>
-    </w:p>
-    <w:p>
-      <w:pPr>
-        <w:spacing w:before="100" w:beforeAutospacing="1" w:after="100" w:afterAutospacing="1" w:line="240" w:lineRule="auto"/>
-        <w:jc w:val="left"/>
-        <w:outlineLvl w:val="1"/>
-        <w:rPr>
-          <w:rFonts w:ascii="Times New Roman" w:eastAsia="Times New Roman" w:hAnsi="Times New Roman" w:cs="Times New Roman"/>
-          <w:b/>
-          <w:bCs/>
-          <w:szCs w:val="28"/>
-        </w:rPr>
-      </w:pPr>
-      <w:r>
-        <w:rPr>
-          <w:rFonts w:ascii="Times New Roman" w:eastAsia="Times New Roman" w:hAnsi="Times New Roman" w:cs="Times New Roman"/>
-          <w:b/>
-          <w:bCs/>
-          <w:szCs w:val="28"/>
-        </w:rPr>
-        <w:t>🧹 Refactor general</w:t>
-      </w:r>
-    </w:p>
-    <w:p>
-      <w:pPr>
-        <w:spacing w:after="0" w:line="240" w:lineRule="auto"/>
-        <w:jc w:val="left"/>
-        <w:rPr>
-          <w:rFonts w:ascii="Times New Roman" w:eastAsia="Times New Roman" w:hAnsi="Times New Roman" w:cs="Times New Roman"/>
-          <w:szCs w:val="28"/>
-        </w:rPr>
-      </w:pPr>
-      <w:r>
-        <w:rPr>
-          <w:rFonts w:ascii="Times New Roman" w:eastAsia="Times New Roman" w:hAnsi="Times New Roman" w:cs="Times New Roman"/>
-          <w:szCs w:val="28"/>
-        </w:rPr>
-        <w:pict>
-          <v:rect id="_x0000_i1031" style="width:0;height:1.5pt" o:hralign="center" o:hrstd="t" o:hr="t" fillcolor="#a0a0a0" stroked="f"/>
-        </w:pict>
-      </w:r>
-    </w:p>
-    <w:p>
-      <w:pPr>
-        <w:spacing w:before="100" w:beforeAutospacing="1" w:after="100" w:afterAutospacing="1" w:line="240" w:lineRule="auto"/>
-        <w:jc w:val="left"/>
-        <w:outlineLvl w:val="0"/>
-        <w:rPr>
-          <w:rFonts w:ascii="Times New Roman" w:eastAsia="Times New Roman" w:hAnsi="Times New Roman" w:cs="Times New Roman"/>
-          <w:b/>
-          <w:bCs/>
-          <w:kern w:val="36"/>
-          <w:szCs w:val="28"/>
-          <w:lang w:val="es-EC"/>
-        </w:rPr>
-      </w:pPr>
-      <w:r>
-        <w:rPr>
-          <w:rFonts w:ascii="Segoe UI Symbol" w:eastAsia="Times New Roman" w:hAnsi="Segoe UI Symbol" w:cs="Segoe UI Symbol"/>
-          <w:b/>
-          <w:bCs/>
-          <w:kern w:val="36"/>
-          <w:szCs w:val="28"/>
-        </w:rPr>
-        <w:t>🔵</w:t>
-      </w:r>
-      <w:r>
-        <w:rPr>
-          <w:rFonts w:ascii="Times New Roman" w:eastAsia="Times New Roman" w:hAnsi="Times New Roman" w:cs="Times New Roman"/>
-          <w:b/>
-          <w:bCs/>
-          <w:kern w:val="36"/>
-          <w:szCs w:val="28"/>
-          <w:lang w:val="es-EC"/>
-        </w:rPr>
-        <w:t xml:space="preserve"> SPRINT 7 — Producción</w:t>
-      </w:r>
-    </w:p>
-    <w:p>
-      <w:pPr>
-        <w:spacing w:before="100" w:beforeAutospacing="1" w:after="100" w:afterAutospacing="1" w:line="240" w:lineRule="auto"/>
-        <w:jc w:val="left"/>
-        <w:outlineLvl w:val="1"/>
-        <w:rPr>
-          <w:rFonts w:ascii="Times New Roman" w:eastAsia="Times New Roman" w:hAnsi="Times New Roman" w:cs="Times New Roman"/>
-          <w:b/>
-          <w:bCs/>
-          <w:szCs w:val="28"/>
-          <w:lang w:val="es-EC"/>
-        </w:rPr>
-      </w:pPr>
-      <w:r>
-        <w:rPr>
-          <w:rFonts w:ascii="Segoe UI Symbol" w:eastAsia="Times New Roman" w:hAnsi="Segoe UI Symbol" w:cs="Segoe UI Symbol"/>
-          <w:b/>
-          <w:bCs/>
-          <w:szCs w:val="28"/>
-        </w:rPr>
-        <w:t>🐧</w:t>
-      </w:r>
-      <w:r>
-        <w:rPr>
-          <w:rFonts w:ascii="Times New Roman" w:eastAsia="Times New Roman" w:hAnsi="Times New Roman" w:cs="Times New Roman"/>
-          <w:b/>
-          <w:bCs/>
-          <w:szCs w:val="28"/>
-          <w:lang w:val="es-EC"/>
-        </w:rPr>
-        <w:t xml:space="preserve"> Adaptación Linux</w:t>
-      </w:r>
-    </w:p>
-    <w:p>
-      <w:pPr>
-        <w:spacing w:before="100" w:beforeAutospacing="1" w:after="100" w:afterAutospacing="1" w:line="240" w:lineRule="auto"/>
-        <w:jc w:val="left"/>
-        <w:outlineLvl w:val="1"/>
-        <w:rPr>
-          <w:rFonts w:ascii="Times New Roman" w:eastAsia="Times New Roman" w:hAnsi="Times New Roman" w:cs="Times New Roman"/>
-          <w:b/>
-          <w:bCs/>
-          <w:szCs w:val="28"/>
-          <w:lang w:val="es-EC"/>
-        </w:rPr>
-      </w:pPr>
-      <w:r>
-        <w:rPr>
-          <w:rFonts w:ascii="Segoe UI Symbol" w:eastAsia="Times New Roman" w:hAnsi="Segoe UI Symbol" w:cs="Segoe UI Symbol"/>
-          <w:b/>
-          <w:bCs/>
-          <w:szCs w:val="28"/>
-        </w:rPr>
-        <w:t>🗂</w:t>
-      </w:r>
-      <w:r>
-        <w:rPr>
-          <w:rFonts w:ascii="Times New Roman" w:eastAsia="Times New Roman" w:hAnsi="Times New Roman" w:cs="Times New Roman"/>
-          <w:b/>
-          <w:bCs/>
-          <w:szCs w:val="28"/>
-          <w:lang w:val="es-EC"/>
-        </w:rPr>
-        <w:t xml:space="preserve"> Permisos de carpetas</w:t>
-      </w:r>
-    </w:p>
-    <w:p>
-      <w:pPr>
-        <w:spacing w:before="100" w:beforeAutospacing="1" w:after="100" w:afterAutospacing="1" w:line="240" w:lineRule="auto"/>
-        <w:jc w:val="left"/>
-        <w:outlineLvl w:val="1"/>
-        <w:rPr>
-          <w:rFonts w:ascii="Times New Roman" w:eastAsia="Times New Roman" w:hAnsi="Times New Roman" w:cs="Times New Roman"/>
-          <w:b/>
-          <w:bCs/>
-          <w:szCs w:val="28"/>
-          <w:lang w:val="es-EC"/>
-        </w:rPr>
-      </w:pPr>
-      <w:r>
-        <w:rPr>
-          <w:rFonts w:ascii="Segoe UI Symbol" w:eastAsia="Times New Roman" w:hAnsi="Segoe UI Symbol" w:cs="Segoe UI Symbol"/>
-          <w:b/>
-          <w:bCs/>
-          <w:szCs w:val="28"/>
-        </w:rPr>
-        <w:t>🌐</w:t>
-      </w:r>
-      <w:r>
-        <w:rPr>
-          <w:rFonts w:ascii="Times New Roman" w:eastAsia="Times New Roman" w:hAnsi="Times New Roman" w:cs="Times New Roman"/>
-          <w:b/>
-          <w:bCs/>
-          <w:szCs w:val="28"/>
-          <w:lang w:val="es-EC"/>
-        </w:rPr>
-        <w:t xml:space="preserve"> </w:t>
-      </w:r>
-      <w:proofErr w:type="spellStart"/>
-      <w:r>
-        <w:rPr>
-          <w:rFonts w:ascii="Times New Roman" w:eastAsia="Times New Roman" w:hAnsi="Times New Roman" w:cs="Times New Roman"/>
-          <w:b/>
-          <w:bCs/>
-          <w:szCs w:val="28"/>
-          <w:lang w:val="es-EC"/>
-        </w:rPr>
-        <w:t>Deploy</w:t>
-      </w:r>
-      <w:proofErr w:type="spellEnd"/>
-    </w:p>
-    <w:p>
-      <w:pPr>
-        <w:spacing w:before="100" w:beforeAutospacing="1" w:after="100" w:afterAutospacing="1" w:line="240" w:lineRule="auto"/>
-        <w:jc w:val="left"/>
-        <w:outlineLvl w:val="1"/>
-        <w:rPr>
-          <w:rFonts w:ascii="Times New Roman" w:eastAsia="Times New Roman" w:hAnsi="Times New Roman" w:cs="Times New Roman"/>
-          <w:b/>
-          <w:bCs/>
-          <w:szCs w:val="28"/>
-        </w:rPr>
-      </w:pPr>
-      <w:r>
-        <w:rPr>
-          <w:rFonts w:ascii="Segoe UI Symbol" w:eastAsia="Times New Roman" w:hAnsi="Segoe UI Symbol" w:cs="Segoe UI Symbol"/>
-          <w:b/>
-          <w:bCs/>
-          <w:szCs w:val="28"/>
-        </w:rPr>
-        <w:t>🔒</w:t>
-      </w:r>
-      <w:r>
-        <w:rPr>
-          <w:rFonts w:ascii="Times New Roman" w:eastAsia="Times New Roman" w:hAnsi="Times New Roman" w:cs="Times New Roman"/>
-          <w:b/>
-          <w:bCs/>
-          <w:szCs w:val="28"/>
-        </w:rPr>
-        <w:t xml:space="preserve"> </w:t>
-      </w:r>
-      <w:proofErr w:type="spellStart"/>
-      <w:r>
-        <w:rPr>
-          <w:rFonts w:ascii="Times New Roman" w:eastAsia="Times New Roman" w:hAnsi="Times New Roman" w:cs="Times New Roman"/>
-          <w:b/>
-          <w:bCs/>
-          <w:szCs w:val="28"/>
-        </w:rPr>
-        <w:t>Configuración</w:t>
-      </w:r>
-      <w:proofErr w:type="spellEnd"/>
-      <w:r>
-        <w:rPr>
-          <w:rFonts w:ascii="Times New Roman" w:eastAsia="Times New Roman" w:hAnsi="Times New Roman" w:cs="Times New Roman"/>
-          <w:b/>
-          <w:bCs/>
-          <w:szCs w:val="28"/>
-        </w:rPr>
-        <w:t xml:space="preserve"> </w:t>
-      </w:r>
-      <w:proofErr w:type="spellStart"/>
-      <w:proofErr w:type="gramStart"/>
-      <w:r>
-        <w:rPr>
-          <w:rFonts w:ascii="Times New Roman" w:eastAsia="Times New Roman" w:hAnsi="Times New Roman" w:cs="Times New Roman"/>
-          <w:b/>
-          <w:bCs/>
-          <w:szCs w:val="28"/>
-        </w:rPr>
-        <w:t>segura</w:t>
-      </w:r>
-      <w:proofErr w:type="spellEnd"/>
-      <w:proofErr w:type="gramEnd"/>
-    </w:p>
-    <w:p>
-      <w:pPr>
-        <w:rPr>
+    </w:p>
+    <w:p>
+      <w:pPr>
+        <w:rPr>
+          <w:rFonts w:cstheme="minorHAnsi"/>
           <w:szCs w:val="28"/>
         </w:rPr>
       </w:pPr>
     </w:p>
     <w:sectPr>
       <w:pgSz w:w="11907" w:h="16840" w:code="9"/>
-      <w:pgMar w:top="1417" w:right="1418" w:bottom="1417" w:left="1418" w:header="709" w:footer="709" w:gutter="0"/>
+      <w:pgMar w:top="567" w:right="1418" w:bottom="1417" w:left="1418" w:header="709" w:footer="709" w:gutter="0"/>
       <w:cols w:space="708"/>
       <w:docGrid w:linePitch="381"/>
     </w:sectPr>
@@ -2606,7 +2384,7 @@
 </file>
 
 <file path=word/numbering.xml><?xml version="1.0" encoding="utf-8"?>
-<w:numbering xmlns:wpc="http://schemas.microsoft.com/office/word/2010/wordprocessingCanvas" xmlns:cx="http://schemas.microsoft.com/office/drawing/2014/chartex" xmlns:cx1="http://schemas.microsoft.com/office/drawing/2015/9/8/chartex" xmlns:mc="http://schemas.openxmlformats.org/markup-compatibility/2006" xmlns:o="urn:schemas-microsoft-com:office:office" xmlns:r="http://schemas.openxmlformats.org/officeDocument/2006/relationships" xmlns:m="http://schemas.openxmlformats.org/officeDocument/2006/math" xmlns:v="urn:schemas-microsoft-com:vml" xmlns:wp14="http://schemas.microsoft.com/office/word/2010/wordprocessingDrawing" xmlns:wp="http://schemas.openxmlformats.org/drawingml/2006/wordprocessingDrawing" xmlns:w10="urn:schemas-microsoft-com:office:word" xmlns:w="http://schemas.openxmlformats.org/wordprocessingml/2006/main" xmlns:w14="http://schemas.microsoft.com/office/word/2010/wordml" xmlns:w15="http://schemas.microsoft.com/office/word/2012/wordml" xmlns:w16se="http://schemas.microsoft.com/office/word/2015/wordml/symex" xmlns:wpg="http://schemas.microsoft.com/office/word/2010/wordprocessingGroup" xmlns:wpi="http://schemas.microsoft.com/office/word/2010/wordprocessingInk" xmlns:wne="http://schemas.microsoft.com/office/word/2006/wordml" xmlns:wps="http://schemas.microsoft.com/office/word/2010/wordprocessingShape" mc:Ignorable="w14 w15 w16se wp14">
+<w:numbering xmlns:wpc="http://schemas.microsoft.com/office/word/2010/wordprocessingCanvas" xmlns:cx="http://schemas.microsoft.com/office/drawing/2014/chartex" xmlns:mc="http://schemas.openxmlformats.org/markup-compatibility/2006" xmlns:o="urn:schemas-microsoft-com:office:office" xmlns:r="http://schemas.openxmlformats.org/officeDocument/2006/relationships" xmlns:m="http://schemas.openxmlformats.org/officeDocument/2006/math" xmlns:v="urn:schemas-microsoft-com:vml" xmlns:wp14="http://schemas.microsoft.com/office/word/2010/wordprocessingDrawing" xmlns:wp="http://schemas.openxmlformats.org/drawingml/2006/wordprocessingDrawing" xmlns:w10="urn:schemas-microsoft-com:office:word" xmlns:w="http://schemas.openxmlformats.org/wordprocessingml/2006/main" xmlns:w14="http://schemas.microsoft.com/office/word/2010/wordml" xmlns:w15="http://schemas.microsoft.com/office/word/2012/wordml" xmlns:w16se="http://schemas.microsoft.com/office/word/2015/wordml/symex" xmlns:wpg="http://schemas.microsoft.com/office/word/2010/wordprocessingGroup" xmlns:wpi="http://schemas.microsoft.com/office/word/2010/wordprocessingInk" xmlns:wne="http://schemas.microsoft.com/office/word/2006/wordml" xmlns:wps="http://schemas.microsoft.com/office/word/2010/wordprocessingShape" mc:Ignorable="w14 w15 w16se wp14">
   <w:abstractNum w:abstractNumId="0" w15:restartNumberingAfterBreak="0">
     <w:nsid w:val="04CD4DAF"/>
     <w:multiLevelType w:val="multilevel"/>

</xml_diff>

<commit_message>
feat(users): complete user management module with roles and soft delete
Implemented full CRUD for users following MVC architecture.

Added role assignment with dynamic checkboxes and persistence.

Implemented secure update flow with validation, optional password handling, and session-based feedback.

Added soft delete functionality using 'active' flag instead of physical deletion.

Integrated SweetAlert2 for confirmation dialogs and success/error notifications.

Improved UX by replacing default confirm() with styled modal interactions.

Created RoleRepository and user-role relationship handling.

Refactored controller to use shared PDO connection and proper data flow.

Ensured consistency using SESSION-based alerts across all actions.

Sprint 2 completed: Users module production-ready.
</commit_message>
<xml_diff>
--- a/SPRINTS.docx
+++ b/SPRINTS.docx
@@ -8,8 +8,6 @@
           <w:lang w:val="es-MX"/>
         </w:rPr>
       </w:pPr>
-      <w:bookmarkStart w:id="0" w:name="_GoBack"/>
-      <w:bookmarkEnd w:id="0"/>
       <w:r>
         <w:rPr>
           <w:lang w:val="es-MX"/>
@@ -1651,349 +1649,13 @@
         <w:rPr>
           <w:rStyle w:val="bzpyqfadein"/>
         </w:rPr>
-        <w:t>4. Problema detectado (leve)</w:t>
-      </w:r>
-    </w:p>
-    <w:p>
-      <w:pPr>
-        <w:pStyle w:val="NormalWeb"/>
-        <w:rPr>
-          <w:lang w:val="es-MX"/>
-        </w:rPr>
-      </w:pPr>
-      <w:r>
-        <w:rPr>
-          <w:rStyle w:val="bzpyqfadein"/>
-          <w:rFonts w:eastAsiaTheme="majorEastAsia"/>
-          <w:lang w:val="es-MX"/>
-        </w:rPr>
-        <w:t>Solo hay una pequeña inconsistencia.</w:t>
-      </w:r>
-    </w:p>
-    <w:p>
-      <w:pPr>
-        <w:pStyle w:val="NormalWeb"/>
-        <w:rPr>
-          <w:lang w:val="es-MX"/>
-        </w:rPr>
-      </w:pPr>
-      <w:r>
-        <w:rPr>
-          <w:rStyle w:val="bzpyqfadein"/>
-          <w:rFonts w:eastAsiaTheme="majorEastAsia"/>
-          <w:lang w:val="es-MX"/>
-        </w:rPr>
-        <w:t>Tienes:</w:t>
-      </w:r>
-    </w:p>
-    <w:p>
-      <w:pPr>
-        <w:pStyle w:val="HTMLconformatoprevio"/>
-        <w:rPr>
-          <w:rStyle w:val="CdigoHTML"/>
-          <w:lang w:val="es-MX"/>
-        </w:rPr>
-      </w:pPr>
-      <w:proofErr w:type="spellStart"/>
-      <w:r>
-        <w:rPr>
-          <w:rStyle w:val="CdigoHTML"/>
-          <w:lang w:val="es-MX"/>
-        </w:rPr>
-        <w:t>models</w:t>
-      </w:r>
-      <w:proofErr w:type="spellEnd"/>
-      <w:r>
-        <w:rPr>
-          <w:rStyle w:val="CdigoHTML"/>
-          <w:lang w:val="es-MX"/>
-        </w:rPr>
-        <w:t>/</w:t>
-      </w:r>
-      <w:proofErr w:type="spellStart"/>
-      <w:r>
-        <w:rPr>
-          <w:rStyle w:val="hljs-keyword"/>
-          <w:lang w:val="es-MX"/>
-        </w:rPr>
-        <w:t>User</w:t>
-      </w:r>
-      <w:r>
-        <w:rPr>
-          <w:rStyle w:val="CdigoHTML"/>
-          <w:lang w:val="es-MX"/>
-        </w:rPr>
-        <w:t>.php</w:t>
-      </w:r>
-      <w:proofErr w:type="spellEnd"/>
-    </w:p>
-    <w:p>
-      <w:pPr>
-        <w:pStyle w:val="NormalWeb"/>
-        <w:rPr>
-          <w:lang w:val="es-MX"/>
-        </w:rPr>
-      </w:pPr>
-      <w:r>
-        <w:rPr>
-          <w:rStyle w:val="bzpyqfadein"/>
-          <w:rFonts w:eastAsiaTheme="majorEastAsia"/>
-          <w:lang w:val="es-MX"/>
-        </w:rPr>
-        <w:t>pero también:</w:t>
-      </w:r>
-    </w:p>
-    <w:p>
-      <w:pPr>
-        <w:pStyle w:val="HTMLconformatoprevio"/>
-        <w:rPr>
-          <w:rStyle w:val="CdigoHTML"/>
-          <w:lang w:val="es-MX"/>
-        </w:rPr>
-      </w:pPr>
-      <w:proofErr w:type="spellStart"/>
-      <w:r>
-        <w:rPr>
-          <w:rStyle w:val="CdigoHTML"/>
-          <w:lang w:val="es-MX"/>
-        </w:rPr>
-        <w:t>repositories</w:t>
-      </w:r>
-      <w:proofErr w:type="spellEnd"/>
-      <w:r>
-        <w:rPr>
-          <w:rStyle w:val="CdigoHTML"/>
-          <w:lang w:val="es-MX"/>
-        </w:rPr>
-        <w:t>/</w:t>
-      </w:r>
-      <w:proofErr w:type="spellStart"/>
-      <w:r>
-        <w:rPr>
-          <w:rStyle w:val="CdigoHTML"/>
-          <w:lang w:val="es-MX"/>
-        </w:rPr>
-        <w:t>UserRepository.php</w:t>
-      </w:r>
-      <w:proofErr w:type="spellEnd"/>
-    </w:p>
-    <w:p>
-      <w:pPr>
-        <w:pStyle w:val="NormalWeb"/>
-        <w:rPr>
-          <w:lang w:val="es-MX"/>
-        </w:rPr>
-      </w:pPr>
-      <w:r>
-        <w:rPr>
-          <w:rStyle w:val="bzpyqfadein"/>
-          <w:rFonts w:eastAsiaTheme="majorEastAsia"/>
-          <w:lang w:val="es-MX"/>
-        </w:rPr>
-        <w:t>No es malo, pero debes decidir:</w:t>
-      </w:r>
-    </w:p>
-    <w:p>
-      <w:pPr>
-        <w:pStyle w:val="NormalWeb"/>
-        <w:rPr>
-          <w:lang w:val="es-MX"/>
-        </w:rPr>
-      </w:pPr>
-      <w:r>
-        <w:rPr>
-          <w:rStyle w:val="bzpyqfadein"/>
-          <w:rFonts w:eastAsiaTheme="majorEastAsia"/>
-          <w:b/>
-          <w:bCs/>
-          <w:lang w:val="es-MX"/>
-        </w:rPr>
-        <w:t>Opción A (simple)</w:t>
-      </w:r>
-    </w:p>
-    <w:p>
-      <w:pPr>
-        <w:pStyle w:val="HTMLconformatoprevio"/>
-        <w:rPr>
-          <w:rStyle w:val="CdigoHTML"/>
-          <w:lang w:val="es-MX"/>
-        </w:rPr>
-      </w:pPr>
-      <w:proofErr w:type="spellStart"/>
-      <w:r>
-        <w:rPr>
-          <w:rStyle w:val="hljs-attribute"/>
-          <w:lang w:val="es-MX"/>
-        </w:rPr>
-        <w:t>Controller</w:t>
-      </w:r>
-      <w:proofErr w:type="spellEnd"/>
-      <w:r>
-        <w:rPr>
-          <w:rStyle w:val="CdigoHTML"/>
-          <w:lang w:val="es-MX"/>
-        </w:rPr>
-        <w:t xml:space="preserve"> → </w:t>
-      </w:r>
-      <w:proofErr w:type="spellStart"/>
-      <w:r>
-        <w:rPr>
-          <w:rStyle w:val="CdigoHTML"/>
-          <w:lang w:val="es-MX"/>
-        </w:rPr>
-        <w:t>Repository</w:t>
-      </w:r>
-      <w:proofErr w:type="spellEnd"/>
-      <w:r>
-        <w:rPr>
-          <w:rStyle w:val="CdigoHTML"/>
-          <w:lang w:val="es-MX"/>
-        </w:rPr>
-        <w:t xml:space="preserve"> → DB</w:t>
-      </w:r>
-    </w:p>
-    <w:p>
-      <w:pPr>
-        <w:pStyle w:val="NormalWeb"/>
-        <w:rPr>
-          <w:lang w:val="es-MX"/>
-        </w:rPr>
-      </w:pPr>
-      <w:r>
-        <w:rPr>
-          <w:rStyle w:val="bzpyqfadein"/>
-          <w:rFonts w:eastAsiaTheme="majorEastAsia"/>
-          <w:b/>
-          <w:bCs/>
-          <w:lang w:val="es-MX"/>
-        </w:rPr>
-        <w:t>Opción B (más puro)</w:t>
-      </w:r>
-    </w:p>
-    <w:p>
-      <w:pPr>
-        <w:pStyle w:val="HTMLconformatoprevio"/>
-        <w:rPr>
-          <w:rStyle w:val="CdigoHTML"/>
-          <w:lang w:val="es-MX"/>
-        </w:rPr>
-      </w:pPr>
-      <w:proofErr w:type="spellStart"/>
-      <w:r>
-        <w:rPr>
-          <w:rStyle w:val="hljs-attribute"/>
-          <w:lang w:val="es-MX"/>
-        </w:rPr>
-        <w:lastRenderedPageBreak/>
-        <w:t>Controller</w:t>
-      </w:r>
-      <w:proofErr w:type="spellEnd"/>
-      <w:r>
-        <w:rPr>
-          <w:rStyle w:val="CdigoHTML"/>
-          <w:lang w:val="es-MX"/>
-        </w:rPr>
-        <w:t xml:space="preserve"> → </w:t>
-      </w:r>
-      <w:proofErr w:type="spellStart"/>
-      <w:r>
-        <w:rPr>
-          <w:rStyle w:val="CdigoHTML"/>
-          <w:lang w:val="es-MX"/>
-        </w:rPr>
-        <w:t>Service</w:t>
-      </w:r>
-      <w:proofErr w:type="spellEnd"/>
-      <w:r>
-        <w:rPr>
-          <w:rStyle w:val="CdigoHTML"/>
-          <w:lang w:val="es-MX"/>
-        </w:rPr>
-        <w:t xml:space="preserve"> → </w:t>
-      </w:r>
-      <w:proofErr w:type="spellStart"/>
-      <w:r>
-        <w:rPr>
-          <w:rStyle w:val="CdigoHTML"/>
-          <w:lang w:val="es-MX"/>
-        </w:rPr>
-        <w:t>Repository</w:t>
-      </w:r>
-      <w:proofErr w:type="spellEnd"/>
-      <w:r>
-        <w:rPr>
-          <w:rStyle w:val="CdigoHTML"/>
-          <w:lang w:val="es-MX"/>
-        </w:rPr>
-        <w:t xml:space="preserve"> → </w:t>
-      </w:r>
-      <w:proofErr w:type="spellStart"/>
-      <w:r>
-        <w:rPr>
-          <w:rStyle w:val="CdigoHTML"/>
-          <w:lang w:val="es-MX"/>
-        </w:rPr>
-        <w:t>Model</w:t>
-      </w:r>
-      <w:proofErr w:type="spellEnd"/>
-      <w:r>
-        <w:rPr>
-          <w:rStyle w:val="CdigoHTML"/>
-          <w:lang w:val="es-MX"/>
-        </w:rPr>
-        <w:t xml:space="preserve"> → DB</w:t>
-      </w:r>
-    </w:p>
-    <w:p>
-      <w:pPr>
-        <w:pStyle w:val="NormalWeb"/>
-        <w:rPr>
-          <w:lang w:val="es-MX"/>
-        </w:rPr>
-      </w:pPr>
-      <w:r>
-        <w:rPr>
-          <w:rStyle w:val="bzpyqfadein"/>
-          <w:rFonts w:eastAsiaTheme="majorEastAsia"/>
-          <w:lang w:val="es-MX"/>
-        </w:rPr>
-        <w:t xml:space="preserve">Por ahora </w:t>
-      </w:r>
-      <w:r>
-        <w:rPr>
-          <w:rStyle w:val="bzpyqfadein"/>
-          <w:rFonts w:eastAsiaTheme="majorEastAsia"/>
-          <w:b/>
-          <w:bCs/>
-          <w:lang w:val="es-MX"/>
-        </w:rPr>
-        <w:t>tu opción A está bien</w:t>
-      </w:r>
-      <w:r>
-        <w:rPr>
-          <w:rStyle w:val="bzpyqfadein"/>
-          <w:rFonts w:eastAsiaTheme="majorEastAsia"/>
-          <w:lang w:val="es-MX"/>
-        </w:rPr>
-        <w:t>.</w:t>
-      </w:r>
-    </w:p>
-    <w:p>
-      <w:r>
-        <w:pict>
-          <v:rect id="_x0000_i1035" style="width:0;height:1.5pt" o:hralign="center" o:hrstd="t" o:hr="t" fillcolor="#a0a0a0" stroked="f"/>
-        </w:pict>
-      </w:r>
-    </w:p>
-    <w:p>
-      <w:pPr>
-        <w:pStyle w:val="Ttulo1"/>
-      </w:pPr>
-      <w:r>
-        <w:rPr>
-          <w:rStyle w:val="bzpyqfadein"/>
-        </w:rPr>
-        <w:t>5. Tu sistema ya tiene módulos preparados</w:t>
+        <w:t>4</w:t>
+      </w:r>
+      <w:r>
+        <w:rPr>
+          <w:rStyle w:val="bzpyqfadein"/>
+        </w:rPr>
+        <w:t>. Tu sistema ya tiene módulos preparados</w:t>
       </w:r>
     </w:p>
     <w:p>
@@ -2268,6 +1930,7 @@
           <w:rStyle w:val="bzpyqfadein"/>
           <w:rFonts w:ascii="Segoe UI Symbol" w:hAnsi="Segoe UI Symbol" w:cs="Segoe UI Symbol"/>
         </w:rPr>
+        <w:lastRenderedPageBreak/>
         <w:t>🔵</w:t>
       </w:r>
       <w:r>
@@ -2388,7 +2051,10 @@
     <w:p>
       <w:pPr>
         <w:pStyle w:val="NormalWeb"/>
-        <w:rPr>
+        <w:spacing w:before="0" w:beforeAutospacing="0" w:after="0" w:afterAutospacing="0"/>
+        <w:rPr>
+          <w:rStyle w:val="bzpyqfadein"/>
+          <w:rFonts w:eastAsiaTheme="majorEastAsia"/>
           <w:lang w:val="es-MX"/>
         </w:rPr>
       </w:pPr>
@@ -2450,7 +2116,7 @@
           <w:rFonts w:eastAsiaTheme="majorEastAsia"/>
           <w:lang w:val="es-MX"/>
         </w:rPr>
-        <w:t xml:space="preserve"> Editar usuario</w:t>
+        <w:t xml:space="preserve"> Roles</w:t>
       </w:r>
       <w:r>
         <w:rPr>
@@ -2472,39 +2138,100 @@
           <w:rFonts w:eastAsiaTheme="majorEastAsia"/>
           <w:lang w:val="es-MX"/>
         </w:rPr>
-        <w:t xml:space="preserve"> Roles</w:t>
-      </w:r>
-      <w:r>
-        <w:rPr>
-          <w:lang w:val="es-MX"/>
-        </w:rPr>
-        <w:br/>
-      </w:r>
-      <w:r>
-        <w:rPr>
-          <w:rStyle w:val="bzpyqfadein"/>
-          <w:rFonts w:ascii="Segoe UI Symbol" w:eastAsiaTheme="majorEastAsia" w:hAnsi="Segoe UI Symbol" w:cs="Segoe UI Symbol"/>
-          <w:lang w:val="es-MX"/>
-        </w:rPr>
-        <w:t>✔</w:t>
-      </w:r>
-      <w:r>
-        <w:rPr>
-          <w:rStyle w:val="bzpyqfadein"/>
-          <w:rFonts w:eastAsiaTheme="majorEastAsia"/>
-          <w:lang w:val="es-MX"/>
-        </w:rPr>
         <w:t xml:space="preserve"> Validaciones</w:t>
       </w:r>
     </w:p>
     <w:p>
       <w:pPr>
         <w:pStyle w:val="NormalWeb"/>
-      </w:pPr>
-      <w:r>
-        <w:rPr>
-          <w:rStyle w:val="bzpyqfadein"/>
-          <w:rFonts w:eastAsiaTheme="majorEastAsia"/>
+        <w:spacing w:before="0" w:beforeAutospacing="0" w:after="0" w:afterAutospacing="0"/>
+        <w:rPr>
+          <w:rStyle w:val="bzpyqfadein"/>
+          <w:rFonts w:eastAsiaTheme="majorEastAsia"/>
+          <w:lang w:val="es-MX"/>
+        </w:rPr>
+      </w:pPr>
+      <w:r>
+        <w:rPr>
+          <w:rStyle w:val="bzpyqfadein"/>
+          <w:rFonts w:eastAsiaTheme="majorEastAsia"/>
+          <w:lang w:val="es-MX"/>
+        </w:rPr>
+        <w:t>Editar usuario</w:t>
+      </w:r>
+      <w:r>
+        <w:rPr>
+          <w:rStyle w:val="bzpyqfadein"/>
+          <w:rFonts w:eastAsiaTheme="majorEastAsia"/>
+          <w:lang w:val="es-MX"/>
+        </w:rPr>
+        <w:t xml:space="preserve"> </w:t>
+      </w:r>
+      <w:r>
+        <w:rPr>
+          <w:rStyle w:val="bzpyqfadein"/>
+          <w:rFonts w:eastAsiaTheme="majorEastAsia"/>
+          <w:lang w:val="es-MX"/>
+        </w:rPr>
+        <w:sym w:font="Wingdings" w:char="F0E0"/>
+      </w:r>
+      <w:r>
+        <w:rPr>
+          <w:rStyle w:val="bzpyqfadein"/>
+          <w:rFonts w:eastAsiaTheme="majorEastAsia"/>
+          <w:lang w:val="es-MX"/>
+        </w:rPr>
+        <w:t xml:space="preserve"> falta </w:t>
+      </w:r>
+    </w:p>
+    <w:p>
+      <w:pPr>
+        <w:pStyle w:val="NormalWeb"/>
+        <w:spacing w:before="0" w:beforeAutospacing="0" w:after="0" w:afterAutospacing="0"/>
+        <w:rPr>
+          <w:rFonts w:eastAsiaTheme="majorEastAsia"/>
+          <w:lang w:val="es-MX"/>
+        </w:rPr>
+      </w:pPr>
+      <w:r>
+        <w:rPr>
+          <w:rStyle w:val="bzpyqfadein"/>
+          <w:rFonts w:eastAsiaTheme="majorEastAsia"/>
+          <w:lang w:val="es-MX"/>
+        </w:rPr>
+        <w:t xml:space="preserve">Eliminar usuario </w:t>
+      </w:r>
+      <w:r>
+        <w:rPr>
+          <w:rStyle w:val="bzpyqfadein"/>
+          <w:rFonts w:eastAsiaTheme="majorEastAsia"/>
+          <w:lang w:val="es-MX"/>
+        </w:rPr>
+        <w:sym w:font="Wingdings" w:char="F0E0"/>
+      </w:r>
+      <w:r>
+        <w:rPr>
+          <w:rStyle w:val="bzpyqfadein"/>
+          <w:rFonts w:eastAsiaTheme="majorEastAsia"/>
+          <w:lang w:val="es-MX"/>
+        </w:rPr>
+        <w:t xml:space="preserve"> falta</w:t>
+      </w:r>
+      <w:bookmarkStart w:id="0" w:name="_GoBack"/>
+      <w:bookmarkEnd w:id="0"/>
+    </w:p>
+    <w:p>
+      <w:pPr>
+        <w:pStyle w:val="NormalWeb"/>
+        <w:rPr>
+          <w:lang w:val="es-MX"/>
+        </w:rPr>
+      </w:pPr>
+      <w:r>
+        <w:rPr>
+          <w:rStyle w:val="bzpyqfadein"/>
+          <w:rFonts w:eastAsiaTheme="majorEastAsia"/>
+          <w:lang w:val="es-MX"/>
         </w:rPr>
         <w:t>ESTÁS AQUÍ.</w:t>
       </w:r>
@@ -2528,7 +2255,6 @@
           <w:rStyle w:val="bzpyqfadein"/>
           <w:rFonts w:ascii="Segoe UI Symbol" w:hAnsi="Segoe UI Symbol" w:cs="Segoe UI Symbol"/>
         </w:rPr>
-        <w:lastRenderedPageBreak/>
         <w:t>🔵</w:t>
       </w:r>
       <w:r>
@@ -2808,6 +2534,7 @@
           <w:rFonts w:eastAsiaTheme="majorEastAsia"/>
           <w:lang w:val="es-MX"/>
         </w:rPr>
+        <w:lastRenderedPageBreak/>
         <w:t>Funciones:</w:t>
       </w:r>
     </w:p>
@@ -3112,7 +2839,6 @@
           <w:rStyle w:val="bzpyqfadein"/>
           <w:rFonts w:eastAsiaTheme="majorEastAsia"/>
         </w:rPr>
-        <w:lastRenderedPageBreak/>
         <w:t>Tabla</w:t>
       </w:r>
       <w:proofErr w:type="spellEnd"/>
@@ -3368,6 +3094,7 @@
         <w:rPr>
           <w:rStyle w:val="CdigoHTML"/>
         </w:rPr>
+        <w:lastRenderedPageBreak/>
         <w:t>controllers/sales</w:t>
       </w:r>
     </w:p>
@@ -3658,7 +3385,6 @@
           <w:rStyle w:val="bzpyqfadein"/>
           <w:rFonts w:ascii="Segoe UI Symbol" w:hAnsi="Segoe UI Symbol" w:cs="Segoe UI Symbol"/>
         </w:rPr>
-        <w:lastRenderedPageBreak/>
         <w:t>🔵</w:t>
       </w:r>
       <w:r>
@@ -3979,6 +3705,7 @@
         <w:rPr>
           <w:rStyle w:val="CdigoHTML"/>
         </w:rPr>
+        <w:lastRenderedPageBreak/>
         <w:t>edit</w:t>
       </w:r>
     </w:p>
@@ -4316,7 +4043,6 @@
           <w:rFonts w:eastAsiaTheme="majorEastAsia"/>
           <w:lang w:val="es-MX"/>
         </w:rPr>
-        <w:lastRenderedPageBreak/>
         <w:t>y te simplifica mucho el código.</w:t>
       </w:r>
     </w:p>
@@ -4359,32 +4085,32 @@
         <w:pStyle w:val="HTMLconformatoprevio"/>
         <w:rPr>
           <w:rStyle w:val="CdigoHTML"/>
-        </w:rPr>
-      </w:pPr>
-      <w:proofErr w:type="spellStart"/>
+          <w:lang w:val="es-MX"/>
+        </w:rPr>
+      </w:pPr>
       <w:r>
         <w:rPr>
           <w:rStyle w:val="hljs-attribute"/>
+          <w:lang w:val="es-MX"/>
         </w:rPr>
         <w:t>Usuarios</w:t>
       </w:r>
-      <w:proofErr w:type="spellEnd"/>
-    </w:p>
-    <w:p>
-      <w:pPr>
-        <w:pStyle w:val="HTMLconformatoprevio"/>
-        <w:rPr>
-          <w:rStyle w:val="CdigoHTML"/>
-        </w:rPr>
-      </w:pPr>
-      <w:proofErr w:type="spellStart"/>
-      <w:r>
-        <w:rPr>
-          <w:rStyle w:val="CdigoHTML"/>
+    </w:p>
+    <w:p>
+      <w:pPr>
+        <w:pStyle w:val="HTMLconformatoprevio"/>
+        <w:rPr>
+          <w:rStyle w:val="CdigoHTML"/>
+          <w:lang w:val="es-MX"/>
+        </w:rPr>
+      </w:pPr>
+      <w:r>
+        <w:rPr>
+          <w:rStyle w:val="CdigoHTML"/>
+          <w:lang w:val="es-MX"/>
         </w:rPr>
         <w:t>Clientes</w:t>
       </w:r>
-      <w:proofErr w:type="spellEnd"/>
     </w:p>
     <w:p>
       <w:pPr>
@@ -4660,6 +4386,7 @@
         <w:pStyle w:val="z-Principiodelformulario"/>
       </w:pPr>
       <w:r>
+        <w:lastRenderedPageBreak/>
         <w:t>Principio del formulario</w:t>
       </w:r>
     </w:p>
@@ -6562,7 +6289,6 @@
     <w:name w:val="Normal (Web)"/>
     <w:basedOn w:val="Normal"/>
     <w:uiPriority w:val="99"/>
-    <w:semiHidden/>
     <w:unhideWhenUsed/>
     <w:rsid w:val="00C842FE"/>
     <w:pPr>

</xml_diff>

<commit_message>
feat: Implement reminders for consultations and integrate with dashboard
- Added ReminderModel and ReminderRepository to manage reminders
- Modified ConsultationController::store() to create a reminder when enabled
- Added PetRepository::findById() to retrieve pet details for reminder creation
- Dashboard now displays today's reminders with WhatsApp action buttons
- Fixed recordatorio insertion logic (now uses the correct database fields)
- Added error logging for debugging reminder creation

This completes the reminder feature for consultations, allowing automatic creation of follow-up reminders (consultation, vaccine, payment) with customizable date and message.
</commit_message>
<xml_diff>
--- a/SPRINTS.docx
+++ b/SPRINTS.docx
@@ -1500,13 +1500,11 @@
         <w:pStyle w:val="NormalWeb"/>
         <w:rPr>
           <w:rStyle w:val="CdigoHTML"/>
-          <w:lang w:val="es-MX"/>
-        </w:rPr>
-      </w:pPr>
-      <w:r>
-        <w:rPr>
-          <w:rStyle w:val="CdigoHTML"/>
-          <w:lang w:val="es-MX"/>
+        </w:rPr>
+      </w:pPr>
+      <w:r>
+        <w:rPr>
+          <w:rStyle w:val="CdigoHTML"/>
         </w:rPr>
         <w:t xml:space="preserve">|   |       </w:t>
       </w:r>
@@ -1516,13 +1514,11 @@
         <w:pStyle w:val="NormalWeb"/>
         <w:rPr>
           <w:rStyle w:val="CdigoHTML"/>
-          <w:lang w:val="es-MX"/>
-        </w:rPr>
-      </w:pPr>
-      <w:r>
-        <w:rPr>
-          <w:rStyle w:val="CdigoHTML"/>
-          <w:lang w:val="es-MX"/>
+        </w:rPr>
+      </w:pPr>
+      <w:r>
+        <w:rPr>
+          <w:rStyle w:val="CdigoHTML"/>
         </w:rPr>
         <w:t>|   \---</w:t>
       </w:r>
@@ -1530,7 +1526,6 @@
       <w:r>
         <w:rPr>
           <w:rStyle w:val="CdigoHTML"/>
-          <w:lang w:val="es-MX"/>
         </w:rPr>
         <w:t>js</w:t>
       </w:r>
@@ -1541,13 +1536,11 @@
         <w:pStyle w:val="NormalWeb"/>
         <w:rPr>
           <w:rStyle w:val="CdigoHTML"/>
-          <w:lang w:val="es-MX"/>
-        </w:rPr>
-      </w:pPr>
-      <w:r>
-        <w:rPr>
-          <w:rStyle w:val="CdigoHTML"/>
-          <w:lang w:val="es-MX"/>
+        </w:rPr>
+      </w:pPr>
+      <w:r>
+        <w:rPr>
+          <w:rStyle w:val="CdigoHTML"/>
         </w:rPr>
         <w:t>|           bootstrap.bundle.min.js</w:t>
       </w:r>
@@ -1557,13 +1550,11 @@
         <w:pStyle w:val="NormalWeb"/>
         <w:rPr>
           <w:rStyle w:val="CdigoHTML"/>
-          <w:lang w:val="es-MX"/>
-        </w:rPr>
-      </w:pPr>
-      <w:r>
-        <w:rPr>
-          <w:rStyle w:val="CdigoHTML"/>
-          <w:lang w:val="es-MX"/>
+        </w:rPr>
+      </w:pPr>
+      <w:r>
+        <w:rPr>
+          <w:rStyle w:val="CdigoHTML"/>
         </w:rPr>
         <w:t xml:space="preserve">|           </w:t>
       </w:r>
@@ -1641,8 +1632,6 @@
         </w:rPr>
         <w:t>uploads</w:t>
       </w:r>
-      <w:bookmarkStart w:id="0" w:name="_GoBack"/>
-      <w:bookmarkEnd w:id="0"/>
       <w:proofErr w:type="spellEnd"/>
     </w:p>
     <w:p>
@@ -2217,7 +2206,15 @@
             </w:r>
             <w:proofErr w:type="spellEnd"/>
             <w:r>
-              <w:t xml:space="preserve"> (MÓDULO ACTUAL)</w:t>
+              <w:t xml:space="preserve"> (</w:t>
+            </w:r>
+            <w:proofErr w:type="spellStart"/>
+            <w:r>
+              <w:t>MÓDULO</w:t>
+            </w:r>
+            <w:proofErr w:type="spellEnd"/>
+            <w:r>
+              <w:t xml:space="preserve"> ACTUAL)</w:t>
             </w:r>
           </w:p>
           <w:p>
@@ -2290,8 +2287,13 @@
             </w:r>
             <w:proofErr w:type="spellEnd"/>
             <w:r>
-              <w:t xml:space="preserve"> MVC</w:t>
-            </w:r>
+              <w:t xml:space="preserve"> </w:t>
+            </w:r>
+            <w:proofErr w:type="spellStart"/>
+            <w:r>
+              <w:t>MVC</w:t>
+            </w:r>
+            <w:proofErr w:type="spellEnd"/>
           </w:p>
           <w:p>
             <w:pPr>
@@ -2526,7 +2528,15 @@
             </w:r>
             <w:proofErr w:type="spellEnd"/>
             <w:r>
-              <w:t xml:space="preserve"> PDO </w:t>
+              <w:t xml:space="preserve"> </w:t>
+            </w:r>
+            <w:proofErr w:type="spellStart"/>
+            <w:r>
+              <w:t>PDO</w:t>
+            </w:r>
+            <w:proofErr w:type="spellEnd"/>
+            <w:r>
+              <w:t xml:space="preserve"> </w:t>
             </w:r>
             <w:proofErr w:type="spellStart"/>
             <w:r>
@@ -3875,15 +3885,53 @@
       <w:pPr>
         <w:pStyle w:val="HTMLconformatoprevio"/>
         <w:rPr>
-          <w:rStyle w:val="CdigoHTML"/>
-        </w:rPr>
-      </w:pPr>
-      <w:r>
-        <w:rPr>
           <w:rStyle w:val="hljs-attribute"/>
         </w:rPr>
-        <w:t>clients</w:t>
-      </w:r>
+      </w:pPr>
+      <w:r>
+        <w:rPr>
+          <w:rStyle w:val="hljs-attribute"/>
+        </w:rPr>
+        <w:t>C</w:t>
+      </w:r>
+      <w:r>
+        <w:rPr>
+          <w:rStyle w:val="hljs-attribute"/>
+        </w:rPr>
+        <w:t>lients</w:t>
+      </w:r>
+    </w:p>
+    <w:p>
+      <w:pPr>
+        <w:pStyle w:val="HTMLconformatoprevio"/>
+        <w:rPr>
+          <w:rStyle w:val="hljs-attribute"/>
+        </w:rPr>
+      </w:pPr>
+    </w:p>
+    <w:p>
+      <w:pPr>
+        <w:pStyle w:val="NormalWeb"/>
+        <w:rPr>
+          <w:lang w:val="es-MX"/>
+        </w:rPr>
+      </w:pPr>
+      <w:r>
+        <w:rPr>
+          <w:rStyle w:val="bzpyqfadein"/>
+          <w:rFonts w:eastAsiaTheme="majorEastAsia"/>
+          <w:lang w:val="es-MX"/>
+        </w:rPr>
+        <w:t>TERMINADO</w:t>
+      </w:r>
+    </w:p>
+    <w:p>
+      <w:pPr>
+        <w:pStyle w:val="HTMLconformatoprevio"/>
+        <w:rPr>
+          <w:rStyle w:val="CdigoHTML"/>
+        </w:rPr>
+      </w:pPr>
     </w:p>
     <w:p>
       <w:r>
@@ -4129,6 +4177,38 @@
       </w:r>
     </w:p>
     <w:p>
+      <w:pPr>
+        <w:pStyle w:val="HTMLconformatoprevio"/>
+        <w:rPr>
+          <w:rStyle w:val="CdigoHTML"/>
+        </w:rPr>
+      </w:pPr>
+    </w:p>
+    <w:p>
+      <w:pPr>
+        <w:pStyle w:val="NormalWeb"/>
+        <w:rPr>
+          <w:lang w:val="es-MX"/>
+        </w:rPr>
+      </w:pPr>
+      <w:r>
+        <w:rPr>
+          <w:rStyle w:val="bzpyqfadein"/>
+          <w:rFonts w:eastAsiaTheme="majorEastAsia"/>
+          <w:lang w:val="es-MX"/>
+        </w:rPr>
+        <w:t>TERMINADO</w:t>
+      </w:r>
+    </w:p>
+    <w:p>
+      <w:pPr>
+        <w:pStyle w:val="HTMLconformatoprevio"/>
+        <w:rPr>
+          <w:rStyle w:val="CdigoHTML"/>
+        </w:rPr>
+      </w:pPr>
+    </w:p>
+    <w:p>
       <w:r>
         <w:pict>
           <v:rect id="_x0000_i1038" style="width:0;height:1.5pt" o:hralign="center" o:hrstd="t" o:hr="t" fillcolor="#a0a0a0" stroked="f"/>
@@ -4315,15 +4395,48 @@
       <w:pPr>
         <w:pStyle w:val="HTMLconformatoprevio"/>
         <w:rPr>
-          <w:rStyle w:val="CdigoHTML"/>
-        </w:rPr>
-      </w:pPr>
-      <w:r>
-        <w:rPr>
           <w:rStyle w:val="hljs-attribute"/>
         </w:rPr>
-        <w:t>consultations</w:t>
-      </w:r>
+      </w:pPr>
+      <w:r>
+        <w:rPr>
+          <w:rStyle w:val="hljs-attribute"/>
+        </w:rPr>
+        <w:t>C</w:t>
+      </w:r>
+      <w:r>
+        <w:rPr>
+          <w:rStyle w:val="hljs-attribute"/>
+        </w:rPr>
+        <w:t>onsultations</w:t>
+      </w:r>
+    </w:p>
+    <w:p>
+      <w:pPr>
+        <w:pStyle w:val="NormalWeb"/>
+        <w:rPr>
+          <w:lang w:val="es-MX"/>
+        </w:rPr>
+      </w:pPr>
+      <w:r>
+        <w:rPr>
+          <w:rStyle w:val="bzpyqfadein"/>
+          <w:rFonts w:eastAsiaTheme="majorEastAsia"/>
+          <w:lang w:val="es-MX"/>
+        </w:rPr>
+        <w:lastRenderedPageBreak/>
+        <w:t>TERMINADO</w:t>
+      </w:r>
+    </w:p>
+    <w:p>
+      <w:pPr>
+        <w:pStyle w:val="HTMLconformatoprevio"/>
+        <w:rPr>
+          <w:rStyle w:val="CdigoHTML"/>
+        </w:rPr>
+      </w:pPr>
+      <w:bookmarkStart w:id="0" w:name="_GoBack"/>
+      <w:bookmarkEnd w:id="0"/>
     </w:p>
     <w:p>
       <w:r>
@@ -4413,7 +4526,6 @@
           <w:rFonts w:eastAsiaTheme="majorEastAsia"/>
           <w:lang w:val="es-MX"/>
         </w:rPr>
-        <w:lastRenderedPageBreak/>
         <w:t>Funciones:</w:t>
       </w:r>
     </w:p>
@@ -4765,6 +4877,7 @@
           <w:lang w:val="es-MX"/>
         </w:rPr>
       </w:pPr>
+      <w:proofErr w:type="spellStart"/>
       <w:r>
         <w:rPr>
           <w:rStyle w:val="hljs-attribute"/>
@@ -4772,6 +4885,7 @@
         </w:rPr>
         <w:t>CSRF</w:t>
       </w:r>
+      <w:proofErr w:type="spellEnd"/>
       <w:r>
         <w:rPr>
           <w:rStyle w:val="CdigoHTML"/>
@@ -4846,6 +4960,7 @@
           <w:rStyle w:val="bzpyqfadein"/>
           <w:rFonts w:ascii="Segoe UI Symbol" w:hAnsi="Segoe UI Symbol" w:cs="Segoe UI Symbol"/>
         </w:rPr>
+        <w:lastRenderedPageBreak/>
         <w:t>🔵</w:t>
       </w:r>
       <w:r>
@@ -4938,7 +5053,6 @@
           <w:rStyle w:val="bzpyqfadein"/>
           <w:rFonts w:ascii="Segoe UI Symbol" w:hAnsi="Segoe UI Symbol" w:cs="Segoe UI Symbol"/>
         </w:rPr>
-        <w:lastRenderedPageBreak/>
         <w:t>🔵</w:t>
       </w:r>
       <w:r>
@@ -5504,6 +5618,7 @@
           <w:rFonts w:eastAsiaTheme="majorEastAsia"/>
           <w:lang w:val="es-MX"/>
         </w:rPr>
+        <w:lastRenderedPageBreak/>
         <w:t>y te simplifica mucho el código.</w:t>
       </w:r>
     </w:p>
@@ -5586,7 +5701,6 @@
           <w:rStyle w:val="CdigoHTML"/>
           <w:lang w:val="es-MX"/>
         </w:rPr>
-        <w:lastRenderedPageBreak/>
         <w:t>Mascotas</w:t>
       </w:r>
     </w:p>

</xml_diff>